<commit_message>
Actualizar documentación, read me y detalles finales
</commit_message>
<xml_diff>
--- a/docs/Proyecto 1.docx
+++ b/docs/Proyecto 1.docx
@@ -32,7 +32,7 @@
                     <pic:cNvPicPr preferRelativeResize="0"/>
                   </pic:nvPicPr>
                   <pic:blipFill>
-                    <a:blip r:embed="rId8"/>
+                    <a:blip r:embed="rId9"/>
                     <a:srcRect/>
                     <a:stretch>
                       <a:fillRect/>
@@ -442,7 +442,7 @@
                     <pic:cNvPicPr/>
                   </pic:nvPicPr>
                   <pic:blipFill>
-                    <a:blip r:embed="rId9"/>
+                    <a:blip r:embed="rId10"/>
                     <a:stretch>
                       <a:fillRect/>
                     </a:stretch>
@@ -583,13 +583,23 @@
                 <w:szCs w:val="24"/>
               </w:rPr>
             </w:pPr>
-            <w:r>
-              <w:rPr>
-                <w:rFonts w:ascii="Times New Roman" w:eastAsia="Times New Roman" w:hAnsi="Times New Roman" w:cs="Times New Roman"/>
-                <w:sz w:val="24"/>
-                <w:szCs w:val="24"/>
-              </w:rPr>
-              <w:t>id_ubicación (PK)</w:t>
+            <w:proofErr w:type="spellStart"/>
+            <w:r>
+              <w:rPr>
+                <w:rFonts w:ascii="Times New Roman" w:eastAsia="Times New Roman" w:hAnsi="Times New Roman" w:cs="Times New Roman"/>
+                <w:sz w:val="24"/>
+                <w:szCs w:val="24"/>
+              </w:rPr>
+              <w:t>id_ubicación</w:t>
+            </w:r>
+            <w:proofErr w:type="spellEnd"/>
+            <w:r>
+              <w:rPr>
+                <w:rFonts w:ascii="Times New Roman" w:eastAsia="Times New Roman" w:hAnsi="Times New Roman" w:cs="Times New Roman"/>
+                <w:sz w:val="24"/>
+                <w:szCs w:val="24"/>
+              </w:rPr>
+              <w:t xml:space="preserve"> (PK)</w:t>
             </w:r>
           </w:p>
         </w:tc>
@@ -736,6 +746,7 @@
                 <w:szCs w:val="24"/>
               </w:rPr>
             </w:pPr>
+            <w:proofErr w:type="spellStart"/>
             <w:r>
               <w:rPr>
                 <w:rFonts w:ascii="Times New Roman" w:eastAsia="Times New Roman" w:hAnsi="Times New Roman" w:cs="Times New Roman"/>
@@ -744,6 +755,7 @@
               </w:rPr>
               <w:t>direccion</w:t>
             </w:r>
+            <w:proofErr w:type="spellEnd"/>
           </w:p>
         </w:tc>
         <w:tc>
@@ -907,13 +919,23 @@
                 <w:szCs w:val="24"/>
               </w:rPr>
             </w:pPr>
-            <w:r>
-              <w:rPr>
-                <w:rFonts w:ascii="Times New Roman" w:eastAsia="Times New Roman" w:hAnsi="Times New Roman" w:cs="Times New Roman"/>
-                <w:sz w:val="24"/>
-                <w:szCs w:val="24"/>
-              </w:rPr>
-              <w:t>id_tarea (PK)</w:t>
+            <w:proofErr w:type="spellStart"/>
+            <w:r>
+              <w:rPr>
+                <w:rFonts w:ascii="Times New Roman" w:eastAsia="Times New Roman" w:hAnsi="Times New Roman" w:cs="Times New Roman"/>
+                <w:sz w:val="24"/>
+                <w:szCs w:val="24"/>
+              </w:rPr>
+              <w:t>id_tarea</w:t>
+            </w:r>
+            <w:proofErr w:type="spellEnd"/>
+            <w:r>
+              <w:rPr>
+                <w:rFonts w:ascii="Times New Roman" w:eastAsia="Times New Roman" w:hAnsi="Times New Roman" w:cs="Times New Roman"/>
+                <w:sz w:val="24"/>
+                <w:szCs w:val="24"/>
+              </w:rPr>
+              <w:t xml:space="preserve"> (PK)</w:t>
             </w:r>
           </w:p>
         </w:tc>
@@ -1011,6 +1033,7 @@
                 <w:szCs w:val="24"/>
               </w:rPr>
             </w:pPr>
+            <w:proofErr w:type="spellStart"/>
             <w:r>
               <w:rPr>
                 <w:rFonts w:ascii="Times New Roman" w:eastAsia="Times New Roman" w:hAnsi="Times New Roman" w:cs="Times New Roman"/>
@@ -1019,6 +1042,7 @@
               </w:rPr>
               <w:t>descripcion</w:t>
             </w:r>
+            <w:proofErr w:type="spellEnd"/>
           </w:p>
         </w:tc>
         <w:tc>
@@ -1061,6 +1085,7 @@
                 <w:szCs w:val="24"/>
               </w:rPr>
             </w:pPr>
+            <w:proofErr w:type="spellStart"/>
             <w:r>
               <w:rPr>
                 <w:rFonts w:ascii="Times New Roman" w:eastAsia="Times New Roman" w:hAnsi="Times New Roman" w:cs="Times New Roman"/>
@@ -1069,6 +1094,7 @@
               </w:rPr>
               <w:t>fecha_limite</w:t>
             </w:r>
+            <w:proofErr w:type="spellEnd"/>
           </w:p>
         </w:tc>
         <w:tc>
@@ -1282,13 +1308,23 @@
                 <w:szCs w:val="24"/>
               </w:rPr>
             </w:pPr>
-            <w:r>
-              <w:rPr>
-                <w:rFonts w:ascii="Times New Roman" w:eastAsia="Times New Roman" w:hAnsi="Times New Roman" w:cs="Times New Roman"/>
-                <w:sz w:val="24"/>
-                <w:szCs w:val="24"/>
-              </w:rPr>
-              <w:t>id_disponibilidad (PK)</w:t>
+            <w:proofErr w:type="spellStart"/>
+            <w:r>
+              <w:rPr>
+                <w:rFonts w:ascii="Times New Roman" w:eastAsia="Times New Roman" w:hAnsi="Times New Roman" w:cs="Times New Roman"/>
+                <w:sz w:val="24"/>
+                <w:szCs w:val="24"/>
+              </w:rPr>
+              <w:t>id_disponibilidad</w:t>
+            </w:r>
+            <w:proofErr w:type="spellEnd"/>
+            <w:r>
+              <w:rPr>
+                <w:rFonts w:ascii="Times New Roman" w:eastAsia="Times New Roman" w:hAnsi="Times New Roman" w:cs="Times New Roman"/>
+                <w:sz w:val="24"/>
+                <w:szCs w:val="24"/>
+              </w:rPr>
+              <w:t xml:space="preserve"> (PK)</w:t>
             </w:r>
           </w:p>
         </w:tc>
@@ -1385,6 +1421,7 @@
                 <w:szCs w:val="24"/>
               </w:rPr>
             </w:pPr>
+            <w:proofErr w:type="spellStart"/>
             <w:r>
               <w:rPr>
                 <w:rFonts w:ascii="Times New Roman" w:eastAsia="Times New Roman" w:hAnsi="Times New Roman" w:cs="Times New Roman"/>
@@ -1393,6 +1430,7 @@
               </w:rPr>
               <w:t>hora_inicio</w:t>
             </w:r>
+            <w:proofErr w:type="spellEnd"/>
           </w:p>
         </w:tc>
         <w:tc>
@@ -1435,6 +1473,7 @@
                 <w:szCs w:val="24"/>
               </w:rPr>
             </w:pPr>
+            <w:proofErr w:type="spellStart"/>
             <w:r>
               <w:rPr>
                 <w:rFonts w:ascii="Times New Roman" w:eastAsia="Times New Roman" w:hAnsi="Times New Roman" w:cs="Times New Roman"/>
@@ -1443,6 +1482,7 @@
               </w:rPr>
               <w:t>hora_fin</w:t>
             </w:r>
+            <w:proofErr w:type="spellEnd"/>
           </w:p>
         </w:tc>
         <w:tc>
@@ -1501,7 +1541,43 @@
           <w:sz w:val="24"/>
           <w:szCs w:val="24"/>
         </w:rPr>
-        <w:t xml:space="preserve"> Es el catalogo que evalua o designa la condición de disponibilidad que tenga un usuario en franjas horarias específicas o un rango designado.</w:t>
+        <w:t xml:space="preserve"> Es el </w:t>
+      </w:r>
+      <w:proofErr w:type="spellStart"/>
+      <w:r>
+        <w:rPr>
+          <w:rFonts w:ascii="Times New Roman" w:eastAsia="Times New Roman" w:hAnsi="Times New Roman" w:cs="Times New Roman"/>
+          <w:sz w:val="24"/>
+          <w:szCs w:val="24"/>
+        </w:rPr>
+        <w:t>catalogo</w:t>
+      </w:r>
+      <w:proofErr w:type="spellEnd"/>
+      <w:r>
+        <w:rPr>
+          <w:rFonts w:ascii="Times New Roman" w:eastAsia="Times New Roman" w:hAnsi="Times New Roman" w:cs="Times New Roman"/>
+          <w:sz w:val="24"/>
+          <w:szCs w:val="24"/>
+        </w:rPr>
+        <w:t xml:space="preserve"> que </w:t>
+      </w:r>
+      <w:proofErr w:type="spellStart"/>
+      <w:r>
+        <w:rPr>
+          <w:rFonts w:ascii="Times New Roman" w:eastAsia="Times New Roman" w:hAnsi="Times New Roman" w:cs="Times New Roman"/>
+          <w:sz w:val="24"/>
+          <w:szCs w:val="24"/>
+        </w:rPr>
+        <w:t>evalua</w:t>
+      </w:r>
+      <w:proofErr w:type="spellEnd"/>
+      <w:r>
+        <w:rPr>
+          <w:rFonts w:ascii="Times New Roman" w:eastAsia="Times New Roman" w:hAnsi="Times New Roman" w:cs="Times New Roman"/>
+          <w:sz w:val="24"/>
+          <w:szCs w:val="24"/>
+        </w:rPr>
+        <w:t xml:space="preserve"> o designa la condición de disponibilidad que tenga un usuario en franjas horarias específicas o un rango designado.</w:t>
       </w:r>
     </w:p>
     <w:tbl>
@@ -1556,13 +1632,23 @@
                 <w:szCs w:val="24"/>
               </w:rPr>
             </w:pPr>
-            <w:r>
-              <w:rPr>
-                <w:rFonts w:ascii="Times New Roman" w:eastAsia="Times New Roman" w:hAnsi="Times New Roman" w:cs="Times New Roman"/>
-                <w:sz w:val="24"/>
-                <w:szCs w:val="24"/>
-              </w:rPr>
-              <w:t>id_tipo (PK)</w:t>
+            <w:proofErr w:type="spellStart"/>
+            <w:r>
+              <w:rPr>
+                <w:rFonts w:ascii="Times New Roman" w:eastAsia="Times New Roman" w:hAnsi="Times New Roman" w:cs="Times New Roman"/>
+                <w:sz w:val="24"/>
+                <w:szCs w:val="24"/>
+              </w:rPr>
+              <w:t>id_tipo</w:t>
+            </w:r>
+            <w:proofErr w:type="spellEnd"/>
+            <w:r>
+              <w:rPr>
+                <w:rFonts w:ascii="Times New Roman" w:eastAsia="Times New Roman" w:hAnsi="Times New Roman" w:cs="Times New Roman"/>
+                <w:sz w:val="24"/>
+                <w:szCs w:val="24"/>
+              </w:rPr>
+              <w:t xml:space="preserve"> (PK)</w:t>
             </w:r>
           </w:p>
         </w:tc>
@@ -1639,7 +1725,25 @@
                 <w:sz w:val="24"/>
                 <w:szCs w:val="24"/>
               </w:rPr>
-              <w:t>Descripción dada a cada esta disponible (disponible, ocupado o no disponible)-</w:t>
+              <w:t xml:space="preserve">Descripción dada a cada </w:t>
+            </w:r>
+            <w:proofErr w:type="spellStart"/>
+            <w:r>
+              <w:rPr>
+                <w:rFonts w:ascii="Times New Roman" w:eastAsia="Times New Roman" w:hAnsi="Times New Roman" w:cs="Times New Roman"/>
+                <w:sz w:val="24"/>
+                <w:szCs w:val="24"/>
+              </w:rPr>
+              <w:t>esta</w:t>
+            </w:r>
+            <w:proofErr w:type="spellEnd"/>
+            <w:r>
+              <w:rPr>
+                <w:rFonts w:ascii="Times New Roman" w:eastAsia="Times New Roman" w:hAnsi="Times New Roman" w:cs="Times New Roman"/>
+                <w:sz w:val="24"/>
+                <w:szCs w:val="24"/>
+              </w:rPr>
+              <w:t xml:space="preserve"> disponible (disponible, ocupado o no disponible)-</w:t>
             </w:r>
           </w:p>
         </w:tc>
@@ -1715,7 +1819,7 @@
                     <pic:cNvPicPr/>
                   </pic:nvPicPr>
                   <pic:blipFill>
-                    <a:blip r:embed="rId10" cstate="print">
+                    <a:blip r:embed="rId11" cstate="print">
                       <a:extLst>
                         <a:ext uri="{28A0092B-C50C-407E-A947-70E740481C1C}">
                           <a14:useLocalDpi xmlns:a14="http://schemas.microsoft.com/office/drawing/2010/main" val="0"/>
@@ -1933,7 +2037,43 @@
           <w:sz w:val="24"/>
           <w:szCs w:val="24"/>
         </w:rPr>
-        <w:t>USUARIOS (id_usuario[PK], nombre, apellido, fecha_registro, activo)</w:t>
+        <w:t>USUARIOS (</w:t>
+      </w:r>
+      <w:proofErr w:type="spellStart"/>
+      <w:r>
+        <w:rPr>
+          <w:rFonts w:ascii="Times New Roman" w:eastAsia="Times New Roman" w:hAnsi="Times New Roman" w:cs="Times New Roman"/>
+          <w:sz w:val="24"/>
+          <w:szCs w:val="24"/>
+        </w:rPr>
+        <w:t>id_usuario</w:t>
+      </w:r>
+      <w:proofErr w:type="spellEnd"/>
+      <w:r>
+        <w:rPr>
+          <w:rFonts w:ascii="Times New Roman" w:eastAsia="Times New Roman" w:hAnsi="Times New Roman" w:cs="Times New Roman"/>
+          <w:sz w:val="24"/>
+          <w:szCs w:val="24"/>
+        </w:rPr>
+        <w:t xml:space="preserve">[PK], nombre, apellido, </w:t>
+      </w:r>
+      <w:proofErr w:type="spellStart"/>
+      <w:r>
+        <w:rPr>
+          <w:rFonts w:ascii="Times New Roman" w:eastAsia="Times New Roman" w:hAnsi="Times New Roman" w:cs="Times New Roman"/>
+          <w:sz w:val="24"/>
+          <w:szCs w:val="24"/>
+        </w:rPr>
+        <w:t>fecha_registro</w:t>
+      </w:r>
+      <w:proofErr w:type="spellEnd"/>
+      <w:r>
+        <w:rPr>
+          <w:rFonts w:ascii="Times New Roman" w:eastAsia="Times New Roman" w:hAnsi="Times New Roman" w:cs="Times New Roman"/>
+          <w:sz w:val="24"/>
+          <w:szCs w:val="24"/>
+        </w:rPr>
+        <w:t>, activo)</w:t>
       </w:r>
     </w:p>
     <w:p>
@@ -1952,7 +2092,43 @@
           <w:sz w:val="24"/>
           <w:szCs w:val="24"/>
         </w:rPr>
-        <w:t>CATEGORIAS (id_categoria[PK], nombre, id_categoria_padre[FK])</w:t>
+        <w:t>CATEGORIAS (</w:t>
+      </w:r>
+      <w:proofErr w:type="spellStart"/>
+      <w:r>
+        <w:rPr>
+          <w:rFonts w:ascii="Times New Roman" w:eastAsia="Times New Roman" w:hAnsi="Times New Roman" w:cs="Times New Roman"/>
+          <w:sz w:val="24"/>
+          <w:szCs w:val="24"/>
+        </w:rPr>
+        <w:t>id_categoria</w:t>
+      </w:r>
+      <w:proofErr w:type="spellEnd"/>
+      <w:r>
+        <w:rPr>
+          <w:rFonts w:ascii="Times New Roman" w:eastAsia="Times New Roman" w:hAnsi="Times New Roman" w:cs="Times New Roman"/>
+          <w:sz w:val="24"/>
+          <w:szCs w:val="24"/>
+        </w:rPr>
+        <w:t xml:space="preserve">[PK], nombre, </w:t>
+      </w:r>
+      <w:proofErr w:type="spellStart"/>
+      <w:r>
+        <w:rPr>
+          <w:rFonts w:ascii="Times New Roman" w:eastAsia="Times New Roman" w:hAnsi="Times New Roman" w:cs="Times New Roman"/>
+          <w:sz w:val="24"/>
+          <w:szCs w:val="24"/>
+        </w:rPr>
+        <w:t>id_categoria_padre</w:t>
+      </w:r>
+      <w:proofErr w:type="spellEnd"/>
+      <w:r>
+        <w:rPr>
+          <w:rFonts w:ascii="Times New Roman" w:eastAsia="Times New Roman" w:hAnsi="Times New Roman" w:cs="Times New Roman"/>
+          <w:sz w:val="24"/>
+          <w:szCs w:val="24"/>
+        </w:rPr>
+        <w:t>[FK])</w:t>
       </w:r>
     </w:p>
     <w:p>
@@ -1971,7 +2147,133 @@
           <w:sz w:val="24"/>
           <w:szCs w:val="24"/>
         </w:rPr>
-        <w:t>EVENTOS (id_evento[PK], titulo, descripcion, fecha_inicio, fecha_fin, id_usuario_propietario[FK], id_categoria[FK], id_ubicacion[FK])</w:t>
+        <w:t>EVENTOS (</w:t>
+      </w:r>
+      <w:proofErr w:type="spellStart"/>
+      <w:r>
+        <w:rPr>
+          <w:rFonts w:ascii="Times New Roman" w:eastAsia="Times New Roman" w:hAnsi="Times New Roman" w:cs="Times New Roman"/>
+          <w:sz w:val="24"/>
+          <w:szCs w:val="24"/>
+        </w:rPr>
+        <w:t>id_evento</w:t>
+      </w:r>
+      <w:proofErr w:type="spellEnd"/>
+      <w:r>
+        <w:rPr>
+          <w:rFonts w:ascii="Times New Roman" w:eastAsia="Times New Roman" w:hAnsi="Times New Roman" w:cs="Times New Roman"/>
+          <w:sz w:val="24"/>
+          <w:szCs w:val="24"/>
+        </w:rPr>
+        <w:t xml:space="preserve">[PK], titulo, </w:t>
+      </w:r>
+      <w:proofErr w:type="spellStart"/>
+      <w:r>
+        <w:rPr>
+          <w:rFonts w:ascii="Times New Roman" w:eastAsia="Times New Roman" w:hAnsi="Times New Roman" w:cs="Times New Roman"/>
+          <w:sz w:val="24"/>
+          <w:szCs w:val="24"/>
+        </w:rPr>
+        <w:t>descripcion</w:t>
+      </w:r>
+      <w:proofErr w:type="spellEnd"/>
+      <w:r>
+        <w:rPr>
+          <w:rFonts w:ascii="Times New Roman" w:eastAsia="Times New Roman" w:hAnsi="Times New Roman" w:cs="Times New Roman"/>
+          <w:sz w:val="24"/>
+          <w:szCs w:val="24"/>
+        </w:rPr>
+        <w:t xml:space="preserve">, </w:t>
+      </w:r>
+      <w:proofErr w:type="spellStart"/>
+      <w:r>
+        <w:rPr>
+          <w:rFonts w:ascii="Times New Roman" w:eastAsia="Times New Roman" w:hAnsi="Times New Roman" w:cs="Times New Roman"/>
+          <w:sz w:val="24"/>
+          <w:szCs w:val="24"/>
+        </w:rPr>
+        <w:t>fecha_inicio</w:t>
+      </w:r>
+      <w:proofErr w:type="spellEnd"/>
+      <w:r>
+        <w:rPr>
+          <w:rFonts w:ascii="Times New Roman" w:eastAsia="Times New Roman" w:hAnsi="Times New Roman" w:cs="Times New Roman"/>
+          <w:sz w:val="24"/>
+          <w:szCs w:val="24"/>
+        </w:rPr>
+        <w:t xml:space="preserve">, </w:t>
+      </w:r>
+      <w:proofErr w:type="spellStart"/>
+      <w:r>
+        <w:rPr>
+          <w:rFonts w:ascii="Times New Roman" w:eastAsia="Times New Roman" w:hAnsi="Times New Roman" w:cs="Times New Roman"/>
+          <w:sz w:val="24"/>
+          <w:szCs w:val="24"/>
+        </w:rPr>
+        <w:t>fecha_fin</w:t>
+      </w:r>
+      <w:proofErr w:type="spellEnd"/>
+      <w:r>
+        <w:rPr>
+          <w:rFonts w:ascii="Times New Roman" w:eastAsia="Times New Roman" w:hAnsi="Times New Roman" w:cs="Times New Roman"/>
+          <w:sz w:val="24"/>
+          <w:szCs w:val="24"/>
+        </w:rPr>
+        <w:t xml:space="preserve">, </w:t>
+      </w:r>
+      <w:proofErr w:type="spellStart"/>
+      <w:r>
+        <w:rPr>
+          <w:rFonts w:ascii="Times New Roman" w:eastAsia="Times New Roman" w:hAnsi="Times New Roman" w:cs="Times New Roman"/>
+          <w:sz w:val="24"/>
+          <w:szCs w:val="24"/>
+        </w:rPr>
+        <w:t>id_usuario_propietario</w:t>
+      </w:r>
+      <w:proofErr w:type="spellEnd"/>
+      <w:r>
+        <w:rPr>
+          <w:rFonts w:ascii="Times New Roman" w:eastAsia="Times New Roman" w:hAnsi="Times New Roman" w:cs="Times New Roman"/>
+          <w:sz w:val="24"/>
+          <w:szCs w:val="24"/>
+        </w:rPr>
+        <w:t xml:space="preserve">[FK], </w:t>
+      </w:r>
+      <w:proofErr w:type="spellStart"/>
+      <w:r>
+        <w:rPr>
+          <w:rFonts w:ascii="Times New Roman" w:eastAsia="Times New Roman" w:hAnsi="Times New Roman" w:cs="Times New Roman"/>
+          <w:sz w:val="24"/>
+          <w:szCs w:val="24"/>
+        </w:rPr>
+        <w:t>id_categoria</w:t>
+      </w:r>
+      <w:proofErr w:type="spellEnd"/>
+      <w:r>
+        <w:rPr>
+          <w:rFonts w:ascii="Times New Roman" w:eastAsia="Times New Roman" w:hAnsi="Times New Roman" w:cs="Times New Roman"/>
+          <w:sz w:val="24"/>
+          <w:szCs w:val="24"/>
+        </w:rPr>
+        <w:t xml:space="preserve">[FK], </w:t>
+      </w:r>
+      <w:proofErr w:type="spellStart"/>
+      <w:r>
+        <w:rPr>
+          <w:rFonts w:ascii="Times New Roman" w:eastAsia="Times New Roman" w:hAnsi="Times New Roman" w:cs="Times New Roman"/>
+          <w:sz w:val="24"/>
+          <w:szCs w:val="24"/>
+        </w:rPr>
+        <w:t>id_ubicacion</w:t>
+      </w:r>
+      <w:proofErr w:type="spellEnd"/>
+      <w:r>
+        <w:rPr>
+          <w:rFonts w:ascii="Times New Roman" w:eastAsia="Times New Roman" w:hAnsi="Times New Roman" w:cs="Times New Roman"/>
+          <w:sz w:val="24"/>
+          <w:szCs w:val="24"/>
+        </w:rPr>
+        <w:t>[FK])</w:t>
       </w:r>
     </w:p>
     <w:p>
@@ -1990,7 +2292,61 @@
           <w:sz w:val="24"/>
           <w:szCs w:val="24"/>
         </w:rPr>
-        <w:t>LOG_ACCESOS (id_log[PK], fecha_acceso, id_usuario[FK])</w:t>
+        <w:t>LOG_ACCESOS (</w:t>
+      </w:r>
+      <w:proofErr w:type="spellStart"/>
+      <w:r>
+        <w:rPr>
+          <w:rFonts w:ascii="Times New Roman" w:eastAsia="Times New Roman" w:hAnsi="Times New Roman" w:cs="Times New Roman"/>
+          <w:sz w:val="24"/>
+          <w:szCs w:val="24"/>
+        </w:rPr>
+        <w:t>id_log</w:t>
+      </w:r>
+      <w:proofErr w:type="spellEnd"/>
+      <w:r>
+        <w:rPr>
+          <w:rFonts w:ascii="Times New Roman" w:eastAsia="Times New Roman" w:hAnsi="Times New Roman" w:cs="Times New Roman"/>
+          <w:sz w:val="24"/>
+          <w:szCs w:val="24"/>
+        </w:rPr>
+        <w:t xml:space="preserve">[PK], </w:t>
+      </w:r>
+      <w:proofErr w:type="spellStart"/>
+      <w:r>
+        <w:rPr>
+          <w:rFonts w:ascii="Times New Roman" w:eastAsia="Times New Roman" w:hAnsi="Times New Roman" w:cs="Times New Roman"/>
+          <w:sz w:val="24"/>
+          <w:szCs w:val="24"/>
+        </w:rPr>
+        <w:t>fecha_acceso</w:t>
+      </w:r>
+      <w:proofErr w:type="spellEnd"/>
+      <w:r>
+        <w:rPr>
+          <w:rFonts w:ascii="Times New Roman" w:eastAsia="Times New Roman" w:hAnsi="Times New Roman" w:cs="Times New Roman"/>
+          <w:sz w:val="24"/>
+          <w:szCs w:val="24"/>
+        </w:rPr>
+        <w:t xml:space="preserve">, </w:t>
+      </w:r>
+      <w:proofErr w:type="spellStart"/>
+      <w:r>
+        <w:rPr>
+          <w:rFonts w:ascii="Times New Roman" w:eastAsia="Times New Roman" w:hAnsi="Times New Roman" w:cs="Times New Roman"/>
+          <w:sz w:val="24"/>
+          <w:szCs w:val="24"/>
+        </w:rPr>
+        <w:t>id_usuario</w:t>
+      </w:r>
+      <w:proofErr w:type="spellEnd"/>
+      <w:r>
+        <w:rPr>
+          <w:rFonts w:ascii="Times New Roman" w:eastAsia="Times New Roman" w:hAnsi="Times New Roman" w:cs="Times New Roman"/>
+          <w:sz w:val="24"/>
+          <w:szCs w:val="24"/>
+        </w:rPr>
+        <w:t>[FK])</w:t>
       </w:r>
     </w:p>
     <w:p>
@@ -2009,7 +2365,61 @@
           <w:sz w:val="24"/>
           <w:szCs w:val="24"/>
         </w:rPr>
-        <w:t>PARTICIPACIONES (id_evento[PK/FK], id_usuario[PK/FK], rol, estado_confirmacion)</w:t>
+        <w:t>PARTICIPACIONES (</w:t>
+      </w:r>
+      <w:proofErr w:type="spellStart"/>
+      <w:r>
+        <w:rPr>
+          <w:rFonts w:ascii="Times New Roman" w:eastAsia="Times New Roman" w:hAnsi="Times New Roman" w:cs="Times New Roman"/>
+          <w:sz w:val="24"/>
+          <w:szCs w:val="24"/>
+        </w:rPr>
+        <w:t>id_evento</w:t>
+      </w:r>
+      <w:proofErr w:type="spellEnd"/>
+      <w:r>
+        <w:rPr>
+          <w:rFonts w:ascii="Times New Roman" w:eastAsia="Times New Roman" w:hAnsi="Times New Roman" w:cs="Times New Roman"/>
+          <w:sz w:val="24"/>
+          <w:szCs w:val="24"/>
+        </w:rPr>
+        <w:t xml:space="preserve">[PK/FK], </w:t>
+      </w:r>
+      <w:proofErr w:type="spellStart"/>
+      <w:r>
+        <w:rPr>
+          <w:rFonts w:ascii="Times New Roman" w:eastAsia="Times New Roman" w:hAnsi="Times New Roman" w:cs="Times New Roman"/>
+          <w:sz w:val="24"/>
+          <w:szCs w:val="24"/>
+        </w:rPr>
+        <w:t>id_usuario</w:t>
+      </w:r>
+      <w:proofErr w:type="spellEnd"/>
+      <w:r>
+        <w:rPr>
+          <w:rFonts w:ascii="Times New Roman" w:eastAsia="Times New Roman" w:hAnsi="Times New Roman" w:cs="Times New Roman"/>
+          <w:sz w:val="24"/>
+          <w:szCs w:val="24"/>
+        </w:rPr>
+        <w:t xml:space="preserve">[PK/FK], rol, </w:t>
+      </w:r>
+      <w:proofErr w:type="spellStart"/>
+      <w:r>
+        <w:rPr>
+          <w:rFonts w:ascii="Times New Roman" w:eastAsia="Times New Roman" w:hAnsi="Times New Roman" w:cs="Times New Roman"/>
+          <w:sz w:val="24"/>
+          <w:szCs w:val="24"/>
+        </w:rPr>
+        <w:t>estado_confirmacion</w:t>
+      </w:r>
+      <w:proofErr w:type="spellEnd"/>
+      <w:r>
+        <w:rPr>
+          <w:rFonts w:ascii="Times New Roman" w:eastAsia="Times New Roman" w:hAnsi="Times New Roman" w:cs="Times New Roman"/>
+          <w:sz w:val="24"/>
+          <w:szCs w:val="24"/>
+        </w:rPr>
+        <w:t>)</w:t>
       </w:r>
     </w:p>
     <w:p>
@@ -2028,7 +2438,43 @@
           <w:sz w:val="24"/>
           <w:szCs w:val="24"/>
         </w:rPr>
-        <w:t>UBICACIONES (id_ubicacion[PK], nombre, ciudad, direccion, capacidad)</w:t>
+        <w:t>UBICACIONES (</w:t>
+      </w:r>
+      <w:proofErr w:type="spellStart"/>
+      <w:r>
+        <w:rPr>
+          <w:rFonts w:ascii="Times New Roman" w:eastAsia="Times New Roman" w:hAnsi="Times New Roman" w:cs="Times New Roman"/>
+          <w:sz w:val="24"/>
+          <w:szCs w:val="24"/>
+        </w:rPr>
+        <w:t>id_ubicacion</w:t>
+      </w:r>
+      <w:proofErr w:type="spellEnd"/>
+      <w:r>
+        <w:rPr>
+          <w:rFonts w:ascii="Times New Roman" w:eastAsia="Times New Roman" w:hAnsi="Times New Roman" w:cs="Times New Roman"/>
+          <w:sz w:val="24"/>
+          <w:szCs w:val="24"/>
+        </w:rPr>
+        <w:t xml:space="preserve">[PK], nombre, ciudad, </w:t>
+      </w:r>
+      <w:proofErr w:type="spellStart"/>
+      <w:r>
+        <w:rPr>
+          <w:rFonts w:ascii="Times New Roman" w:eastAsia="Times New Roman" w:hAnsi="Times New Roman" w:cs="Times New Roman"/>
+          <w:sz w:val="24"/>
+          <w:szCs w:val="24"/>
+        </w:rPr>
+        <w:t>direccion</w:t>
+      </w:r>
+      <w:proofErr w:type="spellEnd"/>
+      <w:r>
+        <w:rPr>
+          <w:rFonts w:ascii="Times New Roman" w:eastAsia="Times New Roman" w:hAnsi="Times New Roman" w:cs="Times New Roman"/>
+          <w:sz w:val="24"/>
+          <w:szCs w:val="24"/>
+        </w:rPr>
+        <w:t>, capacidad)</w:t>
       </w:r>
     </w:p>
     <w:p>
@@ -2047,7 +2493,97 @@
           <w:sz w:val="24"/>
           <w:szCs w:val="24"/>
         </w:rPr>
-        <w:t>TAREAS (id_tarea[PK], titulo, descripcion, fecha_limite, prioridad, estado, id_evento[FK], id_usuario[FK])</w:t>
+        <w:t>TAREAS (</w:t>
+      </w:r>
+      <w:proofErr w:type="spellStart"/>
+      <w:r>
+        <w:rPr>
+          <w:rFonts w:ascii="Times New Roman" w:eastAsia="Times New Roman" w:hAnsi="Times New Roman" w:cs="Times New Roman"/>
+          <w:sz w:val="24"/>
+          <w:szCs w:val="24"/>
+        </w:rPr>
+        <w:t>id_tarea</w:t>
+      </w:r>
+      <w:proofErr w:type="spellEnd"/>
+      <w:r>
+        <w:rPr>
+          <w:rFonts w:ascii="Times New Roman" w:eastAsia="Times New Roman" w:hAnsi="Times New Roman" w:cs="Times New Roman"/>
+          <w:sz w:val="24"/>
+          <w:szCs w:val="24"/>
+        </w:rPr>
+        <w:t xml:space="preserve">[PK], titulo, </w:t>
+      </w:r>
+      <w:proofErr w:type="spellStart"/>
+      <w:r>
+        <w:rPr>
+          <w:rFonts w:ascii="Times New Roman" w:eastAsia="Times New Roman" w:hAnsi="Times New Roman" w:cs="Times New Roman"/>
+          <w:sz w:val="24"/>
+          <w:szCs w:val="24"/>
+        </w:rPr>
+        <w:t>descripcion</w:t>
+      </w:r>
+      <w:proofErr w:type="spellEnd"/>
+      <w:r>
+        <w:rPr>
+          <w:rFonts w:ascii="Times New Roman" w:eastAsia="Times New Roman" w:hAnsi="Times New Roman" w:cs="Times New Roman"/>
+          <w:sz w:val="24"/>
+          <w:szCs w:val="24"/>
+        </w:rPr>
+        <w:t xml:space="preserve">, </w:t>
+      </w:r>
+      <w:proofErr w:type="spellStart"/>
+      <w:r>
+        <w:rPr>
+          <w:rFonts w:ascii="Times New Roman" w:eastAsia="Times New Roman" w:hAnsi="Times New Roman" w:cs="Times New Roman"/>
+          <w:sz w:val="24"/>
+          <w:szCs w:val="24"/>
+        </w:rPr>
+        <w:t>fecha_limite</w:t>
+      </w:r>
+      <w:proofErr w:type="spellEnd"/>
+      <w:r>
+        <w:rPr>
+          <w:rFonts w:ascii="Times New Roman" w:eastAsia="Times New Roman" w:hAnsi="Times New Roman" w:cs="Times New Roman"/>
+          <w:sz w:val="24"/>
+          <w:szCs w:val="24"/>
+        </w:rPr>
+        <w:t xml:space="preserve">, prioridad, estado, </w:t>
+      </w:r>
+      <w:proofErr w:type="spellStart"/>
+      <w:r>
+        <w:rPr>
+          <w:rFonts w:ascii="Times New Roman" w:eastAsia="Times New Roman" w:hAnsi="Times New Roman" w:cs="Times New Roman"/>
+          <w:sz w:val="24"/>
+          <w:szCs w:val="24"/>
+        </w:rPr>
+        <w:t>id_evento</w:t>
+      </w:r>
+      <w:proofErr w:type="spellEnd"/>
+      <w:r>
+        <w:rPr>
+          <w:rFonts w:ascii="Times New Roman" w:eastAsia="Times New Roman" w:hAnsi="Times New Roman" w:cs="Times New Roman"/>
+          <w:sz w:val="24"/>
+          <w:szCs w:val="24"/>
+        </w:rPr>
+        <w:t xml:space="preserve">[FK], </w:t>
+      </w:r>
+      <w:proofErr w:type="spellStart"/>
+      <w:r>
+        <w:rPr>
+          <w:rFonts w:ascii="Times New Roman" w:eastAsia="Times New Roman" w:hAnsi="Times New Roman" w:cs="Times New Roman"/>
+          <w:sz w:val="24"/>
+          <w:szCs w:val="24"/>
+        </w:rPr>
+        <w:t>id_usuario</w:t>
+      </w:r>
+      <w:proofErr w:type="spellEnd"/>
+      <w:r>
+        <w:rPr>
+          <w:rFonts w:ascii="Times New Roman" w:eastAsia="Times New Roman" w:hAnsi="Times New Roman" w:cs="Times New Roman"/>
+          <w:sz w:val="24"/>
+          <w:szCs w:val="24"/>
+        </w:rPr>
+        <w:t>[FK])</w:t>
       </w:r>
     </w:p>
     <w:p>
@@ -2066,7 +2602,97 @@
           <w:sz w:val="24"/>
           <w:szCs w:val="24"/>
         </w:rPr>
-        <w:t>DISPONIBILIDADES (id_disponibilidad[PK], fecha, hora_inicio, hora_fin, id_usuario[FK], id_tipo[FK])</w:t>
+        <w:t>DISPONIBILIDADES (</w:t>
+      </w:r>
+      <w:proofErr w:type="spellStart"/>
+      <w:r>
+        <w:rPr>
+          <w:rFonts w:ascii="Times New Roman" w:eastAsia="Times New Roman" w:hAnsi="Times New Roman" w:cs="Times New Roman"/>
+          <w:sz w:val="24"/>
+          <w:szCs w:val="24"/>
+        </w:rPr>
+        <w:t>id_disponibilidad</w:t>
+      </w:r>
+      <w:proofErr w:type="spellEnd"/>
+      <w:r>
+        <w:rPr>
+          <w:rFonts w:ascii="Times New Roman" w:eastAsia="Times New Roman" w:hAnsi="Times New Roman" w:cs="Times New Roman"/>
+          <w:sz w:val="24"/>
+          <w:szCs w:val="24"/>
+        </w:rPr>
+        <w:t xml:space="preserve">[PK], fecha, </w:t>
+      </w:r>
+      <w:proofErr w:type="spellStart"/>
+      <w:r>
+        <w:rPr>
+          <w:rFonts w:ascii="Times New Roman" w:eastAsia="Times New Roman" w:hAnsi="Times New Roman" w:cs="Times New Roman"/>
+          <w:sz w:val="24"/>
+          <w:szCs w:val="24"/>
+        </w:rPr>
+        <w:t>hora_inicio</w:t>
+      </w:r>
+      <w:proofErr w:type="spellEnd"/>
+      <w:r>
+        <w:rPr>
+          <w:rFonts w:ascii="Times New Roman" w:eastAsia="Times New Roman" w:hAnsi="Times New Roman" w:cs="Times New Roman"/>
+          <w:sz w:val="24"/>
+          <w:szCs w:val="24"/>
+        </w:rPr>
+        <w:t xml:space="preserve">, </w:t>
+      </w:r>
+      <w:proofErr w:type="spellStart"/>
+      <w:r>
+        <w:rPr>
+          <w:rFonts w:ascii="Times New Roman" w:eastAsia="Times New Roman" w:hAnsi="Times New Roman" w:cs="Times New Roman"/>
+          <w:sz w:val="24"/>
+          <w:szCs w:val="24"/>
+        </w:rPr>
+        <w:t>hora_fin</w:t>
+      </w:r>
+      <w:proofErr w:type="spellEnd"/>
+      <w:r>
+        <w:rPr>
+          <w:rFonts w:ascii="Times New Roman" w:eastAsia="Times New Roman" w:hAnsi="Times New Roman" w:cs="Times New Roman"/>
+          <w:sz w:val="24"/>
+          <w:szCs w:val="24"/>
+        </w:rPr>
+        <w:t xml:space="preserve">, </w:t>
+      </w:r>
+      <w:proofErr w:type="spellStart"/>
+      <w:r>
+        <w:rPr>
+          <w:rFonts w:ascii="Times New Roman" w:eastAsia="Times New Roman" w:hAnsi="Times New Roman" w:cs="Times New Roman"/>
+          <w:sz w:val="24"/>
+          <w:szCs w:val="24"/>
+        </w:rPr>
+        <w:t>id_usuario</w:t>
+      </w:r>
+      <w:proofErr w:type="spellEnd"/>
+      <w:r>
+        <w:rPr>
+          <w:rFonts w:ascii="Times New Roman" w:eastAsia="Times New Roman" w:hAnsi="Times New Roman" w:cs="Times New Roman"/>
+          <w:sz w:val="24"/>
+          <w:szCs w:val="24"/>
+        </w:rPr>
+        <w:t xml:space="preserve">[FK], </w:t>
+      </w:r>
+      <w:proofErr w:type="spellStart"/>
+      <w:r>
+        <w:rPr>
+          <w:rFonts w:ascii="Times New Roman" w:eastAsia="Times New Roman" w:hAnsi="Times New Roman" w:cs="Times New Roman"/>
+          <w:sz w:val="24"/>
+          <w:szCs w:val="24"/>
+        </w:rPr>
+        <w:t>id_tipo</w:t>
+      </w:r>
+      <w:proofErr w:type="spellEnd"/>
+      <w:r>
+        <w:rPr>
+          <w:rFonts w:ascii="Times New Roman" w:eastAsia="Times New Roman" w:hAnsi="Times New Roman" w:cs="Times New Roman"/>
+          <w:sz w:val="24"/>
+          <w:szCs w:val="24"/>
+        </w:rPr>
+        <w:t>[FK])</w:t>
       </w:r>
     </w:p>
     <w:p>
@@ -2085,7 +2711,25 @@
           <w:sz w:val="24"/>
           <w:szCs w:val="24"/>
         </w:rPr>
-        <w:t>TIPOS_DISPONIBILIDAD (id_tipo[PK], nombre)</w:t>
+        <w:t>TIPOS_DISPONIBILIDAD (</w:t>
+      </w:r>
+      <w:proofErr w:type="spellStart"/>
+      <w:r>
+        <w:rPr>
+          <w:rFonts w:ascii="Times New Roman" w:eastAsia="Times New Roman" w:hAnsi="Times New Roman" w:cs="Times New Roman"/>
+          <w:sz w:val="24"/>
+          <w:szCs w:val="24"/>
+        </w:rPr>
+        <w:t>id_tipo</w:t>
+      </w:r>
+      <w:proofErr w:type="spellEnd"/>
+      <w:r>
+        <w:rPr>
+          <w:rFonts w:ascii="Times New Roman" w:eastAsia="Times New Roman" w:hAnsi="Times New Roman" w:cs="Times New Roman"/>
+          <w:sz w:val="24"/>
+          <w:szCs w:val="24"/>
+        </w:rPr>
+        <w:t>[PK], nombre)</w:t>
       </w:r>
     </w:p>
     <w:p>
@@ -2104,7 +2748,43 @@
           <w:sz w:val="24"/>
           <w:szCs w:val="24"/>
         </w:rPr>
-        <w:t>USUARIO_TELEFONOS (id_usuario[PK/FK], telefono[PK])</w:t>
+        <w:t>USUARIO_TELEFONOS (</w:t>
+      </w:r>
+      <w:proofErr w:type="spellStart"/>
+      <w:r>
+        <w:rPr>
+          <w:rFonts w:ascii="Times New Roman" w:eastAsia="Times New Roman" w:hAnsi="Times New Roman" w:cs="Times New Roman"/>
+          <w:sz w:val="24"/>
+          <w:szCs w:val="24"/>
+        </w:rPr>
+        <w:t>id_usuario</w:t>
+      </w:r>
+      <w:proofErr w:type="spellEnd"/>
+      <w:r>
+        <w:rPr>
+          <w:rFonts w:ascii="Times New Roman" w:eastAsia="Times New Roman" w:hAnsi="Times New Roman" w:cs="Times New Roman"/>
+          <w:sz w:val="24"/>
+          <w:szCs w:val="24"/>
+        </w:rPr>
+        <w:t xml:space="preserve">[PK/FK], </w:t>
+      </w:r>
+      <w:proofErr w:type="spellStart"/>
+      <w:r>
+        <w:rPr>
+          <w:rFonts w:ascii="Times New Roman" w:eastAsia="Times New Roman" w:hAnsi="Times New Roman" w:cs="Times New Roman"/>
+          <w:sz w:val="24"/>
+          <w:szCs w:val="24"/>
+        </w:rPr>
+        <w:t>telefono</w:t>
+      </w:r>
+      <w:proofErr w:type="spellEnd"/>
+      <w:r>
+        <w:rPr>
+          <w:rFonts w:ascii="Times New Roman" w:eastAsia="Times New Roman" w:hAnsi="Times New Roman" w:cs="Times New Roman"/>
+          <w:sz w:val="24"/>
+          <w:szCs w:val="24"/>
+        </w:rPr>
+        <w:t>[PK])</w:t>
       </w:r>
     </w:p>
     <w:p>
@@ -2123,7 +2803,25 @@
           <w:sz w:val="24"/>
           <w:szCs w:val="24"/>
         </w:rPr>
-        <w:t>USUARIO_EMAILS (id_usuario[PK/FK], correo[PK])</w:t>
+        <w:t>USUARIO_EMAILS (</w:t>
+      </w:r>
+      <w:proofErr w:type="spellStart"/>
+      <w:r>
+        <w:rPr>
+          <w:rFonts w:ascii="Times New Roman" w:eastAsia="Times New Roman" w:hAnsi="Times New Roman" w:cs="Times New Roman"/>
+          <w:sz w:val="24"/>
+          <w:szCs w:val="24"/>
+        </w:rPr>
+        <w:t>id_usuario</w:t>
+      </w:r>
+      <w:proofErr w:type="spellEnd"/>
+      <w:r>
+        <w:rPr>
+          <w:rFonts w:ascii="Times New Roman" w:eastAsia="Times New Roman" w:hAnsi="Times New Roman" w:cs="Times New Roman"/>
+          <w:sz w:val="24"/>
+          <w:szCs w:val="24"/>
+        </w:rPr>
+        <w:t>[PK/FK], correo[PK])</w:t>
       </w:r>
     </w:p>
     <w:p>
@@ -2422,7 +3120,25 @@
                 <w:sz w:val="24"/>
                 <w:szCs w:val="24"/>
               </w:rPr>
-              <w:t>SERIAL para id_ubicacion de manera que sea un valor incremental por cada nuevo registro</w:t>
+              <w:t xml:space="preserve">SERIAL para </w:t>
+            </w:r>
+            <w:proofErr w:type="spellStart"/>
+            <w:r>
+              <w:rPr>
+                <w:rFonts w:ascii="Times New Roman" w:eastAsia="Times New Roman" w:hAnsi="Times New Roman" w:cs="Times New Roman"/>
+                <w:sz w:val="24"/>
+                <w:szCs w:val="24"/>
+              </w:rPr>
+              <w:t>id_ubicacion</w:t>
+            </w:r>
+            <w:proofErr w:type="spellEnd"/>
+            <w:r>
+              <w:rPr>
+                <w:rFonts w:ascii="Times New Roman" w:eastAsia="Times New Roman" w:hAnsi="Times New Roman" w:cs="Times New Roman"/>
+                <w:sz w:val="24"/>
+                <w:szCs w:val="24"/>
+              </w:rPr>
+              <w:t xml:space="preserve"> de manera que sea un valor incremental por cada nuevo registro</w:t>
             </w:r>
             <w:r>
               <w:rPr>
@@ -2463,7 +3179,25 @@
                 <w:sz w:val="24"/>
                 <w:szCs w:val="24"/>
               </w:rPr>
-              <w:t>VARCHAR(100) para ubicaciones cuyo nombre suele exceder más de 5 palabras, VARCHAR(200) para direccion al tratarse de cadenas de texto mucho más extensa y VARCHAR(50) para ciudad que es óptimo tratándose de 1 a 3 palabras.</w:t>
+              <w:t xml:space="preserve">VARCHAR(100) para ubicaciones cuyo nombre suele exceder más de 5 palabras, VARCHAR(200) para </w:t>
+            </w:r>
+            <w:proofErr w:type="spellStart"/>
+            <w:r>
+              <w:rPr>
+                <w:rFonts w:ascii="Times New Roman" w:eastAsia="Times New Roman" w:hAnsi="Times New Roman" w:cs="Times New Roman"/>
+                <w:sz w:val="24"/>
+                <w:szCs w:val="24"/>
+              </w:rPr>
+              <w:t>direccion</w:t>
+            </w:r>
+            <w:proofErr w:type="spellEnd"/>
+            <w:r>
+              <w:rPr>
+                <w:rFonts w:ascii="Times New Roman" w:eastAsia="Times New Roman" w:hAnsi="Times New Roman" w:cs="Times New Roman"/>
+                <w:sz w:val="24"/>
+                <w:szCs w:val="24"/>
+              </w:rPr>
+              <w:t xml:space="preserve"> al tratarse de cadenas de texto mucho más extensa y VARCHAR(50) para ciudad que es óptimo tratándose de 1 a 3 palabras.</w:t>
             </w:r>
           </w:p>
           <w:p>
@@ -2560,7 +3294,25 @@
                 <w:sz w:val="24"/>
                 <w:szCs w:val="24"/>
               </w:rPr>
-              <w:t>SERIAL para id_tarea, así es un valor incremental nuevo y único (PK) por cada nuevo registro.</w:t>
+              <w:t xml:space="preserve">SERIAL para </w:t>
+            </w:r>
+            <w:proofErr w:type="spellStart"/>
+            <w:r>
+              <w:rPr>
+                <w:rFonts w:ascii="Times New Roman" w:eastAsia="Times New Roman" w:hAnsi="Times New Roman" w:cs="Times New Roman"/>
+                <w:sz w:val="24"/>
+                <w:szCs w:val="24"/>
+              </w:rPr>
+              <w:t>id_tarea</w:t>
+            </w:r>
+            <w:proofErr w:type="spellEnd"/>
+            <w:r>
+              <w:rPr>
+                <w:rFonts w:ascii="Times New Roman" w:eastAsia="Times New Roman" w:hAnsi="Times New Roman" w:cs="Times New Roman"/>
+                <w:sz w:val="24"/>
+                <w:szCs w:val="24"/>
+              </w:rPr>
+              <w:t>, así es un valor incremental nuevo y único (PK) por cada nuevo registro.</w:t>
             </w:r>
           </w:p>
           <w:p>
@@ -2610,7 +3362,25 @@
                 <w:sz w:val="24"/>
                 <w:szCs w:val="24"/>
               </w:rPr>
-              <w:t>TEXT para el atributo descripcion ya que el texto puede contener amplios detalles o indicaciones.</w:t>
+              <w:t xml:space="preserve">TEXT para el atributo </w:t>
+            </w:r>
+            <w:proofErr w:type="spellStart"/>
+            <w:r>
+              <w:rPr>
+                <w:rFonts w:ascii="Times New Roman" w:eastAsia="Times New Roman" w:hAnsi="Times New Roman" w:cs="Times New Roman"/>
+                <w:sz w:val="24"/>
+                <w:szCs w:val="24"/>
+              </w:rPr>
+              <w:t>descripcion</w:t>
+            </w:r>
+            <w:proofErr w:type="spellEnd"/>
+            <w:r>
+              <w:rPr>
+                <w:rFonts w:ascii="Times New Roman" w:eastAsia="Times New Roman" w:hAnsi="Times New Roman" w:cs="Times New Roman"/>
+                <w:sz w:val="24"/>
+                <w:szCs w:val="24"/>
+              </w:rPr>
+              <w:t xml:space="preserve"> ya que el texto puede contener amplios detalles o indicaciones.</w:t>
             </w:r>
           </w:p>
           <w:p>
@@ -2660,7 +3430,61 @@
                 <w:sz w:val="24"/>
                 <w:szCs w:val="24"/>
               </w:rPr>
-              <w:t>INT en el caso de id_evento e id_usuario como FKs, ya que conforme los registros, estos corresponden a valores altos.</w:t>
+              <w:t xml:space="preserve">INT en el caso de </w:t>
+            </w:r>
+            <w:proofErr w:type="spellStart"/>
+            <w:r>
+              <w:rPr>
+                <w:rFonts w:ascii="Times New Roman" w:eastAsia="Times New Roman" w:hAnsi="Times New Roman" w:cs="Times New Roman"/>
+                <w:sz w:val="24"/>
+                <w:szCs w:val="24"/>
+              </w:rPr>
+              <w:t>id_evento</w:t>
+            </w:r>
+            <w:proofErr w:type="spellEnd"/>
+            <w:r>
+              <w:rPr>
+                <w:rFonts w:ascii="Times New Roman" w:eastAsia="Times New Roman" w:hAnsi="Times New Roman" w:cs="Times New Roman"/>
+                <w:sz w:val="24"/>
+                <w:szCs w:val="24"/>
+              </w:rPr>
+              <w:t xml:space="preserve"> e </w:t>
+            </w:r>
+            <w:proofErr w:type="spellStart"/>
+            <w:r>
+              <w:rPr>
+                <w:rFonts w:ascii="Times New Roman" w:eastAsia="Times New Roman" w:hAnsi="Times New Roman" w:cs="Times New Roman"/>
+                <w:sz w:val="24"/>
+                <w:szCs w:val="24"/>
+              </w:rPr>
+              <w:t>id_usuario</w:t>
+            </w:r>
+            <w:proofErr w:type="spellEnd"/>
+            <w:r>
+              <w:rPr>
+                <w:rFonts w:ascii="Times New Roman" w:eastAsia="Times New Roman" w:hAnsi="Times New Roman" w:cs="Times New Roman"/>
+                <w:sz w:val="24"/>
+                <w:szCs w:val="24"/>
+              </w:rPr>
+              <w:t xml:space="preserve"> como </w:t>
+            </w:r>
+            <w:proofErr w:type="spellStart"/>
+            <w:r>
+              <w:rPr>
+                <w:rFonts w:ascii="Times New Roman" w:eastAsia="Times New Roman" w:hAnsi="Times New Roman" w:cs="Times New Roman"/>
+                <w:sz w:val="24"/>
+                <w:szCs w:val="24"/>
+              </w:rPr>
+              <w:t>FKs</w:t>
+            </w:r>
+            <w:proofErr w:type="spellEnd"/>
+            <w:r>
+              <w:rPr>
+                <w:rFonts w:ascii="Times New Roman" w:eastAsia="Times New Roman" w:hAnsi="Times New Roman" w:cs="Times New Roman"/>
+                <w:sz w:val="24"/>
+                <w:szCs w:val="24"/>
+              </w:rPr>
+              <w:t>, ya que conforme los registros, estos corresponden a valores altos.</w:t>
             </w:r>
           </w:p>
         </w:tc>
@@ -2717,7 +3541,25 @@
                 <w:sz w:val="24"/>
                 <w:szCs w:val="24"/>
               </w:rPr>
-              <w:t>SERIAL para id_disponibilidad como PK, al ser un valor incremental único por cada registro.</w:t>
+              <w:t xml:space="preserve">SERIAL para </w:t>
+            </w:r>
+            <w:proofErr w:type="spellStart"/>
+            <w:r>
+              <w:rPr>
+                <w:rFonts w:ascii="Times New Roman" w:eastAsia="Times New Roman" w:hAnsi="Times New Roman" w:cs="Times New Roman"/>
+                <w:sz w:val="24"/>
+                <w:szCs w:val="24"/>
+              </w:rPr>
+              <w:t>id_disponibilidad</w:t>
+            </w:r>
+            <w:proofErr w:type="spellEnd"/>
+            <w:r>
+              <w:rPr>
+                <w:rFonts w:ascii="Times New Roman" w:eastAsia="Times New Roman" w:hAnsi="Times New Roman" w:cs="Times New Roman"/>
+                <w:sz w:val="24"/>
+                <w:szCs w:val="24"/>
+              </w:rPr>
+              <w:t xml:space="preserve"> como PK, al ser un valor incremental único por cada registro.</w:t>
             </w:r>
           </w:p>
           <w:p>
@@ -2767,7 +3609,79 @@
                 <w:sz w:val="24"/>
                 <w:szCs w:val="24"/>
               </w:rPr>
-              <w:t>TIME para establecer los atributos hora_inicio y hora_fin, con una restricción donde hora_fin debe mayor estricto que hora_inicio.</w:t>
+              <w:t xml:space="preserve">TIME para establecer los atributos </w:t>
+            </w:r>
+            <w:proofErr w:type="spellStart"/>
+            <w:r>
+              <w:rPr>
+                <w:rFonts w:ascii="Times New Roman" w:eastAsia="Times New Roman" w:hAnsi="Times New Roman" w:cs="Times New Roman"/>
+                <w:sz w:val="24"/>
+                <w:szCs w:val="24"/>
+              </w:rPr>
+              <w:t>hora_inicio</w:t>
+            </w:r>
+            <w:proofErr w:type="spellEnd"/>
+            <w:r>
+              <w:rPr>
+                <w:rFonts w:ascii="Times New Roman" w:eastAsia="Times New Roman" w:hAnsi="Times New Roman" w:cs="Times New Roman"/>
+                <w:sz w:val="24"/>
+                <w:szCs w:val="24"/>
+              </w:rPr>
+              <w:t xml:space="preserve"> y </w:t>
+            </w:r>
+            <w:proofErr w:type="spellStart"/>
+            <w:r>
+              <w:rPr>
+                <w:rFonts w:ascii="Times New Roman" w:eastAsia="Times New Roman" w:hAnsi="Times New Roman" w:cs="Times New Roman"/>
+                <w:sz w:val="24"/>
+                <w:szCs w:val="24"/>
+              </w:rPr>
+              <w:t>hora_fin</w:t>
+            </w:r>
+            <w:proofErr w:type="spellEnd"/>
+            <w:r>
+              <w:rPr>
+                <w:rFonts w:ascii="Times New Roman" w:eastAsia="Times New Roman" w:hAnsi="Times New Roman" w:cs="Times New Roman"/>
+                <w:sz w:val="24"/>
+                <w:szCs w:val="24"/>
+              </w:rPr>
+              <w:t xml:space="preserve">, con una restricción donde </w:t>
+            </w:r>
+            <w:proofErr w:type="spellStart"/>
+            <w:r>
+              <w:rPr>
+                <w:rFonts w:ascii="Times New Roman" w:eastAsia="Times New Roman" w:hAnsi="Times New Roman" w:cs="Times New Roman"/>
+                <w:sz w:val="24"/>
+                <w:szCs w:val="24"/>
+              </w:rPr>
+              <w:t>hora_fin</w:t>
+            </w:r>
+            <w:proofErr w:type="spellEnd"/>
+            <w:r>
+              <w:rPr>
+                <w:rFonts w:ascii="Times New Roman" w:eastAsia="Times New Roman" w:hAnsi="Times New Roman" w:cs="Times New Roman"/>
+                <w:sz w:val="24"/>
+                <w:szCs w:val="24"/>
+              </w:rPr>
+              <w:t xml:space="preserve"> debe mayor estricto que </w:t>
+            </w:r>
+            <w:proofErr w:type="spellStart"/>
+            <w:r>
+              <w:rPr>
+                <w:rFonts w:ascii="Times New Roman" w:eastAsia="Times New Roman" w:hAnsi="Times New Roman" w:cs="Times New Roman"/>
+                <w:sz w:val="24"/>
+                <w:szCs w:val="24"/>
+              </w:rPr>
+              <w:t>hora_inicio</w:t>
+            </w:r>
+            <w:proofErr w:type="spellEnd"/>
+            <w:r>
+              <w:rPr>
+                <w:rFonts w:ascii="Times New Roman" w:eastAsia="Times New Roman" w:hAnsi="Times New Roman" w:cs="Times New Roman"/>
+                <w:sz w:val="24"/>
+                <w:szCs w:val="24"/>
+              </w:rPr>
+              <w:t>.</w:t>
             </w:r>
           </w:p>
           <w:p>
@@ -2792,7 +3706,43 @@
                 <w:sz w:val="24"/>
                 <w:szCs w:val="24"/>
               </w:rPr>
-              <w:t>INT para las FK id_usuario y id_tipo que por la cantidad de registros pueden crecer a valores numéricos altos.</w:t>
+              <w:t xml:space="preserve">INT para las FK </w:t>
+            </w:r>
+            <w:proofErr w:type="spellStart"/>
+            <w:r>
+              <w:rPr>
+                <w:rFonts w:ascii="Times New Roman" w:eastAsia="Times New Roman" w:hAnsi="Times New Roman" w:cs="Times New Roman"/>
+                <w:sz w:val="24"/>
+                <w:szCs w:val="24"/>
+              </w:rPr>
+              <w:t>id_usuario</w:t>
+            </w:r>
+            <w:proofErr w:type="spellEnd"/>
+            <w:r>
+              <w:rPr>
+                <w:rFonts w:ascii="Times New Roman" w:eastAsia="Times New Roman" w:hAnsi="Times New Roman" w:cs="Times New Roman"/>
+                <w:sz w:val="24"/>
+                <w:szCs w:val="24"/>
+              </w:rPr>
+              <w:t xml:space="preserve"> y </w:t>
+            </w:r>
+            <w:proofErr w:type="spellStart"/>
+            <w:r>
+              <w:rPr>
+                <w:rFonts w:ascii="Times New Roman" w:eastAsia="Times New Roman" w:hAnsi="Times New Roman" w:cs="Times New Roman"/>
+                <w:sz w:val="24"/>
+                <w:szCs w:val="24"/>
+              </w:rPr>
+              <w:t>id_tipo</w:t>
+            </w:r>
+            <w:proofErr w:type="spellEnd"/>
+            <w:r>
+              <w:rPr>
+                <w:rFonts w:ascii="Times New Roman" w:eastAsia="Times New Roman" w:hAnsi="Times New Roman" w:cs="Times New Roman"/>
+                <w:sz w:val="24"/>
+                <w:szCs w:val="24"/>
+              </w:rPr>
+              <w:t xml:space="preserve"> que por la cantidad de registros pueden crecer a valores numéricos altos.</w:t>
             </w:r>
           </w:p>
         </w:tc>
@@ -2848,7 +3798,25 @@
                 <w:sz w:val="24"/>
                 <w:szCs w:val="24"/>
               </w:rPr>
-              <w:t>SERIAL para id_tipo, así se obtiene un valor incremental único por cada registro (PK).</w:t>
+              <w:t xml:space="preserve">SERIAL para </w:t>
+            </w:r>
+            <w:proofErr w:type="spellStart"/>
+            <w:r>
+              <w:rPr>
+                <w:rFonts w:ascii="Times New Roman" w:eastAsia="Times New Roman" w:hAnsi="Times New Roman" w:cs="Times New Roman"/>
+                <w:sz w:val="24"/>
+                <w:szCs w:val="24"/>
+              </w:rPr>
+              <w:t>id_tipo</w:t>
+            </w:r>
+            <w:proofErr w:type="spellEnd"/>
+            <w:r>
+              <w:rPr>
+                <w:rFonts w:ascii="Times New Roman" w:eastAsia="Times New Roman" w:hAnsi="Times New Roman" w:cs="Times New Roman"/>
+                <w:sz w:val="24"/>
+                <w:szCs w:val="24"/>
+              </w:rPr>
+              <w:t>, así se obtiene un valor incremental único por cada registro (PK).</w:t>
             </w:r>
           </w:p>
           <w:p>
@@ -2996,6 +3964,7 @@
                 <w:szCs w:val="24"/>
               </w:rPr>
             </w:pPr>
+            <w:proofErr w:type="spellStart"/>
             <w:r>
               <w:rPr>
                 <w:rFonts w:ascii="Times New Roman" w:eastAsia="Times New Roman" w:hAnsi="Times New Roman" w:cs="Times New Roman"/>
@@ -3004,6 +3973,7 @@
               </w:rPr>
               <w:t>vista_ranking_ubicaciones</w:t>
             </w:r>
+            <w:proofErr w:type="spellEnd"/>
           </w:p>
         </w:tc>
         <w:tc>
@@ -3049,6 +4019,7 @@
                 <w:szCs w:val="24"/>
               </w:rPr>
             </w:pPr>
+            <w:proofErr w:type="spellStart"/>
             <w:r>
               <w:rPr>
                 <w:rFonts w:ascii="Times New Roman" w:eastAsia="Times New Roman" w:hAnsi="Times New Roman" w:cs="Times New Roman"/>
@@ -3057,6 +4028,7 @@
               </w:rPr>
               <w:t>vista_eventos_simultaneos</w:t>
             </w:r>
+            <w:proofErr w:type="spellEnd"/>
           </w:p>
         </w:tc>
         <w:tc>
@@ -3099,6 +4071,7 @@
                 <w:szCs w:val="24"/>
               </w:rPr>
             </w:pPr>
+            <w:proofErr w:type="spellStart"/>
             <w:r>
               <w:rPr>
                 <w:rFonts w:ascii="Times New Roman" w:eastAsia="Times New Roman" w:hAnsi="Times New Roman" w:cs="Times New Roman"/>
@@ -3108,6 +4081,7 @@
               <w:lastRenderedPageBreak/>
               <w:t>vista_usuarios_ocupados</w:t>
             </w:r>
+            <w:proofErr w:type="spellEnd"/>
             <w:r>
               <w:rPr>
                 <w:rFonts w:ascii="Times New Roman" w:eastAsia="Times New Roman" w:hAnsi="Times New Roman" w:cs="Times New Roman"/>
@@ -3127,6 +4101,7 @@
                 <w:szCs w:val="24"/>
               </w:rPr>
             </w:pPr>
+            <w:proofErr w:type="spellStart"/>
             <w:r>
               <w:rPr>
                 <w:rFonts w:ascii="Times New Roman" w:eastAsia="Times New Roman" w:hAnsi="Times New Roman" w:cs="Times New Roman"/>
@@ -3135,6 +4110,7 @@
               </w:rPr>
               <w:t>vista_franjas_disponibles</w:t>
             </w:r>
+            <w:proofErr w:type="spellEnd"/>
           </w:p>
         </w:tc>
         <w:tc>
@@ -3195,7 +4171,25 @@
                 <w:sz w:val="24"/>
                 <w:szCs w:val="24"/>
               </w:rPr>
-              <w:t>La segunda vista además, selecciona al usuario más un rango de horario y mediante JOIN a DISPONIBILIDADES y TIPOS_DISPONIBILIDAD, Filtrara por los que tengan estado Disponible en ese rango para consultar si es posible añadirlos a un evento en ese horario.</w:t>
+              <w:t xml:space="preserve">La segunda </w:t>
+            </w:r>
+            <w:proofErr w:type="gramStart"/>
+            <w:r>
+              <w:rPr>
+                <w:rFonts w:ascii="Times New Roman" w:eastAsia="Times New Roman" w:hAnsi="Times New Roman" w:cs="Times New Roman"/>
+                <w:sz w:val="24"/>
+                <w:szCs w:val="24"/>
+              </w:rPr>
+              <w:t>vista</w:t>
+            </w:r>
+            <w:proofErr w:type="gramEnd"/>
+            <w:r>
+              <w:rPr>
+                <w:rFonts w:ascii="Times New Roman" w:eastAsia="Times New Roman" w:hAnsi="Times New Roman" w:cs="Times New Roman"/>
+                <w:sz w:val="24"/>
+                <w:szCs w:val="24"/>
+              </w:rPr>
+              <w:t xml:space="preserve"> además, selecciona al usuario más un rango de horario y mediante JOIN a DISPONIBILIDADES y TIPOS_DISPONIBILIDAD, Filtrara por los que tengan estado Disponible en ese rango para consultar si es posible añadirlos a un evento en ese horario.</w:t>
             </w:r>
           </w:p>
         </w:tc>
@@ -3215,6 +4209,7 @@
                 <w:szCs w:val="24"/>
               </w:rPr>
             </w:pPr>
+            <w:proofErr w:type="spellStart"/>
             <w:r>
               <w:rPr>
                 <w:rFonts w:ascii="Times New Roman" w:eastAsia="Times New Roman" w:hAnsi="Times New Roman" w:cs="Times New Roman"/>
@@ -3223,6 +4218,7 @@
               </w:rPr>
               <w:t>vista_tareas_pendientes_usuario</w:t>
             </w:r>
+            <w:proofErr w:type="spellEnd"/>
             <w:r>
               <w:rPr>
                 <w:rFonts w:ascii="Times New Roman" w:eastAsia="Times New Roman" w:hAnsi="Times New Roman" w:cs="Times New Roman"/>
@@ -3242,6 +4238,7 @@
                 <w:szCs w:val="24"/>
               </w:rPr>
             </w:pPr>
+            <w:proofErr w:type="spellStart"/>
             <w:r>
               <w:rPr>
                 <w:rFonts w:ascii="Times New Roman" w:eastAsia="Times New Roman" w:hAnsi="Times New Roman" w:cs="Times New Roman"/>
@@ -3250,6 +4247,7 @@
               </w:rPr>
               <w:t>vista_eventos_tareas_vencidas</w:t>
             </w:r>
+            <w:proofErr w:type="spellEnd"/>
           </w:p>
         </w:tc>
         <w:tc>
@@ -3291,7 +4289,25 @@
                 <w:sz w:val="24"/>
                 <w:szCs w:val="24"/>
               </w:rPr>
-              <w:t>La segunda vista complementa al consultas desde eventos y con JOIN a TAREAS, donde la fecha_limite es menor que la fecha actual, en otras palabras, la tarea está vencida y las ordena por plazo. Ambas cumplen el RF-16.</w:t>
+              <w:t xml:space="preserve">La segunda vista complementa al consultas desde eventos y con JOIN a TAREAS, donde la </w:t>
+            </w:r>
+            <w:proofErr w:type="spellStart"/>
+            <w:r>
+              <w:rPr>
+                <w:rFonts w:ascii="Times New Roman" w:eastAsia="Times New Roman" w:hAnsi="Times New Roman" w:cs="Times New Roman"/>
+                <w:sz w:val="24"/>
+                <w:szCs w:val="24"/>
+              </w:rPr>
+              <w:t>fecha_limite</w:t>
+            </w:r>
+            <w:proofErr w:type="spellEnd"/>
+            <w:r>
+              <w:rPr>
+                <w:rFonts w:ascii="Times New Roman" w:eastAsia="Times New Roman" w:hAnsi="Times New Roman" w:cs="Times New Roman"/>
+                <w:sz w:val="24"/>
+                <w:szCs w:val="24"/>
+              </w:rPr>
+              <w:t xml:space="preserve"> es menor que la fecha actual, en otras palabras, la tarea está vencida y las ordena por plazo. Ambas cumplen el RF-16.</w:t>
             </w:r>
           </w:p>
         </w:tc>
@@ -3311,6 +4327,7 @@
                 <w:szCs w:val="24"/>
               </w:rPr>
             </w:pPr>
+            <w:proofErr w:type="spellStart"/>
             <w:r>
               <w:rPr>
                 <w:rFonts w:ascii="Times New Roman" w:eastAsia="Times New Roman" w:hAnsi="Times New Roman" w:cs="Times New Roman"/>
@@ -3319,6 +4336,7 @@
               </w:rPr>
               <w:t>vista_carga_trabajo_usuario</w:t>
             </w:r>
+            <w:proofErr w:type="spellEnd"/>
           </w:p>
         </w:tc>
         <w:tc>
@@ -3457,7 +4475,7 @@
                     <pic:cNvPicPr/>
                   </pic:nvPicPr>
                   <pic:blipFill>
-                    <a:blip r:embed="rId11"/>
+                    <a:blip r:embed="rId12"/>
                     <a:stretch>
                       <a:fillRect/>
                     </a:stretch>
@@ -3495,7 +4513,7 @@
           <w:sz w:val="24"/>
           <w:szCs w:val="24"/>
         </w:rPr>
-        <w:t>Detalles a mencionar</w:t>
+        <w:t>Es el apartado en el cual se gestionan las ubicaciones registradas en el sistema con sus reportes y descripciones:</w:t>
       </w:r>
     </w:p>
     <w:p>
@@ -3519,7 +4537,25 @@
           <w:sz w:val="24"/>
           <w:szCs w:val="24"/>
         </w:rPr>
-        <w:t>Vista de Ranking</w:t>
+        <w:t>Tabla Central (</w:t>
+      </w:r>
+      <w:proofErr w:type="spellStart"/>
+      <w:r>
+        <w:rPr>
+          <w:rFonts w:ascii="Times New Roman" w:eastAsia="Times New Roman" w:hAnsi="Times New Roman" w:cs="Times New Roman"/>
+          <w:sz w:val="24"/>
+          <w:szCs w:val="24"/>
+        </w:rPr>
+        <w:t>Grid</w:t>
+      </w:r>
+      <w:proofErr w:type="spellEnd"/>
+      <w:r>
+        <w:rPr>
+          <w:rFonts w:ascii="Times New Roman" w:eastAsia="Times New Roman" w:hAnsi="Times New Roman" w:cs="Times New Roman"/>
+          <w:sz w:val="24"/>
+          <w:szCs w:val="24"/>
+        </w:rPr>
+        <w:t>): Muestra el listado de las ubicaciones con sus respectivas columnas: ID, Nombre, Dirección, Ciudad y Capacidad.</w:t>
       </w:r>
     </w:p>
     <w:p>
@@ -3543,15 +4579,219 @@
           <w:sz w:val="24"/>
           <w:szCs w:val="24"/>
         </w:rPr>
-        <w:t>Vista de Eventos en ubicaciones Simultaneas</w:t>
-      </w:r>
-    </w:p>
-    <w:p>
-      <w:pPr>
+        <w:t>Panel Lateral Derecho (Formulario): Cuenta con el apartado para ingresar una ubicación a partir de su Nombre, Dirección, Ciudad y Capacidad. Así mismo se permite modificar información de una selección, eliminarlo o limpiar el formulario.</w:t>
+      </w:r>
+    </w:p>
+    <w:p>
+      <w:pPr>
+        <w:pStyle w:val="Prrafodelista"/>
+        <w:numPr>
+          <w:ilvl w:val="0"/>
+          <w:numId w:val="26"/>
+        </w:numPr>
         <w:spacing w:line="360" w:lineRule="auto"/>
         <w:jc w:val="both"/>
         <w:rPr>
           <w:rFonts w:ascii="Times New Roman" w:eastAsia="Times New Roman" w:hAnsi="Times New Roman" w:cs="Times New Roman"/>
+          <w:sz w:val="24"/>
+          <w:szCs w:val="24"/>
+        </w:rPr>
+      </w:pPr>
+      <w:r>
+        <w:rPr>
+          <w:rFonts w:ascii="Times New Roman" w:eastAsia="Times New Roman" w:hAnsi="Times New Roman" w:cs="Times New Roman"/>
+          <w:sz w:val="24"/>
+          <w:szCs w:val="24"/>
+        </w:rPr>
+        <w:t>Vista de Ranking</w:t>
+      </w:r>
+      <w:r>
+        <w:rPr>
+          <w:rFonts w:ascii="Times New Roman" w:eastAsia="Times New Roman" w:hAnsi="Times New Roman" w:cs="Times New Roman"/>
+          <w:sz w:val="24"/>
+          <w:szCs w:val="24"/>
+        </w:rPr>
+        <w:t>: Cambia la tabla central por un reporte que contiene en la primera columna el nombre de cada ubicación registrada, y en la segunda el total de eventos que han realizado ahí, ordenados de mayor a menor.</w:t>
+      </w:r>
+    </w:p>
+    <w:p>
+      <w:pPr>
+        <w:pStyle w:val="Prrafodelista"/>
+        <w:numPr>
+          <w:ilvl w:val="0"/>
+          <w:numId w:val="26"/>
+        </w:numPr>
+        <w:spacing w:line="360" w:lineRule="auto"/>
+        <w:jc w:val="both"/>
+        <w:rPr>
+          <w:rFonts w:ascii="Times New Roman" w:eastAsia="Times New Roman" w:hAnsi="Times New Roman" w:cs="Times New Roman"/>
+          <w:sz w:val="24"/>
+          <w:szCs w:val="24"/>
+        </w:rPr>
+      </w:pPr>
+      <w:r>
+        <w:rPr>
+          <w:rFonts w:ascii="Times New Roman" w:eastAsia="Times New Roman" w:hAnsi="Times New Roman" w:cs="Times New Roman"/>
+          <w:sz w:val="24"/>
+          <w:szCs w:val="24"/>
+        </w:rPr>
+        <w:t>Vista de Eventos en ubicaciones Simultaneas</w:t>
+      </w:r>
+      <w:r>
+        <w:rPr>
+          <w:rFonts w:ascii="Times New Roman" w:eastAsia="Times New Roman" w:hAnsi="Times New Roman" w:cs="Times New Roman"/>
+          <w:sz w:val="24"/>
+          <w:szCs w:val="24"/>
+        </w:rPr>
+        <w:t>: Cambia la tabla central por un reporte donde se aprecian eventos que se realizan en la misma ubicación, pero que sus horarios chocan entre sí.</w:t>
+      </w:r>
+    </w:p>
+    <w:p>
+      <w:pPr>
+        <w:spacing w:line="360" w:lineRule="auto"/>
+        <w:jc w:val="both"/>
+        <w:rPr>
+          <w:rFonts w:ascii="Times New Roman" w:eastAsia="Times New Roman" w:hAnsi="Times New Roman" w:cs="Times New Roman"/>
+          <w:sz w:val="24"/>
+          <w:szCs w:val="24"/>
+        </w:rPr>
+      </w:pPr>
+      <w:r>
+        <w:rPr>
+          <w:rFonts w:ascii="Times New Roman" w:eastAsia="Times New Roman" w:hAnsi="Times New Roman" w:cs="Times New Roman"/>
+          <w:sz w:val="24"/>
+          <w:szCs w:val="24"/>
+        </w:rPr>
+        <w:lastRenderedPageBreak/>
+        <w:t>Pantalla Ubicaciones-Ranking</w:t>
+      </w:r>
+    </w:p>
+    <w:p>
+      <w:pPr>
+        <w:spacing w:line="360" w:lineRule="auto"/>
+        <w:jc w:val="center"/>
+        <w:rPr>
+          <w:rFonts w:ascii="Times New Roman" w:eastAsia="Times New Roman" w:hAnsi="Times New Roman" w:cs="Times New Roman"/>
+          <w:sz w:val="24"/>
+          <w:szCs w:val="24"/>
+        </w:rPr>
+      </w:pPr>
+      <w:r>
+        <w:rPr>
+          <w:noProof/>
+        </w:rPr>
+        <w:drawing>
+          <wp:inline distT="0" distB="0" distL="0" distR="0" wp14:anchorId="37C854F6" wp14:editId="15F49596">
+            <wp:extent cx="5583144" cy="3619500"/>
+            <wp:effectExtent l="0" t="0" r="0" b="0"/>
+            <wp:docPr id="15380329" name="Imagen 1"/>
+            <wp:cNvGraphicFramePr>
+              <a:graphicFrameLocks xmlns:a="http://schemas.openxmlformats.org/drawingml/2006/main" noChangeAspect="1"/>
+            </wp:cNvGraphicFramePr>
+            <a:graphic xmlns:a="http://schemas.openxmlformats.org/drawingml/2006/main">
+              <a:graphicData uri="http://schemas.openxmlformats.org/drawingml/2006/picture">
+                <pic:pic xmlns:pic="http://schemas.openxmlformats.org/drawingml/2006/picture">
+                  <pic:nvPicPr>
+                    <pic:cNvPr id="15380329" name=""/>
+                    <pic:cNvPicPr/>
+                  </pic:nvPicPr>
+                  <pic:blipFill>
+                    <a:blip r:embed="rId13"/>
+                    <a:stretch>
+                      <a:fillRect/>
+                    </a:stretch>
+                  </pic:blipFill>
+                  <pic:spPr>
+                    <a:xfrm>
+                      <a:off x="0" y="0"/>
+                      <a:ext cx="5595747" cy="3627670"/>
+                    </a:xfrm>
+                    <a:prstGeom prst="rect">
+                      <a:avLst/>
+                    </a:prstGeom>
+                  </pic:spPr>
+                </pic:pic>
+              </a:graphicData>
+            </a:graphic>
+          </wp:inline>
+        </w:drawing>
+      </w:r>
+    </w:p>
+    <w:p>
+      <w:pPr>
+        <w:spacing w:line="360" w:lineRule="auto"/>
+        <w:jc w:val="both"/>
+        <w:rPr>
+          <w:rFonts w:ascii="Times New Roman" w:eastAsia="Times New Roman" w:hAnsi="Times New Roman" w:cs="Times New Roman"/>
+          <w:sz w:val="24"/>
+          <w:szCs w:val="24"/>
+        </w:rPr>
+      </w:pPr>
+      <w:r>
+        <w:rPr>
+          <w:rFonts w:ascii="Times New Roman" w:eastAsia="Times New Roman" w:hAnsi="Times New Roman" w:cs="Times New Roman"/>
+          <w:sz w:val="24"/>
+          <w:szCs w:val="24"/>
+        </w:rPr>
+        <w:t>Pantalla Ubicaciones-Simultaneas</w:t>
+      </w:r>
+    </w:p>
+    <w:p>
+      <w:pPr>
+        <w:spacing w:line="360" w:lineRule="auto"/>
+        <w:jc w:val="center"/>
+        <w:rPr>
+          <w:rFonts w:ascii="Times New Roman" w:eastAsia="Times New Roman" w:hAnsi="Times New Roman" w:cs="Times New Roman"/>
+          <w:sz w:val="24"/>
+          <w:szCs w:val="24"/>
+        </w:rPr>
+      </w:pPr>
+      <w:r>
+        <w:rPr>
+          <w:noProof/>
+        </w:rPr>
+        <w:drawing>
+          <wp:inline distT="0" distB="0" distL="0" distR="0" wp14:anchorId="708BF2A7" wp14:editId="30B3F458">
+            <wp:extent cx="5630160" cy="3649980"/>
+            <wp:effectExtent l="0" t="0" r="8890" b="7620"/>
+            <wp:docPr id="1958502472" name="Imagen 1"/>
+            <wp:cNvGraphicFramePr>
+              <a:graphicFrameLocks xmlns:a="http://schemas.openxmlformats.org/drawingml/2006/main" noChangeAspect="1"/>
+            </wp:cNvGraphicFramePr>
+            <a:graphic xmlns:a="http://schemas.openxmlformats.org/drawingml/2006/main">
+              <a:graphicData uri="http://schemas.openxmlformats.org/drawingml/2006/picture">
+                <pic:pic xmlns:pic="http://schemas.openxmlformats.org/drawingml/2006/picture">
+                  <pic:nvPicPr>
+                    <pic:cNvPr id="1958502472" name=""/>
+                    <pic:cNvPicPr/>
+                  </pic:nvPicPr>
+                  <pic:blipFill>
+                    <a:blip r:embed="rId14"/>
+                    <a:stretch>
+                      <a:fillRect/>
+                    </a:stretch>
+                  </pic:blipFill>
+                  <pic:spPr>
+                    <a:xfrm>
+                      <a:off x="0" y="0"/>
+                      <a:ext cx="5642777" cy="3658159"/>
+                    </a:xfrm>
+                    <a:prstGeom prst="rect">
+                      <a:avLst/>
+                    </a:prstGeom>
+                  </pic:spPr>
+                </pic:pic>
+              </a:graphicData>
+            </a:graphic>
+          </wp:inline>
+        </w:drawing>
+      </w:r>
+    </w:p>
+    <w:p>
+      <w:pPr>
+        <w:spacing w:line="360" w:lineRule="auto"/>
+        <w:rPr>
+          <w:rFonts w:ascii="Times New Roman" w:eastAsia="Times New Roman" w:hAnsi="Times New Roman" w:cs="Times New Roman"/>
           <w:b/>
           <w:bCs/>
           <w:sz w:val="24"/>
@@ -3566,7 +4806,335 @@
           <w:sz w:val="24"/>
           <w:szCs w:val="24"/>
         </w:rPr>
-        <w:t>Pantalla de Gestión de Tareas</w:t>
+        <w:lastRenderedPageBreak/>
+        <w:t>Código de carga de la entidad tareas y las vistas a la interfaz</w:t>
+      </w:r>
+    </w:p>
+    <w:p>
+      <w:pPr>
+        <w:spacing w:line="360" w:lineRule="auto"/>
+        <w:rPr>
+          <w:rFonts w:ascii="Times New Roman" w:eastAsia="Times New Roman" w:hAnsi="Times New Roman" w:cs="Times New Roman"/>
+          <w:sz w:val="24"/>
+          <w:szCs w:val="24"/>
+        </w:rPr>
+      </w:pPr>
+      <w:r>
+        <w:rPr>
+          <w:noProof/>
+        </w:rPr>
+        <w:drawing>
+          <wp:inline distT="0" distB="0" distL="0" distR="0" wp14:anchorId="0FE57997" wp14:editId="39AA542F">
+            <wp:extent cx="5943600" cy="3785235"/>
+            <wp:effectExtent l="0" t="0" r="0" b="5715"/>
+            <wp:docPr id="634039375" name="Imagen 1"/>
+            <wp:cNvGraphicFramePr>
+              <a:graphicFrameLocks xmlns:a="http://schemas.openxmlformats.org/drawingml/2006/main" noChangeAspect="1"/>
+            </wp:cNvGraphicFramePr>
+            <a:graphic xmlns:a="http://schemas.openxmlformats.org/drawingml/2006/main">
+              <a:graphicData uri="http://schemas.openxmlformats.org/drawingml/2006/picture">
+                <pic:pic xmlns:pic="http://schemas.openxmlformats.org/drawingml/2006/picture">
+                  <pic:nvPicPr>
+                    <pic:cNvPr id="634039375" name=""/>
+                    <pic:cNvPicPr/>
+                  </pic:nvPicPr>
+                  <pic:blipFill>
+                    <a:blip r:embed="rId15"/>
+                    <a:stretch>
+                      <a:fillRect/>
+                    </a:stretch>
+                  </pic:blipFill>
+                  <pic:spPr>
+                    <a:xfrm>
+                      <a:off x="0" y="0"/>
+                      <a:ext cx="5943600" cy="3785235"/>
+                    </a:xfrm>
+                    <a:prstGeom prst="rect">
+                      <a:avLst/>
+                    </a:prstGeom>
+                  </pic:spPr>
+                </pic:pic>
+              </a:graphicData>
+            </a:graphic>
+          </wp:inline>
+        </w:drawing>
+      </w:r>
+    </w:p>
+    <w:p>
+      <w:pPr>
+        <w:ind w:firstLine="720"/>
+        <w:jc w:val="both"/>
+        <w:rPr>
+          <w:rFonts w:ascii="Times New Roman" w:eastAsia="Times New Roman" w:hAnsi="Times New Roman" w:cs="Times New Roman"/>
+          <w:sz w:val="24"/>
+          <w:szCs w:val="24"/>
+        </w:rPr>
+      </w:pPr>
+      <w:r>
+        <w:rPr>
+          <w:rFonts w:ascii="Times New Roman" w:eastAsia="Times New Roman" w:hAnsi="Times New Roman" w:cs="Times New Roman"/>
+          <w:sz w:val="24"/>
+          <w:szCs w:val="24"/>
+        </w:rPr>
+        <w:t>Las funciones</w:t>
+      </w:r>
+      <w:r>
+        <w:rPr>
+          <w:rFonts w:ascii="Times New Roman" w:eastAsia="Times New Roman" w:hAnsi="Times New Roman" w:cs="Times New Roman"/>
+          <w:sz w:val="24"/>
+          <w:szCs w:val="24"/>
+        </w:rPr>
+        <w:t xml:space="preserve"> creadas para hacer llamadas de la entidad ubicaciones a la interfaz creadas en Python fueron diseñadas bajo la misma estructura de las funciones de la tabla eventos, realizando modificaciones en la inserción de datos por el tipo de datos que se insertaba a la interfaz.</w:t>
+      </w:r>
+    </w:p>
+    <w:p>
+      <w:pPr>
+        <w:ind w:firstLine="720"/>
+        <w:jc w:val="both"/>
+        <w:rPr>
+          <w:rFonts w:ascii="Times New Roman" w:eastAsia="Times New Roman" w:hAnsi="Times New Roman" w:cs="Times New Roman"/>
+          <w:sz w:val="24"/>
+          <w:szCs w:val="24"/>
+        </w:rPr>
+      </w:pPr>
+      <w:r>
+        <w:rPr>
+          <w:rFonts w:ascii="Times New Roman" w:eastAsia="Times New Roman" w:hAnsi="Times New Roman" w:cs="Times New Roman"/>
+          <w:sz w:val="24"/>
+          <w:szCs w:val="24"/>
+        </w:rPr>
+        <w:t xml:space="preserve">Dichas estructuras fueron aplicadas de igual manera con las </w:t>
+      </w:r>
+      <w:r>
+        <w:rPr>
+          <w:rFonts w:ascii="Times New Roman" w:eastAsia="Times New Roman" w:hAnsi="Times New Roman" w:cs="Times New Roman"/>
+          <w:sz w:val="24"/>
+          <w:szCs w:val="24"/>
+        </w:rPr>
+        <w:t>siguientes funciones:</w:t>
+      </w:r>
+    </w:p>
+    <w:p>
+      <w:pPr>
+        <w:pStyle w:val="Prrafodelista"/>
+        <w:numPr>
+          <w:ilvl w:val="0"/>
+          <w:numId w:val="26"/>
+        </w:numPr>
+        <w:jc w:val="both"/>
+        <w:rPr>
+          <w:rFonts w:ascii="Times New Roman" w:eastAsia="Times New Roman" w:hAnsi="Times New Roman" w:cs="Times New Roman"/>
+          <w:sz w:val="24"/>
+          <w:szCs w:val="24"/>
+        </w:rPr>
+      </w:pPr>
+      <w:r>
+        <w:rPr>
+          <w:rFonts w:ascii="Times New Roman" w:eastAsia="Times New Roman" w:hAnsi="Times New Roman" w:cs="Times New Roman"/>
+          <w:sz w:val="24"/>
+          <w:szCs w:val="24"/>
+        </w:rPr>
+        <w:t>configurar_pestana_ubicaciones</w:t>
+      </w:r>
+    </w:p>
+    <w:p>
+      <w:pPr>
+        <w:pStyle w:val="Prrafodelista"/>
+        <w:numPr>
+          <w:ilvl w:val="0"/>
+          <w:numId w:val="26"/>
+        </w:numPr>
+        <w:jc w:val="both"/>
+        <w:rPr>
+          <w:rFonts w:ascii="Times New Roman" w:eastAsia="Times New Roman" w:hAnsi="Times New Roman" w:cs="Times New Roman"/>
+          <w:sz w:val="24"/>
+          <w:szCs w:val="24"/>
+        </w:rPr>
+      </w:pPr>
+      <w:proofErr w:type="spellStart"/>
+      <w:r>
+        <w:rPr>
+          <w:rFonts w:ascii="Times New Roman" w:eastAsia="Times New Roman" w:hAnsi="Times New Roman" w:cs="Times New Roman"/>
+          <w:sz w:val="24"/>
+          <w:szCs w:val="24"/>
+        </w:rPr>
+        <w:t>ubicacion_seleccionada_id</w:t>
+      </w:r>
+      <w:proofErr w:type="spellEnd"/>
+    </w:p>
+    <w:p>
+      <w:pPr>
+        <w:pStyle w:val="Prrafodelista"/>
+        <w:numPr>
+          <w:ilvl w:val="0"/>
+          <w:numId w:val="26"/>
+        </w:numPr>
+        <w:jc w:val="both"/>
+        <w:rPr>
+          <w:rFonts w:ascii="Times New Roman" w:eastAsia="Times New Roman" w:hAnsi="Times New Roman" w:cs="Times New Roman"/>
+          <w:sz w:val="24"/>
+          <w:szCs w:val="24"/>
+        </w:rPr>
+      </w:pPr>
+      <w:r>
+        <w:rPr>
+          <w:rFonts w:ascii="Times New Roman" w:eastAsia="Times New Roman" w:hAnsi="Times New Roman" w:cs="Times New Roman"/>
+          <w:sz w:val="24"/>
+          <w:szCs w:val="24"/>
+        </w:rPr>
+        <w:t>cargar_ubicacion_seleccionada</w:t>
+      </w:r>
+    </w:p>
+    <w:p>
+      <w:pPr>
+        <w:pStyle w:val="Prrafodelista"/>
+        <w:numPr>
+          <w:ilvl w:val="0"/>
+          <w:numId w:val="26"/>
+        </w:numPr>
+        <w:jc w:val="both"/>
+        <w:rPr>
+          <w:rFonts w:ascii="Times New Roman" w:eastAsia="Times New Roman" w:hAnsi="Times New Roman" w:cs="Times New Roman"/>
+          <w:sz w:val="24"/>
+          <w:szCs w:val="24"/>
+        </w:rPr>
+      </w:pPr>
+      <w:proofErr w:type="spellStart"/>
+      <w:r>
+        <w:rPr>
+          <w:rFonts w:ascii="Times New Roman" w:eastAsia="Times New Roman" w:hAnsi="Times New Roman" w:cs="Times New Roman"/>
+          <w:sz w:val="24"/>
+          <w:szCs w:val="24"/>
+        </w:rPr>
+        <w:t>limpiar_form_ubicacion</w:t>
+      </w:r>
+      <w:proofErr w:type="spellEnd"/>
+    </w:p>
+    <w:p>
+      <w:pPr>
+        <w:pStyle w:val="Prrafodelista"/>
+        <w:numPr>
+          <w:ilvl w:val="0"/>
+          <w:numId w:val="26"/>
+        </w:numPr>
+        <w:jc w:val="both"/>
+        <w:rPr>
+          <w:rFonts w:ascii="Times New Roman" w:eastAsia="Times New Roman" w:hAnsi="Times New Roman" w:cs="Times New Roman"/>
+          <w:sz w:val="24"/>
+          <w:szCs w:val="24"/>
+        </w:rPr>
+      </w:pPr>
+      <w:proofErr w:type="spellStart"/>
+      <w:r>
+        <w:rPr>
+          <w:rFonts w:ascii="Times New Roman" w:eastAsia="Times New Roman" w:hAnsi="Times New Roman" w:cs="Times New Roman"/>
+          <w:sz w:val="24"/>
+          <w:szCs w:val="24"/>
+        </w:rPr>
+        <w:t>datos_ubicacion_formulario</w:t>
+      </w:r>
+      <w:proofErr w:type="spellEnd"/>
+    </w:p>
+    <w:p>
+      <w:pPr>
+        <w:pStyle w:val="Prrafodelista"/>
+        <w:numPr>
+          <w:ilvl w:val="0"/>
+          <w:numId w:val="26"/>
+        </w:numPr>
+        <w:jc w:val="both"/>
+        <w:rPr>
+          <w:rFonts w:ascii="Times New Roman" w:eastAsia="Times New Roman" w:hAnsi="Times New Roman" w:cs="Times New Roman"/>
+          <w:sz w:val="24"/>
+          <w:szCs w:val="24"/>
+        </w:rPr>
+      </w:pPr>
+      <w:proofErr w:type="spellStart"/>
+      <w:r>
+        <w:rPr>
+          <w:rFonts w:ascii="Times New Roman" w:eastAsia="Times New Roman" w:hAnsi="Times New Roman" w:cs="Times New Roman"/>
+          <w:sz w:val="24"/>
+          <w:szCs w:val="24"/>
+        </w:rPr>
+        <w:t>agregar_ubicacion</w:t>
+      </w:r>
+      <w:proofErr w:type="spellEnd"/>
+    </w:p>
+    <w:p>
+      <w:pPr>
+        <w:pStyle w:val="Prrafodelista"/>
+        <w:numPr>
+          <w:ilvl w:val="0"/>
+          <w:numId w:val="26"/>
+        </w:numPr>
+        <w:jc w:val="both"/>
+        <w:rPr>
+          <w:rFonts w:ascii="Times New Roman" w:eastAsia="Times New Roman" w:hAnsi="Times New Roman" w:cs="Times New Roman"/>
+          <w:sz w:val="24"/>
+          <w:szCs w:val="24"/>
+        </w:rPr>
+      </w:pPr>
+      <w:proofErr w:type="spellStart"/>
+      <w:r>
+        <w:rPr>
+          <w:rFonts w:ascii="Times New Roman" w:eastAsia="Times New Roman" w:hAnsi="Times New Roman" w:cs="Times New Roman"/>
+          <w:sz w:val="24"/>
+          <w:szCs w:val="24"/>
+        </w:rPr>
+        <w:t>actualizar_ubicacion</w:t>
+      </w:r>
+      <w:proofErr w:type="spellEnd"/>
+    </w:p>
+    <w:p>
+      <w:pPr>
+        <w:pStyle w:val="Prrafodelista"/>
+        <w:numPr>
+          <w:ilvl w:val="0"/>
+          <w:numId w:val="26"/>
+        </w:numPr>
+        <w:jc w:val="both"/>
+        <w:rPr>
+          <w:rFonts w:ascii="Times New Roman" w:eastAsia="Times New Roman" w:hAnsi="Times New Roman" w:cs="Times New Roman"/>
+          <w:sz w:val="24"/>
+          <w:szCs w:val="24"/>
+        </w:rPr>
+      </w:pPr>
+      <w:proofErr w:type="spellStart"/>
+      <w:r>
+        <w:rPr>
+          <w:rFonts w:ascii="Times New Roman" w:eastAsia="Times New Roman" w:hAnsi="Times New Roman" w:cs="Times New Roman"/>
+          <w:sz w:val="24"/>
+          <w:szCs w:val="24"/>
+        </w:rPr>
+        <w:t>eliminar_ubicacion</w:t>
+      </w:r>
+      <w:proofErr w:type="spellEnd"/>
+    </w:p>
+    <w:p>
+      <w:pPr>
+        <w:ind w:firstLine="720"/>
+        <w:jc w:val="both"/>
+        <w:rPr>
+          <w:rFonts w:ascii="Times New Roman" w:eastAsia="Times New Roman" w:hAnsi="Times New Roman" w:cs="Times New Roman"/>
+          <w:sz w:val="24"/>
+          <w:szCs w:val="24"/>
+        </w:rPr>
+      </w:pPr>
+      <w:r>
+        <w:rPr>
+          <w:rFonts w:ascii="Times New Roman" w:eastAsia="Times New Roman" w:hAnsi="Times New Roman" w:cs="Times New Roman"/>
+          <w:sz w:val="24"/>
+          <w:szCs w:val="24"/>
+        </w:rPr>
+        <w:t>Estas funciones fueron creadas bajo la estructura ya existente para eventos.</w:t>
+      </w:r>
+      <w:r>
+        <w:rPr>
+          <w:rFonts w:ascii="Times New Roman" w:eastAsia="Times New Roman" w:hAnsi="Times New Roman" w:cs="Times New Roman"/>
+          <w:sz w:val="24"/>
+          <w:szCs w:val="24"/>
+        </w:rPr>
+        <w:br w:type="page"/>
       </w:r>
     </w:p>
     <w:p>
@@ -3575,6 +5143,30 @@
         <w:jc w:val="both"/>
         <w:rPr>
           <w:rFonts w:ascii="Times New Roman" w:eastAsia="Times New Roman" w:hAnsi="Times New Roman" w:cs="Times New Roman"/>
+          <w:b/>
+          <w:bCs/>
+          <w:sz w:val="24"/>
+          <w:szCs w:val="24"/>
+        </w:rPr>
+      </w:pPr>
+      <w:r>
+        <w:rPr>
+          <w:rFonts w:ascii="Times New Roman" w:eastAsia="Times New Roman" w:hAnsi="Times New Roman" w:cs="Times New Roman"/>
+          <w:b/>
+          <w:bCs/>
+          <w:sz w:val="24"/>
+          <w:szCs w:val="24"/>
+        </w:rPr>
+        <w:lastRenderedPageBreak/>
+        <w:t>Pantalla de Gestión de Tareas</w:t>
+      </w:r>
+    </w:p>
+    <w:p>
+      <w:pPr>
+        <w:spacing w:line="360" w:lineRule="auto"/>
+        <w:jc w:val="both"/>
+        <w:rPr>
+          <w:rFonts w:ascii="Times New Roman" w:eastAsia="Times New Roman" w:hAnsi="Times New Roman" w:cs="Times New Roman"/>
           <w:sz w:val="24"/>
           <w:szCs w:val="24"/>
         </w:rPr>
@@ -3583,7 +5175,6 @@
         <w:rPr>
           <w:noProof/>
         </w:rPr>
-        <w:lastRenderedPageBreak/>
         <w:drawing>
           <wp:inline distT="0" distB="0" distL="0" distR="0" wp14:anchorId="51679A6B" wp14:editId="6668CC52">
             <wp:extent cx="5943600" cy="3661410"/>
@@ -3600,7 +5191,7 @@
                     <pic:cNvPicPr/>
                   </pic:nvPicPr>
                   <pic:blipFill>
-                    <a:blip r:embed="rId12"/>
+                    <a:blip r:embed="rId16"/>
                     <a:stretch>
                       <a:fillRect/>
                     </a:stretch>
@@ -3638,7 +5229,7 @@
           <w:sz w:val="24"/>
           <w:szCs w:val="24"/>
         </w:rPr>
-        <w:t>Detalles a mencionar</w:t>
+        <w:t>Está área funciona área funciona para administrar las tareas creadas y asignadas a usuarios en determinados eventos. Cuenta con las siguientes componentes:</w:t>
       </w:r>
     </w:p>
     <w:p>
@@ -3662,7 +5253,7 @@
           <w:sz w:val="24"/>
           <w:szCs w:val="24"/>
         </w:rPr>
-        <w:t>Vista de Carga de Trabajo</w:t>
+        <w:t>Tabla Central: Se ubica la información general de las tareas registradas en la base de datos con sus columnas respectivas: ID, Título, Evento, Responsable, Prioridad, Estado y la Fecha Límite a realizarla.</w:t>
       </w:r>
     </w:p>
     <w:p>
@@ -3686,22 +5277,813 @@
           <w:sz w:val="24"/>
           <w:szCs w:val="24"/>
         </w:rPr>
-        <w:t>Vista de Tareas Vencidas</w:t>
-      </w:r>
-    </w:p>
-    <w:p>
-      <w:pPr>
+        <w:t>Panel Lateral Derecho: Cuenta con los campos para registrar una nueva tarea por título y descripción (opcional), además cuenta con pestañas para seleccionar entre los eventos y usuarios existentes. Así mismo hay pestañas de Prioridad, Estado y Fecha que cuentan con valores predeterminados que el usuario puede modificar. De igual manera se puede actualizar la información de tareas, eliminar una seleccionada o limpiar el formulario.</w:t>
+      </w:r>
+    </w:p>
+    <w:p>
+      <w:pPr>
+        <w:pStyle w:val="Prrafodelista"/>
+        <w:numPr>
+          <w:ilvl w:val="0"/>
+          <w:numId w:val="25"/>
+        </w:numPr>
         <w:spacing w:line="360" w:lineRule="auto"/>
         <w:jc w:val="both"/>
         <w:rPr>
           <w:rFonts w:ascii="Times New Roman" w:eastAsia="Times New Roman" w:hAnsi="Times New Roman" w:cs="Times New Roman"/>
+          <w:sz w:val="24"/>
+          <w:szCs w:val="24"/>
+        </w:rPr>
+      </w:pPr>
+      <w:r>
+        <w:rPr>
+          <w:rFonts w:ascii="Times New Roman" w:eastAsia="Times New Roman" w:hAnsi="Times New Roman" w:cs="Times New Roman"/>
+          <w:sz w:val="24"/>
+          <w:szCs w:val="24"/>
+        </w:rPr>
+        <w:t>Vista de Carga de Trabajo</w:t>
+      </w:r>
+      <w:r>
+        <w:rPr>
+          <w:rFonts w:ascii="Times New Roman" w:eastAsia="Times New Roman" w:hAnsi="Times New Roman" w:cs="Times New Roman"/>
+          <w:sz w:val="24"/>
+          <w:szCs w:val="24"/>
+        </w:rPr>
+        <w:t>: Genera un reporte en la tabla central que muestra cada usuario con su total de tareas activas y una columna con la cantidad de tareas vencidas.</w:t>
+      </w:r>
+    </w:p>
+    <w:p>
+      <w:pPr>
+        <w:pStyle w:val="Prrafodelista"/>
+        <w:numPr>
+          <w:ilvl w:val="0"/>
+          <w:numId w:val="25"/>
+        </w:numPr>
+        <w:spacing w:line="360" w:lineRule="auto"/>
+        <w:jc w:val="both"/>
+        <w:rPr>
+          <w:rFonts w:ascii="Times New Roman" w:eastAsia="Times New Roman" w:hAnsi="Times New Roman" w:cs="Times New Roman"/>
+          <w:sz w:val="24"/>
+          <w:szCs w:val="24"/>
+        </w:rPr>
+      </w:pPr>
+      <w:r>
+        <w:rPr>
+          <w:rFonts w:ascii="Times New Roman" w:eastAsia="Times New Roman" w:hAnsi="Times New Roman" w:cs="Times New Roman"/>
+          <w:sz w:val="24"/>
+          <w:szCs w:val="24"/>
+        </w:rPr>
+        <w:t xml:space="preserve">Vista de </w:t>
+      </w:r>
+      <w:r>
+        <w:rPr>
+          <w:rFonts w:ascii="Times New Roman" w:eastAsia="Times New Roman" w:hAnsi="Times New Roman" w:cs="Times New Roman"/>
+          <w:sz w:val="24"/>
+          <w:szCs w:val="24"/>
+        </w:rPr>
+        <w:t>Eventos con Tareas</w:t>
+      </w:r>
+      <w:r>
+        <w:rPr>
+          <w:rFonts w:ascii="Times New Roman" w:eastAsia="Times New Roman" w:hAnsi="Times New Roman" w:cs="Times New Roman"/>
+          <w:sz w:val="24"/>
+          <w:szCs w:val="24"/>
+        </w:rPr>
+        <w:t xml:space="preserve"> Vencidas</w:t>
+      </w:r>
+      <w:r>
+        <w:rPr>
+          <w:rFonts w:ascii="Times New Roman" w:eastAsia="Times New Roman" w:hAnsi="Times New Roman" w:cs="Times New Roman"/>
+          <w:sz w:val="24"/>
+          <w:szCs w:val="24"/>
+        </w:rPr>
+        <w:t xml:space="preserve">: </w:t>
+      </w:r>
+      <w:r>
+        <w:rPr>
+          <w:rFonts w:ascii="Times New Roman" w:eastAsia="Times New Roman" w:hAnsi="Times New Roman" w:cs="Times New Roman"/>
+          <w:sz w:val="24"/>
+          <w:szCs w:val="24"/>
+        </w:rPr>
+        <w:t>La tabla central cambia a un reporte que muestra eventos con su fecha de inicio y las tareas que tiene vencidas a realizar.</w:t>
+      </w:r>
+    </w:p>
+    <w:p>
+      <w:pPr>
+        <w:spacing w:line="360" w:lineRule="auto"/>
+        <w:jc w:val="both"/>
+        <w:rPr>
+          <w:rFonts w:ascii="Times New Roman" w:eastAsia="Times New Roman" w:hAnsi="Times New Roman" w:cs="Times New Roman"/>
+          <w:sz w:val="24"/>
+          <w:szCs w:val="24"/>
+        </w:rPr>
+      </w:pPr>
+      <w:r>
+        <w:rPr>
+          <w:rFonts w:ascii="Times New Roman" w:eastAsia="Times New Roman" w:hAnsi="Times New Roman" w:cs="Times New Roman"/>
+          <w:sz w:val="24"/>
+          <w:szCs w:val="24"/>
+        </w:rPr>
+        <w:lastRenderedPageBreak/>
+        <w:t>Pantalla Tareas-Carga de Trabajo</w:t>
+      </w:r>
+    </w:p>
+    <w:p>
+      <w:pPr>
+        <w:spacing w:line="360" w:lineRule="auto"/>
+        <w:jc w:val="center"/>
+        <w:rPr>
+          <w:rFonts w:ascii="Times New Roman" w:eastAsia="Times New Roman" w:hAnsi="Times New Roman" w:cs="Times New Roman"/>
+          <w:sz w:val="24"/>
+          <w:szCs w:val="24"/>
+        </w:rPr>
+      </w:pPr>
+      <w:r>
+        <w:rPr>
+          <w:noProof/>
+        </w:rPr>
+        <w:drawing>
+          <wp:inline distT="0" distB="0" distL="0" distR="0" wp14:anchorId="7BC7B861" wp14:editId="1239556C">
+            <wp:extent cx="5443397" cy="3524250"/>
+            <wp:effectExtent l="0" t="0" r="5080" b="0"/>
+            <wp:docPr id="1537746117" name="Imagen 1"/>
+            <wp:cNvGraphicFramePr>
+              <a:graphicFrameLocks xmlns:a="http://schemas.openxmlformats.org/drawingml/2006/main" noChangeAspect="1"/>
+            </wp:cNvGraphicFramePr>
+            <a:graphic xmlns:a="http://schemas.openxmlformats.org/drawingml/2006/main">
+              <a:graphicData uri="http://schemas.openxmlformats.org/drawingml/2006/picture">
+                <pic:pic xmlns:pic="http://schemas.openxmlformats.org/drawingml/2006/picture">
+                  <pic:nvPicPr>
+                    <pic:cNvPr id="1537746117" name=""/>
+                    <pic:cNvPicPr/>
+                  </pic:nvPicPr>
+                  <pic:blipFill>
+                    <a:blip r:embed="rId17"/>
+                    <a:stretch>
+                      <a:fillRect/>
+                    </a:stretch>
+                  </pic:blipFill>
+                  <pic:spPr>
+                    <a:xfrm>
+                      <a:off x="0" y="0"/>
+                      <a:ext cx="5454518" cy="3531450"/>
+                    </a:xfrm>
+                    <a:prstGeom prst="rect">
+                      <a:avLst/>
+                    </a:prstGeom>
+                  </pic:spPr>
+                </pic:pic>
+              </a:graphicData>
+            </a:graphic>
+          </wp:inline>
+        </w:drawing>
+      </w:r>
+    </w:p>
+    <w:p>
+      <w:pPr>
+        <w:spacing w:line="360" w:lineRule="auto"/>
+        <w:jc w:val="both"/>
+        <w:rPr>
+          <w:rFonts w:ascii="Times New Roman" w:eastAsia="Times New Roman" w:hAnsi="Times New Roman" w:cs="Times New Roman"/>
+          <w:sz w:val="24"/>
+          <w:szCs w:val="24"/>
+        </w:rPr>
+      </w:pPr>
+      <w:r>
+        <w:rPr>
+          <w:rFonts w:ascii="Times New Roman" w:eastAsia="Times New Roman" w:hAnsi="Times New Roman" w:cs="Times New Roman"/>
+          <w:sz w:val="24"/>
+          <w:szCs w:val="24"/>
+        </w:rPr>
+        <w:t>Pantalla Tareas-Eventos Vencidos</w:t>
+      </w:r>
+    </w:p>
+    <w:p>
+      <w:pPr>
+        <w:spacing w:line="360" w:lineRule="auto"/>
+        <w:jc w:val="center"/>
+        <w:rPr>
+          <w:rFonts w:ascii="Times New Roman" w:eastAsia="Times New Roman" w:hAnsi="Times New Roman" w:cs="Times New Roman"/>
+          <w:sz w:val="24"/>
+          <w:szCs w:val="24"/>
+        </w:rPr>
+      </w:pPr>
+      <w:r>
+        <w:rPr>
+          <w:noProof/>
+        </w:rPr>
+        <w:drawing>
+          <wp:inline distT="0" distB="0" distL="0" distR="0" wp14:anchorId="3A0AA86C" wp14:editId="6E059C0A">
+            <wp:extent cx="5467350" cy="3539759"/>
+            <wp:effectExtent l="0" t="0" r="0" b="3810"/>
+            <wp:docPr id="238854063" name="Imagen 1"/>
+            <wp:cNvGraphicFramePr>
+              <a:graphicFrameLocks xmlns:a="http://schemas.openxmlformats.org/drawingml/2006/main" noChangeAspect="1"/>
+            </wp:cNvGraphicFramePr>
+            <a:graphic xmlns:a="http://schemas.openxmlformats.org/drawingml/2006/main">
+              <a:graphicData uri="http://schemas.openxmlformats.org/drawingml/2006/picture">
+                <pic:pic xmlns:pic="http://schemas.openxmlformats.org/drawingml/2006/picture">
+                  <pic:nvPicPr>
+                    <pic:cNvPr id="238854063" name=""/>
+                    <pic:cNvPicPr/>
+                  </pic:nvPicPr>
+                  <pic:blipFill>
+                    <a:blip r:embed="rId18"/>
+                    <a:stretch>
+                      <a:fillRect/>
+                    </a:stretch>
+                  </pic:blipFill>
+                  <pic:spPr>
+                    <a:xfrm>
+                      <a:off x="0" y="0"/>
+                      <a:ext cx="5471927" cy="3542722"/>
+                    </a:xfrm>
+                    <a:prstGeom prst="rect">
+                      <a:avLst/>
+                    </a:prstGeom>
+                  </pic:spPr>
+                </pic:pic>
+              </a:graphicData>
+            </a:graphic>
+          </wp:inline>
+        </w:drawing>
+      </w:r>
+    </w:p>
+    <w:p>
+      <w:pPr>
+        <w:spacing w:line="360" w:lineRule="auto"/>
+        <w:rPr>
+          <w:rFonts w:ascii="Times New Roman" w:eastAsia="Times New Roman" w:hAnsi="Times New Roman" w:cs="Times New Roman"/>
+          <w:sz w:val="24"/>
+          <w:szCs w:val="24"/>
+        </w:rPr>
+      </w:pPr>
+      <w:r>
+        <w:rPr>
+          <w:rFonts w:ascii="Times New Roman" w:eastAsia="Times New Roman" w:hAnsi="Times New Roman" w:cs="Times New Roman"/>
+          <w:sz w:val="24"/>
+          <w:szCs w:val="24"/>
+        </w:rPr>
+        <w:lastRenderedPageBreak/>
+        <w:t>Código de carga de la entidad tareas y las vistas a la interfaz</w:t>
+      </w:r>
+    </w:p>
+    <w:p>
+      <w:pPr>
+        <w:spacing w:line="360" w:lineRule="auto"/>
+        <w:rPr>
+          <w:rFonts w:ascii="Times New Roman" w:eastAsia="Times New Roman" w:hAnsi="Times New Roman" w:cs="Times New Roman"/>
+          <w:sz w:val="24"/>
+          <w:szCs w:val="24"/>
+        </w:rPr>
+      </w:pPr>
+      <w:r>
+        <w:rPr>
+          <w:noProof/>
+        </w:rPr>
+        <w:drawing>
+          <wp:inline distT="0" distB="0" distL="0" distR="0" wp14:anchorId="5A3A312C" wp14:editId="29051C9F">
+            <wp:extent cx="5943600" cy="3656965"/>
+            <wp:effectExtent l="0" t="0" r="0" b="635"/>
+            <wp:docPr id="730665748" name="Imagen 1"/>
+            <wp:cNvGraphicFramePr>
+              <a:graphicFrameLocks xmlns:a="http://schemas.openxmlformats.org/drawingml/2006/main" noChangeAspect="1"/>
+            </wp:cNvGraphicFramePr>
+            <a:graphic xmlns:a="http://schemas.openxmlformats.org/drawingml/2006/main">
+              <a:graphicData uri="http://schemas.openxmlformats.org/drawingml/2006/picture">
+                <pic:pic xmlns:pic="http://schemas.openxmlformats.org/drawingml/2006/picture">
+                  <pic:nvPicPr>
+                    <pic:cNvPr id="730665748" name=""/>
+                    <pic:cNvPicPr/>
+                  </pic:nvPicPr>
+                  <pic:blipFill>
+                    <a:blip r:embed="rId19"/>
+                    <a:stretch>
+                      <a:fillRect/>
+                    </a:stretch>
+                  </pic:blipFill>
+                  <pic:spPr>
+                    <a:xfrm>
+                      <a:off x="0" y="0"/>
+                      <a:ext cx="5943600" cy="3656965"/>
+                    </a:xfrm>
+                    <a:prstGeom prst="rect">
+                      <a:avLst/>
+                    </a:prstGeom>
+                  </pic:spPr>
+                </pic:pic>
+              </a:graphicData>
+            </a:graphic>
+          </wp:inline>
+        </w:drawing>
+      </w:r>
+    </w:p>
+    <w:p>
+      <w:pPr>
+        <w:spacing w:line="360" w:lineRule="auto"/>
+        <w:ind w:firstLine="720"/>
+        <w:jc w:val="both"/>
+        <w:rPr>
+          <w:rFonts w:ascii="Times New Roman" w:eastAsia="Times New Roman" w:hAnsi="Times New Roman" w:cs="Times New Roman"/>
+          <w:sz w:val="24"/>
+          <w:szCs w:val="24"/>
+        </w:rPr>
+      </w:pPr>
+      <w:r>
+        <w:rPr>
+          <w:rFonts w:ascii="Times New Roman" w:eastAsia="Times New Roman" w:hAnsi="Times New Roman" w:cs="Times New Roman"/>
+          <w:sz w:val="24"/>
+          <w:szCs w:val="24"/>
+        </w:rPr>
+        <w:t xml:space="preserve">Las funciones creadas para hacer llamadas de la entidad </w:t>
+      </w:r>
+      <w:r>
+        <w:rPr>
+          <w:rFonts w:ascii="Times New Roman" w:eastAsia="Times New Roman" w:hAnsi="Times New Roman" w:cs="Times New Roman"/>
+          <w:sz w:val="24"/>
+          <w:szCs w:val="24"/>
+        </w:rPr>
+        <w:t>de tareas</w:t>
+      </w:r>
+      <w:r>
+        <w:rPr>
+          <w:rFonts w:ascii="Times New Roman" w:eastAsia="Times New Roman" w:hAnsi="Times New Roman" w:cs="Times New Roman"/>
+          <w:sz w:val="24"/>
+          <w:szCs w:val="24"/>
+        </w:rPr>
+        <w:t xml:space="preserve"> </w:t>
+      </w:r>
+      <w:r>
+        <w:rPr>
+          <w:rFonts w:ascii="Times New Roman" w:eastAsia="Times New Roman" w:hAnsi="Times New Roman" w:cs="Times New Roman"/>
+          <w:sz w:val="24"/>
+          <w:szCs w:val="24"/>
+        </w:rPr>
+        <w:t>desde la Base de Datos fueron diseñadas siguiendo la estructura de eventos y la anterior de ubicaciones</w:t>
+      </w:r>
+      <w:r>
+        <w:rPr>
+          <w:rFonts w:ascii="Times New Roman" w:eastAsia="Times New Roman" w:hAnsi="Times New Roman" w:cs="Times New Roman"/>
+          <w:sz w:val="24"/>
+          <w:szCs w:val="24"/>
+        </w:rPr>
+        <w:t xml:space="preserve">, </w:t>
+      </w:r>
+      <w:r>
+        <w:rPr>
+          <w:rFonts w:ascii="Times New Roman" w:eastAsia="Times New Roman" w:hAnsi="Times New Roman" w:cs="Times New Roman"/>
+          <w:sz w:val="24"/>
+          <w:szCs w:val="24"/>
+        </w:rPr>
+        <w:t>las consultas e inserciones se readaptaron para este módulo y según los datos que la entidad maneja en sus columnas</w:t>
+      </w:r>
+      <w:r>
+        <w:rPr>
+          <w:rFonts w:ascii="Times New Roman" w:eastAsia="Times New Roman" w:hAnsi="Times New Roman" w:cs="Times New Roman"/>
+          <w:sz w:val="24"/>
+          <w:szCs w:val="24"/>
+        </w:rPr>
+        <w:t>.</w:t>
+      </w:r>
+    </w:p>
+    <w:p>
+      <w:pPr>
+        <w:spacing w:line="360" w:lineRule="auto"/>
+        <w:ind w:firstLine="720"/>
+        <w:jc w:val="both"/>
+        <w:rPr>
+          <w:rFonts w:ascii="Times New Roman" w:eastAsia="Times New Roman" w:hAnsi="Times New Roman" w:cs="Times New Roman"/>
+          <w:sz w:val="24"/>
+          <w:szCs w:val="24"/>
+        </w:rPr>
+      </w:pPr>
+      <w:r>
+        <w:rPr>
+          <w:rFonts w:ascii="Times New Roman" w:eastAsia="Times New Roman" w:hAnsi="Times New Roman" w:cs="Times New Roman"/>
+          <w:sz w:val="24"/>
+          <w:szCs w:val="24"/>
+        </w:rPr>
+        <w:t>Las siguientes funciones fueron creadas bajo las estructuras mencionadas</w:t>
+      </w:r>
+      <w:r>
+        <w:rPr>
+          <w:rFonts w:ascii="Times New Roman" w:eastAsia="Times New Roman" w:hAnsi="Times New Roman" w:cs="Times New Roman"/>
+          <w:sz w:val="24"/>
+          <w:szCs w:val="24"/>
+        </w:rPr>
+        <w:t>:</w:t>
+      </w:r>
+    </w:p>
+    <w:p>
+      <w:pPr>
+        <w:spacing w:after="0" w:line="360" w:lineRule="auto"/>
+        <w:ind w:firstLine="720"/>
+        <w:jc w:val="both"/>
+        <w:rPr>
+          <w:rFonts w:ascii="Times New Roman" w:eastAsia="Times New Roman" w:hAnsi="Times New Roman" w:cs="Times New Roman"/>
+          <w:sz w:val="24"/>
+          <w:szCs w:val="24"/>
+        </w:rPr>
+      </w:pPr>
+      <w:r>
+        <w:rPr>
+          <w:rFonts w:ascii="Times New Roman" w:eastAsia="Times New Roman" w:hAnsi="Times New Roman" w:cs="Times New Roman"/>
+          <w:sz w:val="24"/>
+          <w:szCs w:val="24"/>
+        </w:rPr>
+        <w:t>-</w:t>
+      </w:r>
+      <w:r>
+        <w:rPr>
+          <w:rFonts w:ascii="Times New Roman" w:eastAsia="Times New Roman" w:hAnsi="Times New Roman" w:cs="Times New Roman"/>
+          <w:sz w:val="24"/>
+          <w:szCs w:val="24"/>
+        </w:rPr>
+        <w:tab/>
+      </w:r>
+      <w:proofErr w:type="spellStart"/>
+      <w:r>
+        <w:rPr>
+          <w:rFonts w:ascii="Times New Roman" w:eastAsia="Times New Roman" w:hAnsi="Times New Roman" w:cs="Times New Roman"/>
+          <w:sz w:val="24"/>
+          <w:szCs w:val="24"/>
+        </w:rPr>
+        <w:t>configurar_pestana_</w:t>
+      </w:r>
+      <w:r>
+        <w:rPr>
+          <w:rFonts w:ascii="Times New Roman" w:eastAsia="Times New Roman" w:hAnsi="Times New Roman" w:cs="Times New Roman"/>
+          <w:sz w:val="24"/>
+          <w:szCs w:val="24"/>
+        </w:rPr>
+        <w:t>tareas</w:t>
+      </w:r>
+      <w:proofErr w:type="spellEnd"/>
+    </w:p>
+    <w:p>
+      <w:pPr>
+        <w:spacing w:after="0" w:line="360" w:lineRule="auto"/>
+        <w:ind w:firstLine="720"/>
+        <w:jc w:val="both"/>
+        <w:rPr>
+          <w:rFonts w:ascii="Times New Roman" w:eastAsia="Times New Roman" w:hAnsi="Times New Roman" w:cs="Times New Roman"/>
+          <w:sz w:val="24"/>
+          <w:szCs w:val="24"/>
+        </w:rPr>
+      </w:pPr>
+      <w:r>
+        <w:rPr>
+          <w:rFonts w:ascii="Times New Roman" w:eastAsia="Times New Roman" w:hAnsi="Times New Roman" w:cs="Times New Roman"/>
+          <w:sz w:val="24"/>
+          <w:szCs w:val="24"/>
+        </w:rPr>
+        <w:t>-</w:t>
+      </w:r>
+      <w:r>
+        <w:rPr>
+          <w:rFonts w:ascii="Times New Roman" w:eastAsia="Times New Roman" w:hAnsi="Times New Roman" w:cs="Times New Roman"/>
+          <w:sz w:val="24"/>
+          <w:szCs w:val="24"/>
+        </w:rPr>
+        <w:tab/>
+      </w:r>
+      <w:proofErr w:type="spellStart"/>
+      <w:r>
+        <w:rPr>
+          <w:rFonts w:ascii="Times New Roman" w:eastAsia="Times New Roman" w:hAnsi="Times New Roman" w:cs="Times New Roman"/>
+          <w:sz w:val="24"/>
+          <w:szCs w:val="24"/>
+        </w:rPr>
+        <w:t>tarea</w:t>
+      </w:r>
+      <w:r>
+        <w:rPr>
+          <w:rFonts w:ascii="Times New Roman" w:eastAsia="Times New Roman" w:hAnsi="Times New Roman" w:cs="Times New Roman"/>
+          <w:sz w:val="24"/>
+          <w:szCs w:val="24"/>
+        </w:rPr>
+        <w:t>_seleccionada_id</w:t>
+      </w:r>
+      <w:proofErr w:type="spellEnd"/>
+    </w:p>
+    <w:p>
+      <w:pPr>
+        <w:spacing w:after="0" w:line="360" w:lineRule="auto"/>
+        <w:ind w:firstLine="720"/>
+        <w:jc w:val="both"/>
+        <w:rPr>
+          <w:rFonts w:ascii="Times New Roman" w:eastAsia="Times New Roman" w:hAnsi="Times New Roman" w:cs="Times New Roman"/>
+          <w:sz w:val="24"/>
+          <w:szCs w:val="24"/>
+        </w:rPr>
+      </w:pPr>
+      <w:r>
+        <w:rPr>
+          <w:rFonts w:ascii="Times New Roman" w:eastAsia="Times New Roman" w:hAnsi="Times New Roman" w:cs="Times New Roman"/>
+          <w:sz w:val="24"/>
+          <w:szCs w:val="24"/>
+        </w:rPr>
+        <w:t>-</w:t>
+      </w:r>
+      <w:r>
+        <w:rPr>
+          <w:rFonts w:ascii="Times New Roman" w:eastAsia="Times New Roman" w:hAnsi="Times New Roman" w:cs="Times New Roman"/>
+          <w:sz w:val="24"/>
+          <w:szCs w:val="24"/>
+        </w:rPr>
+        <w:tab/>
+      </w:r>
+      <w:proofErr w:type="spellStart"/>
+      <w:r>
+        <w:rPr>
+          <w:rFonts w:ascii="Times New Roman" w:eastAsia="Times New Roman" w:hAnsi="Times New Roman" w:cs="Times New Roman"/>
+          <w:sz w:val="24"/>
+          <w:szCs w:val="24"/>
+        </w:rPr>
+        <w:t>cargar_</w:t>
+      </w:r>
+      <w:r>
+        <w:rPr>
+          <w:rFonts w:ascii="Times New Roman" w:eastAsia="Times New Roman" w:hAnsi="Times New Roman" w:cs="Times New Roman"/>
+          <w:sz w:val="24"/>
+          <w:szCs w:val="24"/>
+        </w:rPr>
+        <w:t>tarea</w:t>
+      </w:r>
+      <w:r>
+        <w:rPr>
+          <w:rFonts w:ascii="Times New Roman" w:eastAsia="Times New Roman" w:hAnsi="Times New Roman" w:cs="Times New Roman"/>
+          <w:sz w:val="24"/>
+          <w:szCs w:val="24"/>
+        </w:rPr>
+        <w:t>_seleccionada</w:t>
+      </w:r>
+      <w:proofErr w:type="spellEnd"/>
+    </w:p>
+    <w:p>
+      <w:pPr>
+        <w:spacing w:after="0" w:line="360" w:lineRule="auto"/>
+        <w:ind w:firstLine="720"/>
+        <w:jc w:val="both"/>
+        <w:rPr>
+          <w:rFonts w:ascii="Times New Roman" w:eastAsia="Times New Roman" w:hAnsi="Times New Roman" w:cs="Times New Roman"/>
+          <w:sz w:val="24"/>
+          <w:szCs w:val="24"/>
+        </w:rPr>
+      </w:pPr>
+      <w:r>
+        <w:rPr>
+          <w:rFonts w:ascii="Times New Roman" w:eastAsia="Times New Roman" w:hAnsi="Times New Roman" w:cs="Times New Roman"/>
+          <w:sz w:val="24"/>
+          <w:szCs w:val="24"/>
+        </w:rPr>
+        <w:t>-</w:t>
+      </w:r>
+      <w:r>
+        <w:rPr>
+          <w:rFonts w:ascii="Times New Roman" w:eastAsia="Times New Roman" w:hAnsi="Times New Roman" w:cs="Times New Roman"/>
+          <w:sz w:val="24"/>
+          <w:szCs w:val="24"/>
+        </w:rPr>
+        <w:tab/>
+      </w:r>
+      <w:proofErr w:type="spellStart"/>
+      <w:r>
+        <w:rPr>
+          <w:rFonts w:ascii="Times New Roman" w:eastAsia="Times New Roman" w:hAnsi="Times New Roman" w:cs="Times New Roman"/>
+          <w:sz w:val="24"/>
+          <w:szCs w:val="24"/>
+        </w:rPr>
+        <w:t>limpiar_form_</w:t>
+      </w:r>
+      <w:r>
+        <w:rPr>
+          <w:rFonts w:ascii="Times New Roman" w:eastAsia="Times New Roman" w:hAnsi="Times New Roman" w:cs="Times New Roman"/>
+          <w:sz w:val="24"/>
+          <w:szCs w:val="24"/>
+        </w:rPr>
+        <w:t>tarea</w:t>
+      </w:r>
+      <w:proofErr w:type="spellEnd"/>
+    </w:p>
+    <w:p>
+      <w:pPr>
+        <w:spacing w:after="0" w:line="360" w:lineRule="auto"/>
+        <w:ind w:firstLine="720"/>
+        <w:jc w:val="both"/>
+        <w:rPr>
+          <w:rFonts w:ascii="Times New Roman" w:eastAsia="Times New Roman" w:hAnsi="Times New Roman" w:cs="Times New Roman"/>
+          <w:sz w:val="24"/>
+          <w:szCs w:val="24"/>
+        </w:rPr>
+      </w:pPr>
+      <w:r>
+        <w:rPr>
+          <w:rFonts w:ascii="Times New Roman" w:eastAsia="Times New Roman" w:hAnsi="Times New Roman" w:cs="Times New Roman"/>
+          <w:sz w:val="24"/>
+          <w:szCs w:val="24"/>
+        </w:rPr>
+        <w:t>-</w:t>
+      </w:r>
+      <w:r>
+        <w:rPr>
+          <w:rFonts w:ascii="Times New Roman" w:eastAsia="Times New Roman" w:hAnsi="Times New Roman" w:cs="Times New Roman"/>
+          <w:sz w:val="24"/>
+          <w:szCs w:val="24"/>
+        </w:rPr>
+        <w:tab/>
+      </w:r>
+      <w:proofErr w:type="spellStart"/>
+      <w:r>
+        <w:rPr>
+          <w:rFonts w:ascii="Times New Roman" w:eastAsia="Times New Roman" w:hAnsi="Times New Roman" w:cs="Times New Roman"/>
+          <w:sz w:val="24"/>
+          <w:szCs w:val="24"/>
+        </w:rPr>
+        <w:t>datos_</w:t>
+      </w:r>
+      <w:r>
+        <w:rPr>
+          <w:rFonts w:ascii="Times New Roman" w:eastAsia="Times New Roman" w:hAnsi="Times New Roman" w:cs="Times New Roman"/>
+          <w:sz w:val="24"/>
+          <w:szCs w:val="24"/>
+        </w:rPr>
+        <w:t>tarea</w:t>
+      </w:r>
+      <w:r>
+        <w:rPr>
+          <w:rFonts w:ascii="Times New Roman" w:eastAsia="Times New Roman" w:hAnsi="Times New Roman" w:cs="Times New Roman"/>
+          <w:sz w:val="24"/>
+          <w:szCs w:val="24"/>
+        </w:rPr>
+        <w:t>_formulario</w:t>
+      </w:r>
+      <w:proofErr w:type="spellEnd"/>
+    </w:p>
+    <w:p>
+      <w:pPr>
+        <w:spacing w:after="0" w:line="360" w:lineRule="auto"/>
+        <w:ind w:firstLine="720"/>
+        <w:jc w:val="both"/>
+        <w:rPr>
+          <w:rFonts w:ascii="Times New Roman" w:eastAsia="Times New Roman" w:hAnsi="Times New Roman" w:cs="Times New Roman"/>
+          <w:sz w:val="24"/>
+          <w:szCs w:val="24"/>
+        </w:rPr>
+      </w:pPr>
+      <w:r>
+        <w:rPr>
+          <w:rFonts w:ascii="Times New Roman" w:eastAsia="Times New Roman" w:hAnsi="Times New Roman" w:cs="Times New Roman"/>
+          <w:sz w:val="24"/>
+          <w:szCs w:val="24"/>
+        </w:rPr>
+        <w:t>-</w:t>
+      </w:r>
+      <w:r>
+        <w:rPr>
+          <w:rFonts w:ascii="Times New Roman" w:eastAsia="Times New Roman" w:hAnsi="Times New Roman" w:cs="Times New Roman"/>
+          <w:sz w:val="24"/>
+          <w:szCs w:val="24"/>
+        </w:rPr>
+        <w:tab/>
+      </w:r>
+      <w:proofErr w:type="spellStart"/>
+      <w:r>
+        <w:rPr>
+          <w:rFonts w:ascii="Times New Roman" w:eastAsia="Times New Roman" w:hAnsi="Times New Roman" w:cs="Times New Roman"/>
+          <w:sz w:val="24"/>
+          <w:szCs w:val="24"/>
+        </w:rPr>
+        <w:t>agregar_</w:t>
+      </w:r>
+      <w:r>
+        <w:rPr>
+          <w:rFonts w:ascii="Times New Roman" w:eastAsia="Times New Roman" w:hAnsi="Times New Roman" w:cs="Times New Roman"/>
+          <w:sz w:val="24"/>
+          <w:szCs w:val="24"/>
+        </w:rPr>
+        <w:t>tareas</w:t>
+      </w:r>
+      <w:proofErr w:type="spellEnd"/>
+    </w:p>
+    <w:p>
+      <w:pPr>
+        <w:spacing w:after="0" w:line="360" w:lineRule="auto"/>
+        <w:ind w:firstLine="720"/>
+        <w:jc w:val="both"/>
+        <w:rPr>
+          <w:rFonts w:ascii="Times New Roman" w:eastAsia="Times New Roman" w:hAnsi="Times New Roman" w:cs="Times New Roman"/>
+          <w:sz w:val="24"/>
+          <w:szCs w:val="24"/>
+        </w:rPr>
+      </w:pPr>
+      <w:r>
+        <w:rPr>
+          <w:rFonts w:ascii="Times New Roman" w:eastAsia="Times New Roman" w:hAnsi="Times New Roman" w:cs="Times New Roman"/>
+          <w:sz w:val="24"/>
+          <w:szCs w:val="24"/>
+        </w:rPr>
+        <w:t>-</w:t>
+      </w:r>
+      <w:r>
+        <w:rPr>
+          <w:rFonts w:ascii="Times New Roman" w:eastAsia="Times New Roman" w:hAnsi="Times New Roman" w:cs="Times New Roman"/>
+          <w:sz w:val="24"/>
+          <w:szCs w:val="24"/>
+        </w:rPr>
+        <w:tab/>
+      </w:r>
+      <w:proofErr w:type="spellStart"/>
+      <w:r>
+        <w:rPr>
+          <w:rFonts w:ascii="Times New Roman" w:eastAsia="Times New Roman" w:hAnsi="Times New Roman" w:cs="Times New Roman"/>
+          <w:sz w:val="24"/>
+          <w:szCs w:val="24"/>
+        </w:rPr>
+        <w:t>actualizar_</w:t>
+      </w:r>
+      <w:r>
+        <w:rPr>
+          <w:rFonts w:ascii="Times New Roman" w:eastAsia="Times New Roman" w:hAnsi="Times New Roman" w:cs="Times New Roman"/>
+          <w:sz w:val="24"/>
+          <w:szCs w:val="24"/>
+        </w:rPr>
+        <w:t>tarea</w:t>
+      </w:r>
+      <w:proofErr w:type="spellEnd"/>
+    </w:p>
+    <w:p>
+      <w:pPr>
+        <w:spacing w:line="360" w:lineRule="auto"/>
+        <w:ind w:firstLine="720"/>
+        <w:jc w:val="both"/>
+        <w:rPr>
+          <w:rFonts w:ascii="Times New Roman" w:eastAsia="Times New Roman" w:hAnsi="Times New Roman" w:cs="Times New Roman"/>
+          <w:sz w:val="24"/>
+          <w:szCs w:val="24"/>
+        </w:rPr>
+      </w:pPr>
+      <w:r>
+        <w:rPr>
+          <w:rFonts w:ascii="Times New Roman" w:eastAsia="Times New Roman" w:hAnsi="Times New Roman" w:cs="Times New Roman"/>
+          <w:sz w:val="24"/>
+          <w:szCs w:val="24"/>
+        </w:rPr>
+        <w:t>-</w:t>
+      </w:r>
+      <w:r>
+        <w:rPr>
+          <w:rFonts w:ascii="Times New Roman" w:eastAsia="Times New Roman" w:hAnsi="Times New Roman" w:cs="Times New Roman"/>
+          <w:sz w:val="24"/>
+          <w:szCs w:val="24"/>
+        </w:rPr>
+        <w:tab/>
+      </w:r>
+      <w:proofErr w:type="spellStart"/>
+      <w:r>
+        <w:rPr>
+          <w:rFonts w:ascii="Times New Roman" w:eastAsia="Times New Roman" w:hAnsi="Times New Roman" w:cs="Times New Roman"/>
+          <w:sz w:val="24"/>
+          <w:szCs w:val="24"/>
+        </w:rPr>
+        <w:t>eliminar_</w:t>
+      </w:r>
+      <w:r>
+        <w:rPr>
+          <w:rFonts w:ascii="Times New Roman" w:eastAsia="Times New Roman" w:hAnsi="Times New Roman" w:cs="Times New Roman"/>
+          <w:sz w:val="24"/>
+          <w:szCs w:val="24"/>
+        </w:rPr>
+        <w:t>tarea</w:t>
+      </w:r>
+      <w:proofErr w:type="spellEnd"/>
+    </w:p>
+    <w:p>
+      <w:pPr>
+        <w:spacing w:line="360" w:lineRule="auto"/>
+        <w:ind w:firstLine="720"/>
+        <w:jc w:val="both"/>
+        <w:rPr>
+          <w:rFonts w:ascii="Times New Roman" w:eastAsia="Times New Roman" w:hAnsi="Times New Roman" w:cs="Times New Roman"/>
+          <w:sz w:val="24"/>
+          <w:szCs w:val="24"/>
+        </w:rPr>
+      </w:pPr>
+      <w:r>
+        <w:rPr>
+          <w:rFonts w:ascii="Times New Roman" w:eastAsia="Times New Roman" w:hAnsi="Times New Roman" w:cs="Times New Roman"/>
           <w:b/>
           <w:bCs/>
           <w:sz w:val="24"/>
           <w:szCs w:val="24"/>
         </w:rPr>
-      </w:pPr>
-      <w:r>
+        <w:br w:type="page"/>
+      </w:r>
+    </w:p>
+    <w:p>
+      <w:pPr>
+        <w:spacing w:line="360" w:lineRule="auto"/>
+        <w:jc w:val="both"/>
         <w:rPr>
           <w:rFonts w:ascii="Times New Roman" w:eastAsia="Times New Roman" w:hAnsi="Times New Roman" w:cs="Times New Roman"/>
           <w:b/>
@@ -3709,6 +6091,16 @@
           <w:sz w:val="24"/>
           <w:szCs w:val="24"/>
         </w:rPr>
+      </w:pPr>
+      <w:r>
+        <w:rPr>
+          <w:rFonts w:ascii="Times New Roman" w:eastAsia="Times New Roman" w:hAnsi="Times New Roman" w:cs="Times New Roman"/>
+          <w:b/>
+          <w:bCs/>
+          <w:sz w:val="24"/>
+          <w:szCs w:val="24"/>
+        </w:rPr>
+        <w:lastRenderedPageBreak/>
         <w:t>Pantalla de Gestión de Disponibilidad</w:t>
       </w:r>
     </w:p>
@@ -3726,7 +6118,6 @@
         <w:rPr>
           <w:noProof/>
         </w:rPr>
-        <w:lastRenderedPageBreak/>
         <w:drawing>
           <wp:inline distT="0" distB="0" distL="0" distR="0" wp14:anchorId="73246C14" wp14:editId="267FE4CA">
             <wp:extent cx="5943600" cy="3671570"/>
@@ -3743,7 +6134,7 @@
                     <pic:cNvPicPr/>
                   </pic:nvPicPr>
                   <pic:blipFill>
-                    <a:blip r:embed="rId13"/>
+                    <a:blip r:embed="rId20"/>
                     <a:stretch>
                       <a:fillRect/>
                     </a:stretch>
@@ -3781,7 +6172,7 @@
           <w:sz w:val="24"/>
           <w:szCs w:val="24"/>
         </w:rPr>
-        <w:t>Detalles a mencionar</w:t>
+        <w:t>Es el directorio para consultar las horas de disponibilidad con la que cuentan los usuarios y la siguiente información respectiva:</w:t>
       </w:r>
     </w:p>
     <w:p>
@@ -3805,7 +6196,7 @@
           <w:sz w:val="24"/>
           <w:szCs w:val="24"/>
         </w:rPr>
-        <w:t>Vista de Usuarios Ocupados</w:t>
+        <w:t>Tabla Central: Muestra en detalle las columnas: ID (del usuario), Usuario, Tipo, Fecha, Hora de Inicio y Hora de Fin. En este espacio se pueden revisar por cada usuario horas en días específicos donde estén Disponibles, No Disponibles u Ocupados.</w:t>
       </w:r>
     </w:p>
     <w:p>
@@ -3829,7 +6220,335 @@
           <w:sz w:val="24"/>
           <w:szCs w:val="24"/>
         </w:rPr>
+        <w:t xml:space="preserve">Panel Lateral Derecho: Cuenta con pestañas para seleccionar usuarios el tipo de disponibilidad, así mismo para asignar la fecha y las horas tanto de inicio cómo fin en las que </w:t>
+      </w:r>
+      <w:r>
+        <w:rPr>
+          <w:rFonts w:ascii="Times New Roman" w:eastAsia="Times New Roman" w:hAnsi="Times New Roman" w:cs="Times New Roman"/>
+          <w:sz w:val="24"/>
+          <w:szCs w:val="24"/>
+        </w:rPr>
+        <w:t>se establecerá el tipo de disponibilidad que tenga el usuario. Con esa misma información se puede seleccionar un registro para hacer modificaciones y actualizarlos, eliminar el registro o limpiar el formulario.</w:t>
+      </w:r>
+    </w:p>
+    <w:p>
+      <w:pPr>
+        <w:pStyle w:val="Prrafodelista"/>
+        <w:numPr>
+          <w:ilvl w:val="0"/>
+          <w:numId w:val="25"/>
+        </w:numPr>
+        <w:spacing w:line="360" w:lineRule="auto"/>
+        <w:jc w:val="both"/>
+        <w:rPr>
+          <w:rFonts w:ascii="Times New Roman" w:eastAsia="Times New Roman" w:hAnsi="Times New Roman" w:cs="Times New Roman"/>
+          <w:sz w:val="24"/>
+          <w:szCs w:val="24"/>
+        </w:rPr>
+      </w:pPr>
+      <w:r>
+        <w:rPr>
+          <w:rFonts w:ascii="Times New Roman" w:eastAsia="Times New Roman" w:hAnsi="Times New Roman" w:cs="Times New Roman"/>
+          <w:sz w:val="24"/>
+          <w:szCs w:val="24"/>
+        </w:rPr>
+        <w:t>Vista de Usuarios Ocupados</w:t>
+      </w:r>
+      <w:r>
+        <w:rPr>
+          <w:rFonts w:ascii="Times New Roman" w:eastAsia="Times New Roman" w:hAnsi="Times New Roman" w:cs="Times New Roman"/>
+          <w:sz w:val="24"/>
+          <w:szCs w:val="24"/>
+        </w:rPr>
+        <w:t xml:space="preserve">: </w:t>
+      </w:r>
+      <w:r>
+        <w:rPr>
+          <w:rFonts w:ascii="Times New Roman" w:eastAsia="Times New Roman" w:hAnsi="Times New Roman" w:cs="Times New Roman"/>
+          <w:sz w:val="24"/>
+          <w:szCs w:val="24"/>
+        </w:rPr>
+        <w:t>Muestra un reporte en la tabla central con las columnas de Usuario, fechas y horas en las cuales están ocupados y el motivo que se asocia con un evento.</w:t>
+      </w:r>
+    </w:p>
+    <w:p>
+      <w:pPr>
+        <w:pStyle w:val="Prrafodelista"/>
+        <w:numPr>
+          <w:ilvl w:val="0"/>
+          <w:numId w:val="25"/>
+        </w:numPr>
+        <w:spacing w:line="360" w:lineRule="auto"/>
+        <w:jc w:val="both"/>
+        <w:rPr>
+          <w:rFonts w:ascii="Times New Roman" w:eastAsia="Times New Roman" w:hAnsi="Times New Roman" w:cs="Times New Roman"/>
+          <w:sz w:val="24"/>
+          <w:szCs w:val="24"/>
+        </w:rPr>
+      </w:pPr>
+      <w:r>
+        <w:rPr>
+          <w:rFonts w:ascii="Times New Roman" w:eastAsia="Times New Roman" w:hAnsi="Times New Roman" w:cs="Times New Roman"/>
+          <w:sz w:val="24"/>
+          <w:szCs w:val="24"/>
+        </w:rPr>
         <w:t>Vista de Franjas Libres</w:t>
+      </w:r>
+      <w:r>
+        <w:rPr>
+          <w:rFonts w:ascii="Times New Roman" w:eastAsia="Times New Roman" w:hAnsi="Times New Roman" w:cs="Times New Roman"/>
+          <w:sz w:val="24"/>
+          <w:szCs w:val="24"/>
+        </w:rPr>
+        <w:t xml:space="preserve">: </w:t>
+      </w:r>
+      <w:r>
+        <w:rPr>
+          <w:rFonts w:ascii="Times New Roman" w:eastAsia="Times New Roman" w:hAnsi="Times New Roman" w:cs="Times New Roman"/>
+          <w:sz w:val="24"/>
+          <w:szCs w:val="24"/>
+        </w:rPr>
+        <w:t>Genera un reporte en la tabla central que muestra usuarios con disponibilidad en franjas horarias que se hayan registrado como disponibles.</w:t>
+      </w:r>
+    </w:p>
+    <w:p>
+      <w:pPr>
+        <w:spacing w:line="360" w:lineRule="auto"/>
+        <w:jc w:val="both"/>
+        <w:rPr>
+          <w:rFonts w:ascii="Times New Roman" w:eastAsia="Times New Roman" w:hAnsi="Times New Roman" w:cs="Times New Roman"/>
+          <w:sz w:val="24"/>
+          <w:szCs w:val="24"/>
+        </w:rPr>
+      </w:pPr>
+      <w:r>
+        <w:rPr>
+          <w:rFonts w:ascii="Times New Roman" w:eastAsia="Times New Roman" w:hAnsi="Times New Roman" w:cs="Times New Roman"/>
+          <w:sz w:val="24"/>
+          <w:szCs w:val="24"/>
+        </w:rPr>
+        <w:lastRenderedPageBreak/>
+        <w:t>Pantalla Disponibilidad-Ocupados</w:t>
+      </w:r>
+    </w:p>
+    <w:p>
+      <w:pPr>
+        <w:spacing w:line="360" w:lineRule="auto"/>
+        <w:jc w:val="both"/>
+        <w:rPr>
+          <w:rFonts w:ascii="Times New Roman" w:eastAsia="Times New Roman" w:hAnsi="Times New Roman" w:cs="Times New Roman"/>
+          <w:sz w:val="24"/>
+          <w:szCs w:val="24"/>
+        </w:rPr>
+      </w:pPr>
+      <w:r>
+        <w:rPr>
+          <w:noProof/>
+        </w:rPr>
+        <w:drawing>
+          <wp:inline distT="0" distB="0" distL="0" distR="0" wp14:anchorId="2369A8BE" wp14:editId="76ADFB53">
+            <wp:extent cx="5943600" cy="3157855"/>
+            <wp:effectExtent l="0" t="0" r="0" b="4445"/>
+            <wp:docPr id="1670215883" name="Imagen 1"/>
+            <wp:cNvGraphicFramePr>
+              <a:graphicFrameLocks xmlns:a="http://schemas.openxmlformats.org/drawingml/2006/main" noChangeAspect="1"/>
+            </wp:cNvGraphicFramePr>
+            <a:graphic xmlns:a="http://schemas.openxmlformats.org/drawingml/2006/main">
+              <a:graphicData uri="http://schemas.openxmlformats.org/drawingml/2006/picture">
+                <pic:pic xmlns:pic="http://schemas.openxmlformats.org/drawingml/2006/picture">
+                  <pic:nvPicPr>
+                    <pic:cNvPr id="1670215883" name=""/>
+                    <pic:cNvPicPr/>
+                  </pic:nvPicPr>
+                  <pic:blipFill>
+                    <a:blip r:embed="rId21"/>
+                    <a:stretch>
+                      <a:fillRect/>
+                    </a:stretch>
+                  </pic:blipFill>
+                  <pic:spPr>
+                    <a:xfrm>
+                      <a:off x="0" y="0"/>
+                      <a:ext cx="5943600" cy="3157855"/>
+                    </a:xfrm>
+                    <a:prstGeom prst="rect">
+                      <a:avLst/>
+                    </a:prstGeom>
+                  </pic:spPr>
+                </pic:pic>
+              </a:graphicData>
+            </a:graphic>
+          </wp:inline>
+        </w:drawing>
+      </w:r>
+    </w:p>
+    <w:p>
+      <w:pPr>
+        <w:spacing w:line="360" w:lineRule="auto"/>
+        <w:jc w:val="both"/>
+        <w:rPr>
+          <w:rFonts w:ascii="Times New Roman" w:eastAsia="Times New Roman" w:hAnsi="Times New Roman" w:cs="Times New Roman"/>
+          <w:sz w:val="24"/>
+          <w:szCs w:val="24"/>
+        </w:rPr>
+      </w:pPr>
+      <w:r>
+        <w:rPr>
+          <w:rFonts w:ascii="Times New Roman" w:eastAsia="Times New Roman" w:hAnsi="Times New Roman" w:cs="Times New Roman"/>
+          <w:sz w:val="24"/>
+          <w:szCs w:val="24"/>
+        </w:rPr>
+        <w:t>Pantalla Disponibilidad-Libres</w:t>
+      </w:r>
+    </w:p>
+    <w:p>
+      <w:pPr>
+        <w:spacing w:line="360" w:lineRule="auto"/>
+        <w:jc w:val="both"/>
+        <w:rPr>
+          <w:rFonts w:ascii="Times New Roman" w:eastAsia="Times New Roman" w:hAnsi="Times New Roman" w:cs="Times New Roman"/>
+          <w:sz w:val="24"/>
+          <w:szCs w:val="24"/>
+        </w:rPr>
+      </w:pPr>
+      <w:r>
+        <w:rPr>
+          <w:noProof/>
+        </w:rPr>
+        <w:drawing>
+          <wp:inline distT="0" distB="0" distL="0" distR="0" wp14:anchorId="724BC7B2" wp14:editId="7AF38883">
+            <wp:extent cx="5943600" cy="3157855"/>
+            <wp:effectExtent l="0" t="0" r="0" b="4445"/>
+            <wp:docPr id="1118338080" name="Imagen 1"/>
+            <wp:cNvGraphicFramePr>
+              <a:graphicFrameLocks xmlns:a="http://schemas.openxmlformats.org/drawingml/2006/main" noChangeAspect="1"/>
+            </wp:cNvGraphicFramePr>
+            <a:graphic xmlns:a="http://schemas.openxmlformats.org/drawingml/2006/main">
+              <a:graphicData uri="http://schemas.openxmlformats.org/drawingml/2006/picture">
+                <pic:pic xmlns:pic="http://schemas.openxmlformats.org/drawingml/2006/picture">
+                  <pic:nvPicPr>
+                    <pic:cNvPr id="1118338080" name=""/>
+                    <pic:cNvPicPr/>
+                  </pic:nvPicPr>
+                  <pic:blipFill>
+                    <a:blip r:embed="rId22"/>
+                    <a:stretch>
+                      <a:fillRect/>
+                    </a:stretch>
+                  </pic:blipFill>
+                  <pic:spPr>
+                    <a:xfrm>
+                      <a:off x="0" y="0"/>
+                      <a:ext cx="5943600" cy="3157855"/>
+                    </a:xfrm>
+                    <a:prstGeom prst="rect">
+                      <a:avLst/>
+                    </a:prstGeom>
+                  </pic:spPr>
+                </pic:pic>
+              </a:graphicData>
+            </a:graphic>
+          </wp:inline>
+        </w:drawing>
+      </w:r>
+    </w:p>
+    <w:p>
+      <w:pPr>
+        <w:spacing w:line="360" w:lineRule="auto"/>
+        <w:jc w:val="both"/>
+        <w:rPr>
+          <w:rFonts w:ascii="Times New Roman" w:eastAsia="Times New Roman" w:hAnsi="Times New Roman" w:cs="Times New Roman"/>
+          <w:sz w:val="24"/>
+          <w:szCs w:val="24"/>
+        </w:rPr>
+      </w:pPr>
+    </w:p>
+    <w:p>
+      <w:pPr>
+        <w:spacing w:line="360" w:lineRule="auto"/>
+        <w:jc w:val="both"/>
+        <w:rPr>
+          <w:rFonts w:ascii="Times New Roman" w:eastAsia="Times New Roman" w:hAnsi="Times New Roman" w:cs="Times New Roman"/>
+          <w:sz w:val="24"/>
+          <w:szCs w:val="24"/>
+        </w:rPr>
+      </w:pPr>
+    </w:p>
+    <w:p>
+      <w:pPr>
+        <w:rPr>
+          <w:rFonts w:ascii="Times New Roman" w:eastAsia="Times New Roman" w:hAnsi="Times New Roman" w:cs="Times New Roman"/>
+          <w:sz w:val="24"/>
+          <w:szCs w:val="24"/>
+        </w:rPr>
+      </w:pPr>
+      <w:r>
+        <w:rPr>
+          <w:rFonts w:ascii="Times New Roman" w:eastAsia="Times New Roman" w:hAnsi="Times New Roman" w:cs="Times New Roman"/>
+          <w:sz w:val="24"/>
+          <w:szCs w:val="24"/>
+        </w:rPr>
+        <w:br w:type="page"/>
+      </w:r>
+      <w:r>
+        <w:rPr>
+          <w:rFonts w:ascii="Times New Roman" w:eastAsia="Times New Roman" w:hAnsi="Times New Roman" w:cs="Times New Roman"/>
+          <w:sz w:val="24"/>
+          <w:szCs w:val="24"/>
+        </w:rPr>
+        <w:lastRenderedPageBreak/>
+        <w:t>Código de carga la tabla disponibilidades y las vistas a la interfaz</w:t>
+      </w:r>
+    </w:p>
+    <w:p>
+      <w:pPr>
+        <w:spacing w:line="360" w:lineRule="auto"/>
+        <w:jc w:val="both"/>
+        <w:rPr>
+          <w:rFonts w:ascii="Times New Roman" w:eastAsia="Times New Roman" w:hAnsi="Times New Roman" w:cs="Times New Roman"/>
+          <w:sz w:val="24"/>
+          <w:szCs w:val="24"/>
+        </w:rPr>
+      </w:pPr>
+      <w:r>
+        <w:rPr>
+          <w:noProof/>
+        </w:rPr>
+        <w:drawing>
+          <wp:inline distT="0" distB="0" distL="0" distR="0" wp14:anchorId="6AAD6FC2" wp14:editId="6951A6FB">
+            <wp:extent cx="5943600" cy="5637530"/>
+            <wp:effectExtent l="0" t="0" r="0" b="1270"/>
+            <wp:docPr id="1938916890" name="Imagen 1"/>
+            <wp:cNvGraphicFramePr>
+              <a:graphicFrameLocks xmlns:a="http://schemas.openxmlformats.org/drawingml/2006/main" noChangeAspect="1"/>
+            </wp:cNvGraphicFramePr>
+            <a:graphic xmlns:a="http://schemas.openxmlformats.org/drawingml/2006/main">
+              <a:graphicData uri="http://schemas.openxmlformats.org/drawingml/2006/picture">
+                <pic:pic xmlns:pic="http://schemas.openxmlformats.org/drawingml/2006/picture">
+                  <pic:nvPicPr>
+                    <pic:cNvPr id="1938916890" name=""/>
+                    <pic:cNvPicPr/>
+                  </pic:nvPicPr>
+                  <pic:blipFill>
+                    <a:blip r:embed="rId23"/>
+                    <a:stretch>
+                      <a:fillRect/>
+                    </a:stretch>
+                  </pic:blipFill>
+                  <pic:spPr>
+                    <a:xfrm>
+                      <a:off x="0" y="0"/>
+                      <a:ext cx="5943600" cy="5637530"/>
+                    </a:xfrm>
+                    <a:prstGeom prst="rect">
+                      <a:avLst/>
+                    </a:prstGeom>
+                  </pic:spPr>
+                </pic:pic>
+              </a:graphicData>
+            </a:graphic>
+          </wp:inline>
+        </w:drawing>
       </w:r>
     </w:p>
     <w:p>
@@ -3839,79 +6558,616 @@
         <w:jc w:val="both"/>
         <w:rPr>
           <w:rFonts w:ascii="Times New Roman" w:eastAsia="Times New Roman" w:hAnsi="Times New Roman" w:cs="Times New Roman"/>
+          <w:sz w:val="24"/>
+          <w:szCs w:val="24"/>
+        </w:rPr>
+      </w:pPr>
+      <w:r>
+        <w:rPr>
+          <w:rFonts w:ascii="Times New Roman" w:eastAsia="Times New Roman" w:hAnsi="Times New Roman" w:cs="Times New Roman"/>
+          <w:sz w:val="24"/>
+          <w:szCs w:val="24"/>
+        </w:rPr>
+        <w:t xml:space="preserve">Para </w:t>
+      </w:r>
+      <w:r>
+        <w:rPr>
+          <w:rFonts w:ascii="Times New Roman" w:eastAsia="Times New Roman" w:hAnsi="Times New Roman" w:cs="Times New Roman"/>
+          <w:sz w:val="24"/>
+          <w:szCs w:val="24"/>
+        </w:rPr>
+        <w:t xml:space="preserve">este último módulo se emplearon las funciones tanto de tareas como de ubicaciones como base para diseñar las funciones, como para adaptar los datos y consultas a las siguientes funciones: </w:t>
+      </w:r>
+    </w:p>
+    <w:tbl>
+      <w:tblPr>
+        <w:tblStyle w:val="Tablaconcuadrcula"/>
+        <w:tblW w:w="0" w:type="auto"/>
+        <w:tblLook w:val="04A0" w:firstRow="1" w:lastRow="0" w:firstColumn="1" w:lastColumn="0" w:noHBand="0" w:noVBand="1"/>
+      </w:tblPr>
+      <w:tblGrid>
+        <w:gridCol w:w="4675"/>
+        <w:gridCol w:w="4675"/>
+      </w:tblGrid>
+      <w:tr>
+        <w:tc>
+          <w:tcPr>
+            <w:tcW w:w="4675" w:type="dxa"/>
+          </w:tcPr>
+          <w:p>
+            <w:pPr>
+              <w:pStyle w:val="Prrafodelista"/>
+              <w:numPr>
+                <w:ilvl w:val="0"/>
+                <w:numId w:val="27"/>
+              </w:numPr>
+              <w:spacing w:line="360" w:lineRule="auto"/>
+              <w:jc w:val="both"/>
+              <w:rPr>
+                <w:rFonts w:ascii="Times New Roman" w:eastAsia="Times New Roman" w:hAnsi="Times New Roman" w:cs="Times New Roman"/>
+                <w:sz w:val="24"/>
+                <w:szCs w:val="24"/>
+              </w:rPr>
+            </w:pPr>
+            <w:proofErr w:type="spellStart"/>
+            <w:r>
+              <w:rPr>
+                <w:rFonts w:ascii="Times New Roman" w:eastAsia="Times New Roman" w:hAnsi="Times New Roman" w:cs="Times New Roman"/>
+                <w:sz w:val="24"/>
+                <w:szCs w:val="24"/>
+              </w:rPr>
+              <w:t>configurar_pestana_disponibilidad</w:t>
+            </w:r>
+            <w:proofErr w:type="spellEnd"/>
+          </w:p>
+        </w:tc>
+        <w:tc>
+          <w:tcPr>
+            <w:tcW w:w="4675" w:type="dxa"/>
+          </w:tcPr>
+          <w:p>
+            <w:pPr>
+              <w:pStyle w:val="Prrafodelista"/>
+              <w:numPr>
+                <w:ilvl w:val="0"/>
+                <w:numId w:val="27"/>
+              </w:numPr>
+              <w:spacing w:line="360" w:lineRule="auto"/>
+              <w:jc w:val="both"/>
+              <w:rPr>
+                <w:rFonts w:ascii="Times New Roman" w:eastAsia="Times New Roman" w:hAnsi="Times New Roman" w:cs="Times New Roman"/>
+                <w:sz w:val="24"/>
+                <w:szCs w:val="24"/>
+              </w:rPr>
+            </w:pPr>
+            <w:proofErr w:type="spellStart"/>
+            <w:r>
+              <w:rPr>
+                <w:rFonts w:ascii="Times New Roman" w:eastAsia="Times New Roman" w:hAnsi="Times New Roman" w:cs="Times New Roman"/>
+                <w:sz w:val="24"/>
+                <w:szCs w:val="24"/>
+              </w:rPr>
+              <w:t>datos_disponibilidad_formulario</w:t>
+            </w:r>
+            <w:proofErr w:type="spellEnd"/>
+          </w:p>
+        </w:tc>
+      </w:tr>
+      <w:tr>
+        <w:tc>
+          <w:tcPr>
+            <w:tcW w:w="4675" w:type="dxa"/>
+          </w:tcPr>
+          <w:p>
+            <w:pPr>
+              <w:pStyle w:val="Prrafodelista"/>
+              <w:numPr>
+                <w:ilvl w:val="0"/>
+                <w:numId w:val="27"/>
+              </w:numPr>
+              <w:spacing w:line="360" w:lineRule="auto"/>
+              <w:jc w:val="both"/>
+              <w:rPr>
+                <w:rFonts w:ascii="Times New Roman" w:eastAsia="Times New Roman" w:hAnsi="Times New Roman" w:cs="Times New Roman"/>
+                <w:sz w:val="24"/>
+                <w:szCs w:val="24"/>
+              </w:rPr>
+            </w:pPr>
+            <w:proofErr w:type="spellStart"/>
+            <w:r>
+              <w:rPr>
+                <w:rFonts w:ascii="Times New Roman" w:eastAsia="Times New Roman" w:hAnsi="Times New Roman" w:cs="Times New Roman"/>
+                <w:sz w:val="24"/>
+                <w:szCs w:val="24"/>
+              </w:rPr>
+              <w:t>disponibilidad_seleccionada_id</w:t>
+            </w:r>
+            <w:proofErr w:type="spellEnd"/>
+          </w:p>
+        </w:tc>
+        <w:tc>
+          <w:tcPr>
+            <w:tcW w:w="4675" w:type="dxa"/>
+          </w:tcPr>
+          <w:p>
+            <w:pPr>
+              <w:pStyle w:val="Prrafodelista"/>
+              <w:numPr>
+                <w:ilvl w:val="0"/>
+                <w:numId w:val="27"/>
+              </w:numPr>
+              <w:spacing w:line="360" w:lineRule="auto"/>
+              <w:jc w:val="both"/>
+              <w:rPr>
+                <w:rFonts w:ascii="Times New Roman" w:eastAsia="Times New Roman" w:hAnsi="Times New Roman" w:cs="Times New Roman"/>
+                <w:sz w:val="24"/>
+                <w:szCs w:val="24"/>
+              </w:rPr>
+            </w:pPr>
+            <w:proofErr w:type="spellStart"/>
+            <w:r>
+              <w:rPr>
+                <w:rFonts w:ascii="Times New Roman" w:eastAsia="Times New Roman" w:hAnsi="Times New Roman" w:cs="Times New Roman"/>
+                <w:sz w:val="24"/>
+                <w:szCs w:val="24"/>
+              </w:rPr>
+              <w:t>agregar_disponibilidad</w:t>
+            </w:r>
+            <w:proofErr w:type="spellEnd"/>
+          </w:p>
+        </w:tc>
+      </w:tr>
+      <w:tr>
+        <w:tc>
+          <w:tcPr>
+            <w:tcW w:w="4675" w:type="dxa"/>
+          </w:tcPr>
+          <w:p>
+            <w:pPr>
+              <w:pStyle w:val="Prrafodelista"/>
+              <w:numPr>
+                <w:ilvl w:val="0"/>
+                <w:numId w:val="27"/>
+              </w:numPr>
+              <w:spacing w:line="360" w:lineRule="auto"/>
+              <w:jc w:val="both"/>
+              <w:rPr>
+                <w:rFonts w:ascii="Times New Roman" w:eastAsia="Times New Roman" w:hAnsi="Times New Roman" w:cs="Times New Roman"/>
+                <w:sz w:val="24"/>
+                <w:szCs w:val="24"/>
+              </w:rPr>
+            </w:pPr>
+            <w:proofErr w:type="spellStart"/>
+            <w:r>
+              <w:rPr>
+                <w:rFonts w:ascii="Times New Roman" w:eastAsia="Times New Roman" w:hAnsi="Times New Roman" w:cs="Times New Roman"/>
+                <w:sz w:val="24"/>
+                <w:szCs w:val="24"/>
+              </w:rPr>
+              <w:t>cargar_disponibilidad_seleccionada</w:t>
+            </w:r>
+            <w:proofErr w:type="spellEnd"/>
+          </w:p>
+        </w:tc>
+        <w:tc>
+          <w:tcPr>
+            <w:tcW w:w="4675" w:type="dxa"/>
+          </w:tcPr>
+          <w:p>
+            <w:pPr>
+              <w:pStyle w:val="Prrafodelista"/>
+              <w:numPr>
+                <w:ilvl w:val="0"/>
+                <w:numId w:val="27"/>
+              </w:numPr>
+              <w:spacing w:line="360" w:lineRule="auto"/>
+              <w:jc w:val="both"/>
+              <w:rPr>
+                <w:rFonts w:ascii="Times New Roman" w:eastAsia="Times New Roman" w:hAnsi="Times New Roman" w:cs="Times New Roman"/>
+                <w:sz w:val="24"/>
+                <w:szCs w:val="24"/>
+              </w:rPr>
+            </w:pPr>
+            <w:proofErr w:type="spellStart"/>
+            <w:r>
+              <w:rPr>
+                <w:rFonts w:ascii="Times New Roman" w:eastAsia="Times New Roman" w:hAnsi="Times New Roman" w:cs="Times New Roman"/>
+                <w:sz w:val="24"/>
+                <w:szCs w:val="24"/>
+              </w:rPr>
+              <w:t>actualizar_disponibilidad</w:t>
+            </w:r>
+            <w:proofErr w:type="spellEnd"/>
+          </w:p>
+        </w:tc>
+      </w:tr>
+      <w:tr>
+        <w:tc>
+          <w:tcPr>
+            <w:tcW w:w="4675" w:type="dxa"/>
+          </w:tcPr>
+          <w:p>
+            <w:pPr>
+              <w:pStyle w:val="Prrafodelista"/>
+              <w:numPr>
+                <w:ilvl w:val="0"/>
+                <w:numId w:val="27"/>
+              </w:numPr>
+              <w:spacing w:line="360" w:lineRule="auto"/>
+              <w:jc w:val="both"/>
+              <w:rPr>
+                <w:rFonts w:ascii="Times New Roman" w:eastAsia="Times New Roman" w:hAnsi="Times New Roman" w:cs="Times New Roman"/>
+                <w:sz w:val="24"/>
+                <w:szCs w:val="24"/>
+              </w:rPr>
+            </w:pPr>
+            <w:proofErr w:type="spellStart"/>
+            <w:r>
+              <w:rPr>
+                <w:rFonts w:ascii="Times New Roman" w:eastAsia="Times New Roman" w:hAnsi="Times New Roman" w:cs="Times New Roman"/>
+                <w:sz w:val="24"/>
+                <w:szCs w:val="24"/>
+              </w:rPr>
+              <w:t>limpiar_form_disponibilidad</w:t>
+            </w:r>
+            <w:proofErr w:type="spellEnd"/>
+          </w:p>
+        </w:tc>
+        <w:tc>
+          <w:tcPr>
+            <w:tcW w:w="4675" w:type="dxa"/>
+          </w:tcPr>
+          <w:p>
+            <w:pPr>
+              <w:pStyle w:val="Prrafodelista"/>
+              <w:numPr>
+                <w:ilvl w:val="0"/>
+                <w:numId w:val="27"/>
+              </w:numPr>
+              <w:spacing w:line="360" w:lineRule="auto"/>
+              <w:jc w:val="both"/>
+              <w:rPr>
+                <w:rFonts w:ascii="Times New Roman" w:eastAsia="Times New Roman" w:hAnsi="Times New Roman" w:cs="Times New Roman"/>
+                <w:sz w:val="24"/>
+                <w:szCs w:val="24"/>
+              </w:rPr>
+            </w:pPr>
+            <w:proofErr w:type="spellStart"/>
+            <w:r>
+              <w:rPr>
+                <w:rFonts w:ascii="Times New Roman" w:eastAsia="Times New Roman" w:hAnsi="Times New Roman" w:cs="Times New Roman"/>
+                <w:sz w:val="24"/>
+                <w:szCs w:val="24"/>
+              </w:rPr>
+              <w:t>eliminar_disponibilidad</w:t>
+            </w:r>
+            <w:proofErr w:type="spellEnd"/>
+          </w:p>
+        </w:tc>
+      </w:tr>
+    </w:tbl>
+    <w:p>
+      <w:pPr>
+        <w:spacing w:line="360" w:lineRule="auto"/>
+        <w:jc w:val="both"/>
+        <w:rPr>
+          <w:rFonts w:ascii="Times New Roman" w:eastAsia="Times New Roman" w:hAnsi="Times New Roman" w:cs="Times New Roman"/>
+          <w:sz w:val="24"/>
+          <w:szCs w:val="24"/>
+        </w:rPr>
+      </w:pPr>
+      <w:r>
+        <w:rPr>
+          <w:rFonts w:ascii="Times New Roman" w:eastAsia="Times New Roman" w:hAnsi="Times New Roman" w:cs="Times New Roman"/>
           <w:sz w:val="28"/>
           <w:szCs w:val="28"/>
         </w:rPr>
-      </w:pPr>
-      <w:r>
+        <w:lastRenderedPageBreak/>
+        <w:t>Referencias</w:t>
+      </w:r>
+    </w:p>
+    <w:p>
+      <w:pPr>
+        <w:spacing w:line="360" w:lineRule="auto"/>
+        <w:ind w:left="720" w:hanging="720"/>
+        <w:jc w:val="both"/>
+        <w:rPr>
+          <w:rFonts w:ascii="Times New Roman" w:eastAsia="Times New Roman" w:hAnsi="Times New Roman" w:cs="Times New Roman"/>
+          <w:sz w:val="24"/>
+          <w:szCs w:val="24"/>
+        </w:rPr>
+      </w:pPr>
+      <w:r>
+        <w:rPr>
+          <w:rFonts w:ascii="Times New Roman" w:eastAsia="Times New Roman" w:hAnsi="Times New Roman" w:cs="Times New Roman"/>
+          <w:sz w:val="24"/>
+          <w:szCs w:val="24"/>
+        </w:rPr>
+        <w:t xml:space="preserve">LabEx. (s.f.). </w:t>
+      </w:r>
+      <w:r>
+        <w:rPr>
+          <w:rFonts w:ascii="Times New Roman" w:eastAsia="Times New Roman" w:hAnsi="Times New Roman" w:cs="Times New Roman"/>
+          <w:sz w:val="24"/>
+          <w:szCs w:val="24"/>
+        </w:rPr>
+        <w:t>Administración de Vistas en PostgreSQL</w:t>
+      </w:r>
+      <w:r>
+        <w:rPr>
+          <w:rFonts w:ascii="Times New Roman" w:eastAsia="Times New Roman" w:hAnsi="Times New Roman" w:cs="Times New Roman"/>
+          <w:sz w:val="24"/>
+          <w:szCs w:val="24"/>
+        </w:rPr>
+        <w:t xml:space="preserve"> </w:t>
+      </w:r>
+      <w:hyperlink r:id="rId24" w:history="1">
+        <w:r>
+          <w:rPr>
+            <w:rStyle w:val="Hipervnculo"/>
+            <w:rFonts w:ascii="Times New Roman" w:eastAsia="Times New Roman" w:hAnsi="Times New Roman" w:cs="Times New Roman"/>
+            <w:sz w:val="24"/>
+            <w:szCs w:val="24"/>
+          </w:rPr>
+          <w:t>https://labex.io/es/tutorials/postgresql-postgresql-views-management-550966</w:t>
+        </w:r>
+      </w:hyperlink>
+      <w:r>
+        <w:rPr>
+          <w:rFonts w:ascii="Times New Roman" w:eastAsia="Times New Roman" w:hAnsi="Times New Roman" w:cs="Times New Roman"/>
+          <w:sz w:val="24"/>
+          <w:szCs w:val="24"/>
+        </w:rPr>
+        <w:t xml:space="preserve"> </w:t>
+      </w:r>
+    </w:p>
+    <w:p>
+      <w:pPr>
+        <w:spacing w:line="360" w:lineRule="auto"/>
+        <w:ind w:left="720" w:hanging="720"/>
+        <w:jc w:val="both"/>
+        <w:rPr>
+          <w:rFonts w:ascii="Times New Roman" w:eastAsia="Times New Roman" w:hAnsi="Times New Roman" w:cs="Times New Roman"/>
+          <w:sz w:val="24"/>
+          <w:szCs w:val="24"/>
+        </w:rPr>
+      </w:pPr>
+      <w:r>
+        <w:rPr>
+          <w:rFonts w:ascii="Times New Roman" w:eastAsia="Times New Roman" w:hAnsi="Times New Roman" w:cs="Times New Roman"/>
+          <w:sz w:val="24"/>
+          <w:szCs w:val="24"/>
+        </w:rPr>
+        <w:t>PostgreSQL</w:t>
+      </w:r>
+      <w:r>
+        <w:rPr>
+          <w:rFonts w:ascii="Times New Roman" w:eastAsia="Times New Roman" w:hAnsi="Times New Roman" w:cs="Times New Roman"/>
+          <w:sz w:val="24"/>
+          <w:szCs w:val="24"/>
+        </w:rPr>
+        <w:t xml:space="preserve">. (2026). </w:t>
+      </w:r>
+      <w:r>
+        <w:rPr>
+          <w:rFonts w:ascii="Times New Roman" w:eastAsia="Times New Roman" w:hAnsi="Times New Roman" w:cs="Times New Roman"/>
+          <w:sz w:val="24"/>
+          <w:szCs w:val="24"/>
+        </w:rPr>
+        <w:t xml:space="preserve">7.2. Table </w:t>
+      </w:r>
+      <w:proofErr w:type="spellStart"/>
+      <w:r>
+        <w:rPr>
+          <w:rFonts w:ascii="Times New Roman" w:eastAsia="Times New Roman" w:hAnsi="Times New Roman" w:cs="Times New Roman"/>
+          <w:sz w:val="24"/>
+          <w:szCs w:val="24"/>
+        </w:rPr>
+        <w:t>Expressions</w:t>
+      </w:r>
+      <w:proofErr w:type="spellEnd"/>
+      <w:r>
+        <w:rPr>
+          <w:rFonts w:ascii="Times New Roman" w:eastAsia="Times New Roman" w:hAnsi="Times New Roman" w:cs="Times New Roman"/>
+          <w:sz w:val="24"/>
+          <w:szCs w:val="24"/>
+        </w:rPr>
+        <w:t xml:space="preserve"> </w:t>
+      </w:r>
+      <w:proofErr w:type="spellStart"/>
+      <w:r>
+        <w:rPr>
+          <w:rFonts w:ascii="Times New Roman" w:eastAsia="Times New Roman" w:hAnsi="Times New Roman" w:cs="Times New Roman"/>
+          <w:sz w:val="24"/>
+          <w:szCs w:val="24"/>
+        </w:rPr>
+        <w:t>Chapter</w:t>
+      </w:r>
+      <w:proofErr w:type="spellEnd"/>
+      <w:r>
+        <w:rPr>
+          <w:rFonts w:ascii="Times New Roman" w:eastAsia="Times New Roman" w:hAnsi="Times New Roman" w:cs="Times New Roman"/>
+          <w:sz w:val="24"/>
+          <w:szCs w:val="24"/>
+        </w:rPr>
+        <w:t xml:space="preserve"> 7. </w:t>
+      </w:r>
+      <w:proofErr w:type="spellStart"/>
+      <w:r>
+        <w:rPr>
+          <w:rFonts w:ascii="Times New Roman" w:eastAsia="Times New Roman" w:hAnsi="Times New Roman" w:cs="Times New Roman"/>
+          <w:sz w:val="24"/>
+          <w:szCs w:val="24"/>
+        </w:rPr>
+        <w:t>Queries</w:t>
+      </w:r>
+      <w:proofErr w:type="spellEnd"/>
+      <w:r>
+        <w:rPr>
+          <w:rFonts w:ascii="Times New Roman" w:eastAsia="Times New Roman" w:hAnsi="Times New Roman" w:cs="Times New Roman"/>
+          <w:sz w:val="24"/>
+          <w:szCs w:val="24"/>
+        </w:rPr>
+        <w:t xml:space="preserve">. </w:t>
+      </w:r>
+      <w:hyperlink r:id="rId25" w:history="1">
+        <w:r>
+          <w:rPr>
+            <w:rStyle w:val="Hipervnculo"/>
+            <w:rFonts w:ascii="Times New Roman" w:eastAsia="Times New Roman" w:hAnsi="Times New Roman" w:cs="Times New Roman"/>
+            <w:sz w:val="24"/>
+            <w:szCs w:val="24"/>
+          </w:rPr>
+          <w:t>https://www.postgresql.org/docs/current/queries-table-expressions.html</w:t>
+        </w:r>
+      </w:hyperlink>
+    </w:p>
+    <w:p>
+      <w:pPr>
+        <w:spacing w:line="360" w:lineRule="auto"/>
+        <w:jc w:val="both"/>
+      </w:pPr>
+      <w:r>
+        <w:rPr>
+          <w:rFonts w:ascii="Times New Roman" w:eastAsia="Times New Roman" w:hAnsi="Times New Roman" w:cs="Times New Roman"/>
+          <w:sz w:val="24"/>
+          <w:szCs w:val="24"/>
+        </w:rPr>
+        <w:t xml:space="preserve">Python. (s.f.). </w:t>
+      </w:r>
+      <w:proofErr w:type="spellStart"/>
+      <w:r>
+        <w:rPr>
+          <w:rFonts w:ascii="Times New Roman" w:eastAsia="Times New Roman" w:hAnsi="Times New Roman" w:cs="Times New Roman"/>
+          <w:sz w:val="24"/>
+          <w:szCs w:val="24"/>
+        </w:rPr>
+        <w:t>tkinter</w:t>
+      </w:r>
+      <w:proofErr w:type="spellEnd"/>
+      <w:r>
+        <w:rPr>
+          <w:rFonts w:ascii="Times New Roman" w:eastAsia="Times New Roman" w:hAnsi="Times New Roman" w:cs="Times New Roman"/>
+          <w:sz w:val="24"/>
+          <w:szCs w:val="24"/>
+        </w:rPr>
+        <w:t xml:space="preserve"> — Python </w:t>
+      </w:r>
+      <w:proofErr w:type="gramStart"/>
+      <w:r>
+        <w:rPr>
+          <w:rFonts w:ascii="Times New Roman" w:eastAsia="Times New Roman" w:hAnsi="Times New Roman" w:cs="Times New Roman"/>
+          <w:sz w:val="24"/>
+          <w:szCs w:val="24"/>
+        </w:rPr>
+        <w:t>interface</w:t>
+      </w:r>
+      <w:proofErr w:type="gramEnd"/>
+      <w:r>
+        <w:rPr>
+          <w:rFonts w:ascii="Times New Roman" w:eastAsia="Times New Roman" w:hAnsi="Times New Roman" w:cs="Times New Roman"/>
+          <w:sz w:val="24"/>
+          <w:szCs w:val="24"/>
+        </w:rPr>
+        <w:t xml:space="preserve"> </w:t>
+      </w:r>
+      <w:proofErr w:type="spellStart"/>
+      <w:r>
+        <w:rPr>
+          <w:rFonts w:ascii="Times New Roman" w:eastAsia="Times New Roman" w:hAnsi="Times New Roman" w:cs="Times New Roman"/>
+          <w:sz w:val="24"/>
+          <w:szCs w:val="24"/>
+        </w:rPr>
+        <w:t>to</w:t>
+      </w:r>
+      <w:proofErr w:type="spellEnd"/>
+      <w:r>
+        <w:rPr>
+          <w:rFonts w:ascii="Times New Roman" w:eastAsia="Times New Roman" w:hAnsi="Times New Roman" w:cs="Times New Roman"/>
+          <w:sz w:val="24"/>
+          <w:szCs w:val="24"/>
+        </w:rPr>
+        <w:t xml:space="preserve"> </w:t>
+      </w:r>
+      <w:proofErr w:type="spellStart"/>
+      <w:r>
+        <w:rPr>
+          <w:rFonts w:ascii="Times New Roman" w:eastAsia="Times New Roman" w:hAnsi="Times New Roman" w:cs="Times New Roman"/>
+          <w:sz w:val="24"/>
+          <w:szCs w:val="24"/>
+        </w:rPr>
+        <w:t>Tcl</w:t>
+      </w:r>
+      <w:proofErr w:type="spellEnd"/>
+      <w:r>
+        <w:rPr>
+          <w:rFonts w:ascii="Times New Roman" w:eastAsia="Times New Roman" w:hAnsi="Times New Roman" w:cs="Times New Roman"/>
+          <w:sz w:val="24"/>
+          <w:szCs w:val="24"/>
+        </w:rPr>
+        <w:t>/</w:t>
+      </w:r>
+      <w:proofErr w:type="spellStart"/>
+      <w:r>
+        <w:rPr>
+          <w:rFonts w:ascii="Times New Roman" w:eastAsia="Times New Roman" w:hAnsi="Times New Roman" w:cs="Times New Roman"/>
+          <w:sz w:val="24"/>
+          <w:szCs w:val="24"/>
+        </w:rPr>
+        <w:t>Tk</w:t>
+      </w:r>
+      <w:proofErr w:type="spellEnd"/>
+      <w:r>
+        <w:rPr>
+          <w:rFonts w:ascii="Times New Roman" w:eastAsia="Times New Roman" w:hAnsi="Times New Roman" w:cs="Times New Roman"/>
+          <w:sz w:val="24"/>
+          <w:szCs w:val="24"/>
+        </w:rPr>
+        <w:t xml:space="preserve">. </w:t>
+      </w:r>
+      <w:hyperlink r:id="rId26" w:history="1">
+        <w:r>
+          <w:rPr>
+            <w:rStyle w:val="Hipervnculo"/>
+            <w:rFonts w:ascii="Times New Roman" w:eastAsia="Times New Roman" w:hAnsi="Times New Roman" w:cs="Times New Roman"/>
+            <w:sz w:val="24"/>
+            <w:szCs w:val="24"/>
+          </w:rPr>
+          <w:t>https://docs.python.org/3/library/tkinter.html</w:t>
+        </w:r>
+      </w:hyperlink>
+    </w:p>
+    <w:p>
+      <w:r>
+        <w:br w:type="page"/>
+      </w:r>
+    </w:p>
+    <w:p>
+      <w:pPr>
+        <w:jc w:val="both"/>
         <w:rPr>
           <w:rFonts w:ascii="Times New Roman" w:eastAsia="Times New Roman" w:hAnsi="Times New Roman" w:cs="Times New Roman"/>
           <w:sz w:val="28"/>
           <w:szCs w:val="28"/>
         </w:rPr>
-        <w:br w:type="page"/>
-      </w:r>
-    </w:p>
-    <w:p>
-      <w:pPr>
+      </w:pPr>
+      <w:r>
         <w:rPr>
           <w:rFonts w:ascii="Times New Roman" w:eastAsia="Times New Roman" w:hAnsi="Times New Roman" w:cs="Times New Roman"/>
           <w:sz w:val="28"/>
           <w:szCs w:val="28"/>
         </w:rPr>
-      </w:pPr>
-      <w:r>
+        <w:lastRenderedPageBreak/>
+        <w:t>Apéndice A: Declaración del uso de Inteligencia Artificial</w:t>
+      </w:r>
+    </w:p>
+    <w:p>
+      <w:pPr>
+        <w:jc w:val="both"/>
         <w:rPr>
           <w:rFonts w:ascii="Times New Roman" w:eastAsia="Times New Roman" w:hAnsi="Times New Roman" w:cs="Times New Roman"/>
           <w:sz w:val="28"/>
           <w:szCs w:val="28"/>
-        </w:rPr>
-        <w:lastRenderedPageBreak/>
-        <w:t>Referencias</w:t>
-      </w:r>
-    </w:p>
-    <w:p>
-      <w:pPr>
-        <w:rPr>
-          <w:rFonts w:ascii="Times New Roman" w:eastAsia="Times New Roman" w:hAnsi="Times New Roman" w:cs="Times New Roman"/>
-          <w:sz w:val="28"/>
-          <w:szCs w:val="28"/>
-        </w:rPr>
-      </w:pPr>
-      <w:r>
-        <w:rPr>
-          <w:rFonts w:ascii="Times New Roman" w:eastAsia="Times New Roman" w:hAnsi="Times New Roman" w:cs="Times New Roman"/>
-          <w:sz w:val="28"/>
-          <w:szCs w:val="28"/>
-        </w:rPr>
-        <w:br w:type="page"/>
-      </w:r>
-    </w:p>
-    <w:p>
-      <w:pPr>
-        <w:jc w:val="both"/>
-        <w:rPr>
-          <w:rFonts w:ascii="Times New Roman" w:eastAsia="Times New Roman" w:hAnsi="Times New Roman" w:cs="Times New Roman"/>
-          <w:sz w:val="28"/>
-          <w:szCs w:val="28"/>
-        </w:rPr>
-      </w:pPr>
-      <w:r>
-        <w:rPr>
-          <w:rFonts w:ascii="Times New Roman" w:eastAsia="Times New Roman" w:hAnsi="Times New Roman" w:cs="Times New Roman"/>
-          <w:sz w:val="28"/>
-          <w:szCs w:val="28"/>
-        </w:rPr>
-        <w:lastRenderedPageBreak/>
-        <w:t>Apéndice A: Declaración del uso de Inteligencia Artificial</w:t>
-      </w:r>
-    </w:p>
-    <w:p>
-      <w:pPr>
-        <w:rPr>
-          <w:rFonts w:ascii="Times New Roman" w:eastAsia="Times New Roman" w:hAnsi="Times New Roman" w:cs="Times New Roman"/>
-          <w:sz w:val="24"/>
-          <w:szCs w:val="24"/>
         </w:rPr>
       </w:pPr>
     </w:p>
@@ -4029,6 +7285,14 @@
                 <w:szCs w:val="24"/>
               </w:rPr>
             </w:pPr>
+            <w:r>
+              <w:rPr>
+                <w:rFonts w:ascii="Times New Roman" w:eastAsia="Times New Roman" w:hAnsi="Times New Roman" w:cs="Times New Roman"/>
+                <w:sz w:val="24"/>
+                <w:szCs w:val="24"/>
+              </w:rPr>
+              <w:t>Fase 4: Modelo Físico</w:t>
+            </w:r>
           </w:p>
         </w:tc>
       </w:tr>
@@ -4151,6 +7415,14 @@
                 <w:szCs w:val="24"/>
               </w:rPr>
             </w:pPr>
+            <w:r>
+              <w:rPr>
+                <w:rFonts w:ascii="Times New Roman" w:eastAsia="Times New Roman" w:hAnsi="Times New Roman" w:cs="Times New Roman"/>
+                <w:sz w:val="24"/>
+                <w:szCs w:val="24"/>
+              </w:rPr>
+              <w:t>Vistas y abstracciones para la lógica de negocio ampliadas</w:t>
+            </w:r>
           </w:p>
         </w:tc>
       </w:tr>
@@ -4196,6 +7468,122 @@
                 <w:szCs w:val="24"/>
               </w:rPr>
             </w:pPr>
+            <w:r>
+              <w:rPr>
+                <w:rFonts w:ascii="Times New Roman" w:eastAsia="Times New Roman" w:hAnsi="Times New Roman" w:cs="Times New Roman"/>
+                <w:sz w:val="24"/>
+                <w:szCs w:val="24"/>
+              </w:rPr>
+              <w:t>Se utilizó la herramienta para consultar conceptos de consultas de Bases de Datos, específicamente cómo funcionan los JOIN, COUNT, cómo saber cuándo son necesarios de emplear y las abreviaciones de las tablas en la consulta como eventos e.</w:t>
+            </w:r>
+          </w:p>
+        </w:tc>
+      </w:tr>
+    </w:tbl>
+    <w:p>
+      <w:pPr>
+        <w:rPr>
+          <w:rFonts w:ascii="Times New Roman" w:eastAsia="Times New Roman" w:hAnsi="Times New Roman" w:cs="Times New Roman"/>
+          <w:sz w:val="24"/>
+          <w:szCs w:val="24"/>
+        </w:rPr>
+      </w:pPr>
+    </w:p>
+    <w:p>
+      <w:pPr>
+        <w:rPr>
+          <w:rFonts w:ascii="Times New Roman" w:eastAsia="Times New Roman" w:hAnsi="Times New Roman" w:cs="Times New Roman"/>
+          <w:sz w:val="24"/>
+          <w:szCs w:val="24"/>
+        </w:rPr>
+      </w:pPr>
+      <w:r>
+        <w:rPr>
+          <w:rFonts w:ascii="Times New Roman" w:eastAsia="Times New Roman" w:hAnsi="Times New Roman" w:cs="Times New Roman"/>
+          <w:sz w:val="24"/>
+          <w:szCs w:val="24"/>
+        </w:rPr>
+        <w:br w:type="page"/>
+      </w:r>
+    </w:p>
+    <w:p>
+      <w:pPr>
+        <w:rPr>
+          <w:rFonts w:ascii="Times New Roman" w:eastAsia="Times New Roman" w:hAnsi="Times New Roman" w:cs="Times New Roman"/>
+          <w:sz w:val="24"/>
+          <w:szCs w:val="24"/>
+        </w:rPr>
+      </w:pPr>
+    </w:p>
+    <w:tbl>
+      <w:tblPr>
+        <w:tblStyle w:val="Tablaconcuadrcula"/>
+        <w:tblW w:w="0" w:type="auto"/>
+        <w:tblLook w:val="04A0" w:firstRow="1" w:lastRow="0" w:firstColumn="1" w:lastColumn="0" w:noHBand="0" w:noVBand="1"/>
+      </w:tblPr>
+      <w:tblGrid>
+        <w:gridCol w:w="3114"/>
+        <w:gridCol w:w="6236"/>
+      </w:tblGrid>
+      <w:tr>
+        <w:tc>
+          <w:tcPr>
+            <w:tcW w:w="3114" w:type="dxa"/>
+            <w:shd w:val="clear" w:color="auto" w:fill="002060"/>
+          </w:tcPr>
+          <w:p>
+            <w:pPr>
+              <w:spacing w:before="120" w:line="360" w:lineRule="auto"/>
+              <w:rPr>
+                <w:rFonts w:ascii="Times New Roman" w:eastAsia="Times New Roman" w:hAnsi="Times New Roman" w:cs="Times New Roman"/>
+                <w:b/>
+                <w:bCs/>
+                <w:color w:val="FFFFFF" w:themeColor="background1"/>
+                <w:sz w:val="24"/>
+                <w:szCs w:val="24"/>
+              </w:rPr>
+            </w:pPr>
+            <w:r>
+              <w:rPr>
+                <w:rFonts w:ascii="Times New Roman" w:eastAsia="Times New Roman" w:hAnsi="Times New Roman" w:cs="Times New Roman"/>
+                <w:b/>
+                <w:bCs/>
+                <w:color w:val="FFFFFF" w:themeColor="background1"/>
+                <w:sz w:val="24"/>
+                <w:szCs w:val="24"/>
+              </w:rPr>
+              <w:t>Campo</w:t>
+            </w:r>
+          </w:p>
+        </w:tc>
+        <w:tc>
+          <w:tcPr>
+            <w:tcW w:w="6236" w:type="dxa"/>
+            <w:shd w:val="clear" w:color="auto" w:fill="002060"/>
+          </w:tcPr>
+          <w:p>
+            <w:pPr>
+              <w:spacing w:before="120" w:line="360" w:lineRule="auto"/>
+              <w:rPr>
+                <w:rFonts w:ascii="Times New Roman" w:eastAsia="Times New Roman" w:hAnsi="Times New Roman" w:cs="Times New Roman"/>
+                <w:b/>
+                <w:bCs/>
+                <w:color w:val="FFFFFF" w:themeColor="background1"/>
+                <w:sz w:val="24"/>
+                <w:szCs w:val="24"/>
+              </w:rPr>
+            </w:pPr>
+            <w:r>
+              <w:rPr>
+                <w:rFonts w:ascii="Times New Roman" w:eastAsia="Times New Roman" w:hAnsi="Times New Roman" w:cs="Times New Roman"/>
+                <w:b/>
+                <w:bCs/>
+                <w:color w:val="FFFFFF" w:themeColor="background1"/>
+                <w:sz w:val="24"/>
+                <w:szCs w:val="24"/>
+              </w:rPr>
+              <w:t>Descripción</w:t>
+            </w:r>
           </w:p>
         </w:tc>
       </w:tr>
@@ -4224,7 +7612,7 @@
                 <w:sz w:val="24"/>
                 <w:szCs w:val="24"/>
               </w:rPr>
-              <w:t>Declaración de autoría</w:t>
+              <w:t>Ejercicio</w:t>
             </w:r>
           </w:p>
         </w:tc>
@@ -4247,6 +7635,258 @@
                 <w:sz w:val="24"/>
                 <w:szCs w:val="24"/>
               </w:rPr>
+              <w:t>Fase 5: Las ampliaciones en Aplicación</w:t>
+            </w:r>
+          </w:p>
+        </w:tc>
+      </w:tr>
+      <w:tr>
+        <w:tc>
+          <w:tcPr>
+            <w:tcW w:w="3114" w:type="dxa"/>
+            <w:shd w:val="clear" w:color="auto" w:fill="D0CECE" w:themeFill="background2" w:themeFillShade="E6"/>
+          </w:tcPr>
+          <w:p>
+            <w:pPr>
+              <w:spacing w:before="120" w:line="360" w:lineRule="auto"/>
+              <w:rPr>
+                <w:rFonts w:ascii="Times New Roman" w:eastAsia="Times New Roman" w:hAnsi="Times New Roman" w:cs="Times New Roman"/>
+                <w:b/>
+                <w:bCs/>
+                <w:sz w:val="24"/>
+                <w:szCs w:val="24"/>
+              </w:rPr>
+            </w:pPr>
+            <w:r>
+              <w:rPr>
+                <w:rFonts w:ascii="Times New Roman" w:eastAsia="Times New Roman" w:hAnsi="Times New Roman" w:cs="Times New Roman"/>
+                <w:b/>
+                <w:bCs/>
+                <w:sz w:val="24"/>
+                <w:szCs w:val="24"/>
+              </w:rPr>
+              <w:t>Herramienta utilizada</w:t>
+            </w:r>
+          </w:p>
+        </w:tc>
+        <w:tc>
+          <w:tcPr>
+            <w:tcW w:w="6236" w:type="dxa"/>
+          </w:tcPr>
+          <w:p>
+            <w:pPr>
+              <w:spacing w:before="120" w:line="360" w:lineRule="auto"/>
+              <w:rPr>
+                <w:rFonts w:ascii="Times New Roman" w:eastAsia="Times New Roman" w:hAnsi="Times New Roman" w:cs="Times New Roman"/>
+                <w:sz w:val="24"/>
+                <w:szCs w:val="24"/>
+              </w:rPr>
+            </w:pPr>
+            <w:r>
+              <w:rPr>
+                <w:rFonts w:ascii="Times New Roman" w:eastAsia="Times New Roman" w:hAnsi="Times New Roman" w:cs="Times New Roman"/>
+                <w:sz w:val="24"/>
+                <w:szCs w:val="24"/>
+              </w:rPr>
+              <w:t>Claude (</w:t>
+            </w:r>
+            <w:r>
+              <w:rPr>
+                <w:rFonts w:ascii="Times New Roman" w:eastAsia="Times New Roman" w:hAnsi="Times New Roman" w:cs="Times New Roman"/>
+                <w:sz w:val="24"/>
+                <w:szCs w:val="24"/>
+              </w:rPr>
+              <w:t>Opus</w:t>
+            </w:r>
+            <w:r>
+              <w:rPr>
+                <w:rFonts w:ascii="Times New Roman" w:eastAsia="Times New Roman" w:hAnsi="Times New Roman" w:cs="Times New Roman"/>
+                <w:sz w:val="24"/>
+                <w:szCs w:val="24"/>
+              </w:rPr>
+              <w:t xml:space="preserve"> 5)</w:t>
+            </w:r>
+            <w:r>
+              <w:rPr>
+                <w:rFonts w:ascii="Times New Roman" w:eastAsia="Times New Roman" w:hAnsi="Times New Roman" w:cs="Times New Roman"/>
+                <w:sz w:val="24"/>
+                <w:szCs w:val="24"/>
+              </w:rPr>
+              <w:t>.</w:t>
+            </w:r>
+          </w:p>
+        </w:tc>
+      </w:tr>
+      <w:tr>
+        <w:tc>
+          <w:tcPr>
+            <w:tcW w:w="3114" w:type="dxa"/>
+            <w:shd w:val="clear" w:color="auto" w:fill="D0CECE" w:themeFill="background2" w:themeFillShade="E6"/>
+          </w:tcPr>
+          <w:p>
+            <w:pPr>
+              <w:spacing w:before="120" w:line="360" w:lineRule="auto"/>
+              <w:rPr>
+                <w:rFonts w:ascii="Times New Roman" w:eastAsia="Times New Roman" w:hAnsi="Times New Roman" w:cs="Times New Roman"/>
+                <w:b/>
+                <w:bCs/>
+                <w:sz w:val="24"/>
+                <w:szCs w:val="24"/>
+              </w:rPr>
+            </w:pPr>
+            <w:r>
+              <w:rPr>
+                <w:rFonts w:ascii="Times New Roman" w:eastAsia="Times New Roman" w:hAnsi="Times New Roman" w:cs="Times New Roman"/>
+                <w:b/>
+                <w:bCs/>
+                <w:sz w:val="24"/>
+                <w:szCs w:val="24"/>
+              </w:rPr>
+              <w:t>Etapa del trabajo</w:t>
+            </w:r>
+          </w:p>
+        </w:tc>
+        <w:tc>
+          <w:tcPr>
+            <w:tcW w:w="6236" w:type="dxa"/>
+          </w:tcPr>
+          <w:p>
+            <w:pPr>
+              <w:spacing w:before="120" w:line="360" w:lineRule="auto"/>
+              <w:rPr>
+                <w:rFonts w:ascii="Times New Roman" w:eastAsia="Times New Roman" w:hAnsi="Times New Roman" w:cs="Times New Roman"/>
+                <w:sz w:val="24"/>
+                <w:szCs w:val="24"/>
+              </w:rPr>
+            </w:pPr>
+            <w:r>
+              <w:rPr>
+                <w:rFonts w:ascii="Times New Roman" w:eastAsia="Times New Roman" w:hAnsi="Times New Roman" w:cs="Times New Roman"/>
+                <w:sz w:val="24"/>
+                <w:szCs w:val="24"/>
+              </w:rPr>
+              <w:t>Interfaz de reportes y revisión</w:t>
+            </w:r>
+          </w:p>
+        </w:tc>
+      </w:tr>
+      <w:tr>
+        <w:tc>
+          <w:tcPr>
+            <w:tcW w:w="3114" w:type="dxa"/>
+            <w:shd w:val="clear" w:color="auto" w:fill="D0CECE" w:themeFill="background2" w:themeFillShade="E6"/>
+          </w:tcPr>
+          <w:p>
+            <w:pPr>
+              <w:spacing w:before="120" w:line="360" w:lineRule="auto"/>
+              <w:rPr>
+                <w:rFonts w:ascii="Times New Roman" w:eastAsia="Times New Roman" w:hAnsi="Times New Roman" w:cs="Times New Roman"/>
+                <w:b/>
+                <w:bCs/>
+                <w:sz w:val="24"/>
+                <w:szCs w:val="24"/>
+              </w:rPr>
+            </w:pPr>
+            <w:r>
+              <w:rPr>
+                <w:rFonts w:ascii="Times New Roman" w:eastAsia="Times New Roman" w:hAnsi="Times New Roman" w:cs="Times New Roman"/>
+                <w:b/>
+                <w:bCs/>
+                <w:sz w:val="24"/>
+                <w:szCs w:val="24"/>
+              </w:rPr>
+              <w:t>Descripción breve del uso</w:t>
+            </w:r>
+          </w:p>
+        </w:tc>
+        <w:tc>
+          <w:tcPr>
+            <w:tcW w:w="6236" w:type="dxa"/>
+          </w:tcPr>
+          <w:p>
+            <w:pPr>
+              <w:spacing w:before="120" w:line="360" w:lineRule="auto"/>
+              <w:rPr>
+                <w:rFonts w:ascii="Times New Roman" w:eastAsia="Times New Roman" w:hAnsi="Times New Roman" w:cs="Times New Roman"/>
+                <w:sz w:val="24"/>
+                <w:szCs w:val="24"/>
+              </w:rPr>
+            </w:pPr>
+            <w:r>
+              <w:rPr>
+                <w:rFonts w:ascii="Times New Roman" w:eastAsia="Times New Roman" w:hAnsi="Times New Roman" w:cs="Times New Roman"/>
+                <w:sz w:val="24"/>
+                <w:szCs w:val="24"/>
+              </w:rPr>
+              <w:t xml:space="preserve">Se utilizó la herramienta para revisar los códigos de interfaz creados para los Módulos Ubicaciones, Tareas y Disponibilidad, ya que los mismos se crearon basados </w:t>
+            </w:r>
+            <w:r>
+              <w:rPr>
+                <w:rFonts w:ascii="Times New Roman" w:eastAsia="Times New Roman" w:hAnsi="Times New Roman" w:cs="Times New Roman"/>
+                <w:sz w:val="24"/>
+                <w:szCs w:val="24"/>
+              </w:rPr>
+              <w:t>del</w:t>
+            </w:r>
+            <w:r>
+              <w:rPr>
+                <w:rFonts w:ascii="Times New Roman" w:eastAsia="Times New Roman" w:hAnsi="Times New Roman" w:cs="Times New Roman"/>
+                <w:sz w:val="24"/>
+                <w:szCs w:val="24"/>
+              </w:rPr>
+              <w:t xml:space="preserve"> código ya existente de Eventos. Con ello se corrigieron errores como de sintaxis, inserción de datos y tener retroalimentación de las funciones creadas para llamar las vistas, creadas de la base de cargar datos.</w:t>
+            </w:r>
+          </w:p>
+        </w:tc>
+      </w:tr>
+      <w:tr>
+        <w:tc>
+          <w:tcPr>
+            <w:tcW w:w="3114" w:type="dxa"/>
+            <w:shd w:val="clear" w:color="auto" w:fill="D0CECE" w:themeFill="background2" w:themeFillShade="E6"/>
+          </w:tcPr>
+          <w:p>
+            <w:pPr>
+              <w:spacing w:before="120" w:line="360" w:lineRule="auto"/>
+              <w:rPr>
+                <w:rFonts w:ascii="Times New Roman" w:eastAsia="Times New Roman" w:hAnsi="Times New Roman" w:cs="Times New Roman"/>
+                <w:b/>
+                <w:bCs/>
+                <w:sz w:val="24"/>
+                <w:szCs w:val="24"/>
+              </w:rPr>
+            </w:pPr>
+            <w:r>
+              <w:rPr>
+                <w:rFonts w:ascii="Times New Roman" w:eastAsia="Times New Roman" w:hAnsi="Times New Roman" w:cs="Times New Roman"/>
+                <w:b/>
+                <w:bCs/>
+                <w:sz w:val="24"/>
+                <w:szCs w:val="24"/>
+              </w:rPr>
+              <w:t>Declaración de autoría</w:t>
+            </w:r>
+          </w:p>
+        </w:tc>
+        <w:tc>
+          <w:tcPr>
+            <w:tcW w:w="6236" w:type="dxa"/>
+          </w:tcPr>
+          <w:p>
+            <w:pPr>
+              <w:spacing w:before="120" w:line="360" w:lineRule="auto"/>
+              <w:rPr>
+                <w:rFonts w:ascii="Times New Roman" w:eastAsia="Times New Roman" w:hAnsi="Times New Roman" w:cs="Times New Roman"/>
+                <w:sz w:val="24"/>
+                <w:szCs w:val="24"/>
+              </w:rPr>
+            </w:pPr>
+            <w:r>
+              <w:rPr>
+                <w:rFonts w:ascii="Times New Roman" w:eastAsia="Times New Roman" w:hAnsi="Times New Roman" w:cs="Times New Roman"/>
+                <w:sz w:val="24"/>
+                <w:szCs w:val="24"/>
+              </w:rPr>
               <w:t>"Declaro que comprendo y puedo explicar la totalidad del</w:t>
             </w:r>
             <w:r>
@@ -4288,6 +7928,64 @@
     <w:p>
       <w:pPr>
         <w:spacing w:line="360" w:lineRule="auto"/>
+        <w:jc w:val="both"/>
+        <w:rPr>
+          <w:rFonts w:ascii="Times New Roman" w:eastAsia="Times New Roman" w:hAnsi="Times New Roman" w:cs="Times New Roman"/>
+          <w:sz w:val="24"/>
+          <w:szCs w:val="24"/>
+        </w:rPr>
+        <w:sectPr>
+          <w:headerReference w:type="default" r:id="rId27"/>
+          <w:footerReference w:type="default" r:id="rId28"/>
+          <w:pgSz w:w="12240" w:h="15840"/>
+          <w:pgMar w:top="1440" w:right="1440" w:bottom="1440" w:left="1440" w:header="720" w:footer="720" w:gutter="0"/>
+          <w:cols w:space="720"/>
+          <w:titlePg/>
+          <w:docGrid w:linePitch="299"/>
+        </w:sectPr>
+      </w:pPr>
+    </w:p>
+    <w:p>
+      <w:pPr>
+        <w:rPr>
+          <w:rFonts w:ascii="Times New Roman" w:eastAsia="Times New Roman" w:hAnsi="Times New Roman" w:cs="Times New Roman"/>
+          <w:sz w:val="24"/>
+          <w:szCs w:val="24"/>
+        </w:rPr>
+        <w:sectPr>
+          <w:type w:val="continuous"/>
+          <w:pgSz w:w="12240" w:h="15840"/>
+          <w:pgMar w:top="1440" w:right="1440" w:bottom="1440" w:left="1440" w:header="720" w:footer="720" w:gutter="0"/>
+          <w:pgNumType w:start="1"/>
+          <w:cols w:space="720"/>
+          <w:titlePg/>
+          <w:docGrid w:linePitch="299"/>
+        </w:sectPr>
+      </w:pPr>
+    </w:p>
+    <w:p>
+      <w:pPr>
+        <w:spacing w:line="360" w:lineRule="auto"/>
+        <w:jc w:val="both"/>
+        <w:rPr>
+          <w:rFonts w:ascii="Times New Roman" w:eastAsia="Times New Roman" w:hAnsi="Times New Roman" w:cs="Times New Roman"/>
+          <w:sz w:val="24"/>
+          <w:szCs w:val="24"/>
+        </w:rPr>
+        <w:sectPr>
+          <w:type w:val="continuous"/>
+          <w:pgSz w:w="12240" w:h="15840"/>
+          <w:pgMar w:top="1440" w:right="1440" w:bottom="1440" w:left="1440" w:header="720" w:footer="720" w:gutter="0"/>
+          <w:cols w:space="720"/>
+          <w:titlePg/>
+          <w:docGrid w:linePitch="299"/>
+        </w:sectPr>
+      </w:pPr>
+    </w:p>
+    <w:p>
+      <w:pPr>
+        <w:spacing w:line="360" w:lineRule="auto"/>
+        <w:jc w:val="both"/>
         <w:rPr>
           <w:rFonts w:ascii="Times New Roman" w:eastAsia="Times New Roman" w:hAnsi="Times New Roman" w:cs="Times New Roman"/>
           <w:sz w:val="24"/>
@@ -4296,11 +7994,9 @@
       </w:pPr>
     </w:p>
     <w:sectPr>
-      <w:headerReference w:type="default" r:id="rId14"/>
-      <w:footerReference w:type="default" r:id="rId15"/>
+      <w:type w:val="continuous"/>
       <w:pgSz w:w="12240" w:h="15840"/>
       <w:pgMar w:top="1440" w:right="1440" w:bottom="1440" w:left="1440" w:header="720" w:footer="720" w:gutter="0"/>
-      <w:pgNumType w:start="1"/>
       <w:cols w:space="720"/>
       <w:titlePg/>
       <w:docGrid w:linePitch="299"/>
@@ -4356,6 +8052,7 @@
         <w:color w:val="000000"/>
       </w:rPr>
     </w:pPr>
+    <w:proofErr w:type="spellStart"/>
     <w:r>
       <w:rPr>
         <w:rFonts w:ascii="Times New Roman" w:eastAsia="Times New Roman" w:hAnsi="Times New Roman" w:cs="Times New Roman"/>
@@ -4363,7 +8060,26 @@
         <w:sz w:val="24"/>
         <w:szCs w:val="24"/>
       </w:rPr>
-      <w:t xml:space="preserve">Pág | </w:t>
+      <w:t>Pág</w:t>
+    </w:r>
+    <w:proofErr w:type="spellEnd"/>
+    <w:r>
+      <w:rPr>
+        <w:rFonts w:ascii="Times New Roman" w:eastAsia="Times New Roman" w:hAnsi="Times New Roman" w:cs="Times New Roman"/>
+        <w:color w:val="000000"/>
+        <w:sz w:val="24"/>
+        <w:szCs w:val="24"/>
+      </w:rPr>
+      <w:t xml:space="preserve"> |</w:t>
+    </w:r>
+    <w:r>
+      <w:rPr>
+        <w:rFonts w:ascii="Times New Roman" w:eastAsia="Times New Roman" w:hAnsi="Times New Roman" w:cs="Times New Roman"/>
+        <w:color w:val="000000"/>
+        <w:sz w:val="24"/>
+        <w:szCs w:val="24"/>
+      </w:rPr>
+      <w:t xml:space="preserve"> </w:t>
     </w:r>
     <w:r>
       <w:rPr>
@@ -5770,6 +9486,118 @@
     </w:lvl>
   </w:abstractNum>
   <w:abstractNum w:abstractNumId="12" w15:restartNumberingAfterBreak="0">
+    <w:nsid w:val="4DFD3770"/>
+    <w:multiLevelType w:val="hybridMultilevel"/>
+    <w:tmpl w:val="F80A2410"/>
+    <w:lvl w:ilvl="0" w:tplc="69288088">
+      <w:numFmt w:val="bullet"/>
+      <w:lvlText w:val="-"/>
+      <w:lvlJc w:val="left"/>
+      <w:pPr>
+        <w:ind w:left="720" w:hanging="360"/>
+      </w:pPr>
+      <w:rPr>
+        <w:rFonts w:ascii="Times New Roman" w:eastAsia="Times New Roman" w:hAnsi="Times New Roman" w:cs="Times New Roman" w:hint="default"/>
+      </w:rPr>
+    </w:lvl>
+    <w:lvl w:ilvl="1" w:tplc="140A0003" w:tentative="1">
+      <w:start w:val="1"/>
+      <w:numFmt w:val="bullet"/>
+      <w:lvlText w:val="o"/>
+      <w:lvlJc w:val="left"/>
+      <w:pPr>
+        <w:ind w:left="1440" w:hanging="360"/>
+      </w:pPr>
+      <w:rPr>
+        <w:rFonts w:ascii="Courier New" w:hAnsi="Courier New" w:cs="Courier New" w:hint="default"/>
+      </w:rPr>
+    </w:lvl>
+    <w:lvl w:ilvl="2" w:tplc="140A0005" w:tentative="1">
+      <w:start w:val="1"/>
+      <w:numFmt w:val="bullet"/>
+      <w:lvlText w:val=""/>
+      <w:lvlJc w:val="left"/>
+      <w:pPr>
+        <w:ind w:left="2160" w:hanging="360"/>
+      </w:pPr>
+      <w:rPr>
+        <w:rFonts w:ascii="Wingdings" w:hAnsi="Wingdings" w:hint="default"/>
+      </w:rPr>
+    </w:lvl>
+    <w:lvl w:ilvl="3" w:tplc="140A0001" w:tentative="1">
+      <w:start w:val="1"/>
+      <w:numFmt w:val="bullet"/>
+      <w:lvlText w:val=""/>
+      <w:lvlJc w:val="left"/>
+      <w:pPr>
+        <w:ind w:left="2880" w:hanging="360"/>
+      </w:pPr>
+      <w:rPr>
+        <w:rFonts w:ascii="Symbol" w:hAnsi="Symbol" w:hint="default"/>
+      </w:rPr>
+    </w:lvl>
+    <w:lvl w:ilvl="4" w:tplc="140A0003" w:tentative="1">
+      <w:start w:val="1"/>
+      <w:numFmt w:val="bullet"/>
+      <w:lvlText w:val="o"/>
+      <w:lvlJc w:val="left"/>
+      <w:pPr>
+        <w:ind w:left="3600" w:hanging="360"/>
+      </w:pPr>
+      <w:rPr>
+        <w:rFonts w:ascii="Courier New" w:hAnsi="Courier New" w:cs="Courier New" w:hint="default"/>
+      </w:rPr>
+    </w:lvl>
+    <w:lvl w:ilvl="5" w:tplc="140A0005" w:tentative="1">
+      <w:start w:val="1"/>
+      <w:numFmt w:val="bullet"/>
+      <w:lvlText w:val=""/>
+      <w:lvlJc w:val="left"/>
+      <w:pPr>
+        <w:ind w:left="4320" w:hanging="360"/>
+      </w:pPr>
+      <w:rPr>
+        <w:rFonts w:ascii="Wingdings" w:hAnsi="Wingdings" w:hint="default"/>
+      </w:rPr>
+    </w:lvl>
+    <w:lvl w:ilvl="6" w:tplc="140A0001" w:tentative="1">
+      <w:start w:val="1"/>
+      <w:numFmt w:val="bullet"/>
+      <w:lvlText w:val=""/>
+      <w:lvlJc w:val="left"/>
+      <w:pPr>
+        <w:ind w:left="5040" w:hanging="360"/>
+      </w:pPr>
+      <w:rPr>
+        <w:rFonts w:ascii="Symbol" w:hAnsi="Symbol" w:hint="default"/>
+      </w:rPr>
+    </w:lvl>
+    <w:lvl w:ilvl="7" w:tplc="140A0003" w:tentative="1">
+      <w:start w:val="1"/>
+      <w:numFmt w:val="bullet"/>
+      <w:lvlText w:val="o"/>
+      <w:lvlJc w:val="left"/>
+      <w:pPr>
+        <w:ind w:left="5760" w:hanging="360"/>
+      </w:pPr>
+      <w:rPr>
+        <w:rFonts w:ascii="Courier New" w:hAnsi="Courier New" w:cs="Courier New" w:hint="default"/>
+      </w:rPr>
+    </w:lvl>
+    <w:lvl w:ilvl="8" w:tplc="140A0005" w:tentative="1">
+      <w:start w:val="1"/>
+      <w:numFmt w:val="bullet"/>
+      <w:lvlText w:val=""/>
+      <w:lvlJc w:val="left"/>
+      <w:pPr>
+        <w:ind w:left="6480" w:hanging="360"/>
+      </w:pPr>
+      <w:rPr>
+        <w:rFonts w:ascii="Wingdings" w:hAnsi="Wingdings" w:hint="default"/>
+      </w:rPr>
+    </w:lvl>
+  </w:abstractNum>
+  <w:abstractNum w:abstractNumId="13" w15:restartNumberingAfterBreak="0">
     <w:nsid w:val="4E9A24B0"/>
     <w:multiLevelType w:val="hybridMultilevel"/>
     <w:tmpl w:val="4CF83872"/>
@@ -5882,7 +9710,7 @@
       </w:rPr>
     </w:lvl>
   </w:abstractNum>
-  <w:abstractNum w:abstractNumId="13" w15:restartNumberingAfterBreak="0">
+  <w:abstractNum w:abstractNumId="14" w15:restartNumberingAfterBreak="0">
     <w:nsid w:val="5002304B"/>
     <w:multiLevelType w:val="hybridMultilevel"/>
     <w:tmpl w:val="D61C70FA"/>
@@ -5995,7 +9823,7 @@
       </w:rPr>
     </w:lvl>
   </w:abstractNum>
-  <w:abstractNum w:abstractNumId="14" w15:restartNumberingAfterBreak="0">
+  <w:abstractNum w:abstractNumId="15" w15:restartNumberingAfterBreak="0">
     <w:nsid w:val="57D71A20"/>
     <w:multiLevelType w:val="hybridMultilevel"/>
     <w:tmpl w:val="D266400E"/>
@@ -6107,7 +9935,7 @@
       </w:rPr>
     </w:lvl>
   </w:abstractNum>
-  <w:abstractNum w:abstractNumId="15" w15:restartNumberingAfterBreak="0">
+  <w:abstractNum w:abstractNumId="16" w15:restartNumberingAfterBreak="0">
     <w:nsid w:val="594C0D66"/>
     <w:multiLevelType w:val="multilevel"/>
     <w:tmpl w:val="8B408DCA"/>
@@ -6193,7 +10021,7 @@
       </w:pPr>
     </w:lvl>
   </w:abstractNum>
-  <w:abstractNum w:abstractNumId="16" w15:restartNumberingAfterBreak="0">
+  <w:abstractNum w:abstractNumId="17" w15:restartNumberingAfterBreak="0">
     <w:nsid w:val="5B6D36E2"/>
     <w:multiLevelType w:val="hybridMultilevel"/>
     <w:tmpl w:val="C7A0DD06"/>
@@ -6306,7 +10134,7 @@
       </w:rPr>
     </w:lvl>
   </w:abstractNum>
-  <w:abstractNum w:abstractNumId="17" w15:restartNumberingAfterBreak="0">
+  <w:abstractNum w:abstractNumId="18" w15:restartNumberingAfterBreak="0">
     <w:nsid w:val="5BFD3AF1"/>
     <w:multiLevelType w:val="hybridMultilevel"/>
     <w:tmpl w:val="CFD84144"/>
@@ -6419,7 +10247,7 @@
       </w:rPr>
     </w:lvl>
   </w:abstractNum>
-  <w:abstractNum w:abstractNumId="18" w15:restartNumberingAfterBreak="0">
+  <w:abstractNum w:abstractNumId="19" w15:restartNumberingAfterBreak="0">
     <w:nsid w:val="61DF69AF"/>
     <w:multiLevelType w:val="hybridMultilevel"/>
     <w:tmpl w:val="41D292B4"/>
@@ -6532,7 +10360,7 @@
       </w:rPr>
     </w:lvl>
   </w:abstractNum>
-  <w:abstractNum w:abstractNumId="19" w15:restartNumberingAfterBreak="0">
+  <w:abstractNum w:abstractNumId="20" w15:restartNumberingAfterBreak="0">
     <w:nsid w:val="666B6C55"/>
     <w:multiLevelType w:val="hybridMultilevel"/>
     <w:tmpl w:val="9A0AE9CE"/>
@@ -6645,7 +10473,7 @@
       </w:rPr>
     </w:lvl>
   </w:abstractNum>
-  <w:abstractNum w:abstractNumId="20" w15:restartNumberingAfterBreak="0">
+  <w:abstractNum w:abstractNumId="21" w15:restartNumberingAfterBreak="0">
     <w:nsid w:val="68D21255"/>
     <w:multiLevelType w:val="hybridMultilevel"/>
     <w:tmpl w:val="B714220E"/>
@@ -6757,7 +10585,7 @@
       </w:rPr>
     </w:lvl>
   </w:abstractNum>
-  <w:abstractNum w:abstractNumId="21" w15:restartNumberingAfterBreak="0">
+  <w:abstractNum w:abstractNumId="22" w15:restartNumberingAfterBreak="0">
     <w:nsid w:val="7169287A"/>
     <w:multiLevelType w:val="hybridMultilevel"/>
     <w:tmpl w:val="7AB4D9C2"/>
@@ -6869,7 +10697,7 @@
       </w:rPr>
     </w:lvl>
   </w:abstractNum>
-  <w:abstractNum w:abstractNumId="22" w15:restartNumberingAfterBreak="0">
+  <w:abstractNum w:abstractNumId="23" w15:restartNumberingAfterBreak="0">
     <w:nsid w:val="724A59A1"/>
     <w:multiLevelType w:val="hybridMultilevel"/>
     <w:tmpl w:val="93FA6CC8"/>
@@ -6955,7 +10783,7 @@
       </w:pPr>
     </w:lvl>
   </w:abstractNum>
-  <w:abstractNum w:abstractNumId="23" w15:restartNumberingAfterBreak="0">
+  <w:abstractNum w:abstractNumId="24" w15:restartNumberingAfterBreak="0">
     <w:nsid w:val="761E1F18"/>
     <w:multiLevelType w:val="hybridMultilevel"/>
     <w:tmpl w:val="647C7D24"/>
@@ -7068,7 +10896,7 @@
       </w:rPr>
     </w:lvl>
   </w:abstractNum>
-  <w:abstractNum w:abstractNumId="24" w15:restartNumberingAfterBreak="0">
+  <w:abstractNum w:abstractNumId="25" w15:restartNumberingAfterBreak="0">
     <w:nsid w:val="7A185063"/>
     <w:multiLevelType w:val="hybridMultilevel"/>
     <w:tmpl w:val="3D7872BE"/>
@@ -7154,7 +10982,7 @@
       </w:pPr>
     </w:lvl>
   </w:abstractNum>
-  <w:abstractNum w:abstractNumId="25" w15:restartNumberingAfterBreak="0">
+  <w:abstractNum w:abstractNumId="26" w15:restartNumberingAfterBreak="0">
     <w:nsid w:val="7BD31638"/>
     <w:multiLevelType w:val="hybridMultilevel"/>
     <w:tmpl w:val="75722932"/>
@@ -7271,7 +11099,7 @@
     <w:abstractNumId w:val="0"/>
   </w:num>
   <w:num w:numId="2" w16cid:durableId="2030713627">
-    <w:abstractNumId w:val="15"/>
+    <w:abstractNumId w:val="16"/>
   </w:num>
   <w:num w:numId="3" w16cid:durableId="1360933353">
     <w:abstractNumId w:val="6"/>
@@ -7280,19 +11108,19 @@
     <w:abstractNumId w:val="7"/>
   </w:num>
   <w:num w:numId="5" w16cid:durableId="1665010418">
-    <w:abstractNumId w:val="14"/>
+    <w:abstractNumId w:val="15"/>
   </w:num>
   <w:num w:numId="6" w16cid:durableId="1498181297">
     <w:abstractNumId w:val="9"/>
   </w:num>
   <w:num w:numId="7" w16cid:durableId="858667831">
-    <w:abstractNumId w:val="24"/>
+    <w:abstractNumId w:val="25"/>
   </w:num>
   <w:num w:numId="8" w16cid:durableId="1773087422">
-    <w:abstractNumId w:val="25"/>
+    <w:abstractNumId w:val="26"/>
   </w:num>
   <w:num w:numId="9" w16cid:durableId="1005209337">
-    <w:abstractNumId w:val="22"/>
+    <w:abstractNumId w:val="23"/>
   </w:num>
   <w:num w:numId="10" w16cid:durableId="463160268">
     <w:abstractNumId w:val="5"/>
@@ -7301,13 +11129,13 @@
     <w:abstractNumId w:val="11"/>
   </w:num>
   <w:num w:numId="12" w16cid:durableId="592670218">
-    <w:abstractNumId w:val="12"/>
+    <w:abstractNumId w:val="13"/>
   </w:num>
   <w:num w:numId="13" w16cid:durableId="507334937">
-    <w:abstractNumId w:val="19"/>
+    <w:abstractNumId w:val="20"/>
   </w:num>
   <w:num w:numId="14" w16cid:durableId="1653480491">
-    <w:abstractNumId w:val="16"/>
+    <w:abstractNumId w:val="17"/>
   </w:num>
   <w:num w:numId="15" w16cid:durableId="1190605911">
     <w:abstractNumId w:val="3"/>
@@ -7322,10 +11150,10 @@
     <w:abstractNumId w:val="4"/>
   </w:num>
   <w:num w:numId="19" w16cid:durableId="936786572">
-    <w:abstractNumId w:val="17"/>
+    <w:abstractNumId w:val="18"/>
   </w:num>
   <w:num w:numId="20" w16cid:durableId="86931409">
-    <w:abstractNumId w:val="18"/>
+    <w:abstractNumId w:val="19"/>
   </w:num>
   <w:num w:numId="21" w16cid:durableId="1163622229">
     <w:abstractNumId w:val="8"/>
@@ -7334,16 +11162,19 @@
     <w:abstractNumId w:val="2"/>
   </w:num>
   <w:num w:numId="23" w16cid:durableId="1819876548">
-    <w:abstractNumId w:val="13"/>
+    <w:abstractNumId w:val="14"/>
   </w:num>
   <w:num w:numId="24" w16cid:durableId="1754619539">
-    <w:abstractNumId w:val="23"/>
+    <w:abstractNumId w:val="24"/>
   </w:num>
   <w:num w:numId="25" w16cid:durableId="273294994">
-    <w:abstractNumId w:val="20"/>
+    <w:abstractNumId w:val="21"/>
   </w:num>
   <w:num w:numId="26" w16cid:durableId="1504280085">
-    <w:abstractNumId w:val="21"/>
+    <w:abstractNumId w:val="22"/>
+  </w:num>
+  <w:num w:numId="27" w16cid:durableId="514073527">
+    <w:abstractNumId w:val="12"/>
   </w:num>
 </w:numbering>
 </file>
@@ -7867,7 +11698,6 @@
   <w:style w:type="character" w:default="1" w:styleId="Fuentedeprrafopredeter">
     <w:name w:val="Default Paragraph Font"/>
     <w:uiPriority w:val="1"/>
-    <w:semiHidden/>
     <w:unhideWhenUsed/>
   </w:style>
   <w:style w:type="table" w:default="1" w:styleId="Tablanormal">
@@ -8496,6 +12326,10 @@
 </go:gDocsCustomXmlDataStorage>
 </file>
 
+<file path=customXml/item2.xml><?xml version="1.0" encoding="utf-8"?>
+<b:Sources xmlns:b="http://schemas.openxmlformats.org/officeDocument/2006/bibliography" xmlns="http://schemas.openxmlformats.org/officeDocument/2006/bibliography" SelectedStyle="\APASixthEditionOfficeOnline.xsl" StyleName="APA" Version="6"/>
+</file>
+
 <file path=customXml/itemProps1.xml><?xml version="1.0" encoding="utf-8"?>
 <ds:datastoreItem xmlns:ds="http://schemas.openxmlformats.org/officeDocument/2006/customXml" ds:itemID="{11111111-1234-1234-1234-123412341234}">
   <ds:schemaRefs>
@@ -8503,4 +12337,12 @@
     <ds:schemaRef ds:uri="http://schemas.openxmlformats.org/officeDocument/2006/relationships"/>
   </ds:schemaRefs>
 </ds:datastoreItem>
+</file>
+
+<file path=customXml/itemProps2.xml><?xml version="1.0" encoding="utf-8"?>
+<ds:datastoreItem xmlns:ds="http://schemas.openxmlformats.org/officeDocument/2006/customXml" ds:itemID="{DE77429B-D1A7-44F3-AAE5-D6A09AC8C2AC}">
+  <ds:schemaRefs>
+    <ds:schemaRef ds:uri="http://schemas.openxmlformats.org/officeDocument/2006/bibliography"/>
+  </ds:schemaRefs>
+</ds:datastoreItem>
 </file>
</xml_diff>